<commit_message>
Update proejct folder in README.md and refactor code
</commit_message>
<xml_diff>
--- a/docs/1. Code and Configuration.docx
+++ b/docs/1. Code and Configuration.docx
@@ -198,7 +198,7 @@
           <w:r>
             <w:fldChar w:fldCharType="separate"/>
           </w:r>
-          <w:hyperlink w:anchor="_Toc227880623" w:history="1">
+          <w:hyperlink w:anchor="_Toc227907252" w:history="1">
             <w:r>
               <w:rPr>
                 <w:rStyle w:val="Hyperlink"/>
@@ -238,7 +238,7 @@
                 <w:noProof/>
                 <w:webHidden/>
               </w:rPr>
-              <w:instrText xml:space="preserve"> PAGEREF _Toc227880623 \h </w:instrText>
+              <w:instrText xml:space="preserve"> PAGEREF _Toc227907252 \h </w:instrText>
             </w:r>
             <w:r>
               <w:rPr>
@@ -280,7 +280,7 @@
               <w:noProof/>
             </w:rPr>
           </w:pPr>
-          <w:hyperlink w:anchor="_Toc227880624" w:history="1">
+          <w:hyperlink w:anchor="_Toc227907253" w:history="1">
             <w:r>
               <w:rPr>
                 <w:rStyle w:val="Hyperlink"/>
@@ -320,7 +320,7 @@
                 <w:noProof/>
                 <w:webHidden/>
               </w:rPr>
-              <w:instrText xml:space="preserve"> PAGEREF _Toc227880624 \h </w:instrText>
+              <w:instrText xml:space="preserve"> PAGEREF _Toc227907253 \h </w:instrText>
             </w:r>
             <w:r>
               <w:rPr>
@@ -362,7 +362,7 @@
               <w:noProof/>
             </w:rPr>
           </w:pPr>
-          <w:hyperlink w:anchor="_Toc227880625" w:history="1">
+          <w:hyperlink w:anchor="_Toc227907254" w:history="1">
             <w:r>
               <w:rPr>
                 <w:rStyle w:val="Hyperlink"/>
@@ -402,7 +402,7 @@
                 <w:noProof/>
                 <w:webHidden/>
               </w:rPr>
-              <w:instrText xml:space="preserve"> PAGEREF _Toc227880625 \h </w:instrText>
+              <w:instrText xml:space="preserve"> PAGEREF _Toc227907254 \h </w:instrText>
             </w:r>
             <w:r>
               <w:rPr>
@@ -443,7 +443,7 @@
               <w:noProof/>
             </w:rPr>
           </w:pPr>
-          <w:hyperlink w:anchor="_Toc227880626" w:history="1">
+          <w:hyperlink w:anchor="_Toc227907255" w:history="1">
             <w:r>
               <w:rPr>
                 <w:rStyle w:val="Hyperlink"/>
@@ -470,7 +470,7 @@
                 <w:noProof/>
                 <w:webHidden/>
               </w:rPr>
-              <w:instrText xml:space="preserve"> PAGEREF _Toc227880626 \h </w:instrText>
+              <w:instrText xml:space="preserve"> PAGEREF _Toc227907255 \h </w:instrText>
             </w:r>
             <w:r>
               <w:rPr>
@@ -512,7 +512,7 @@
               <w:noProof/>
             </w:rPr>
           </w:pPr>
-          <w:hyperlink w:anchor="_Toc227880627" w:history="1">
+          <w:hyperlink w:anchor="_Toc227907256" w:history="1">
             <w:r>
               <w:rPr>
                 <w:rStyle w:val="Hyperlink"/>
@@ -552,7 +552,7 @@
                 <w:noProof/>
                 <w:webHidden/>
               </w:rPr>
-              <w:instrText xml:space="preserve"> PAGEREF _Toc227880627 \h </w:instrText>
+              <w:instrText xml:space="preserve"> PAGEREF _Toc227907256 \h </w:instrText>
             </w:r>
             <w:r>
               <w:rPr>
@@ -594,7 +594,7 @@
               <w:noProof/>
             </w:rPr>
           </w:pPr>
-          <w:hyperlink w:anchor="_Toc227880628" w:history="1">
+          <w:hyperlink w:anchor="_Toc227907257" w:history="1">
             <w:r>
               <w:rPr>
                 <w:rStyle w:val="Hyperlink"/>
@@ -634,7 +634,7 @@
                 <w:noProof/>
                 <w:webHidden/>
               </w:rPr>
-              <w:instrText xml:space="preserve"> PAGEREF _Toc227880628 \h </w:instrText>
+              <w:instrText xml:space="preserve"> PAGEREF _Toc227907257 \h </w:instrText>
             </w:r>
             <w:r>
               <w:rPr>
@@ -675,7 +675,7 @@
               <w:noProof/>
             </w:rPr>
           </w:pPr>
-          <w:hyperlink w:anchor="_Toc227880629" w:history="1">
+          <w:hyperlink w:anchor="_Toc227907258" w:history="1">
             <w:r>
               <w:rPr>
                 <w:rStyle w:val="Hyperlink"/>
@@ -702,7 +702,7 @@
                 <w:noProof/>
                 <w:webHidden/>
               </w:rPr>
-              <w:instrText xml:space="preserve"> PAGEREF _Toc227880629 \h </w:instrText>
+              <w:instrText xml:space="preserve"> PAGEREF _Toc227907258 \h </w:instrText>
             </w:r>
             <w:r>
               <w:rPr>
@@ -722,7 +722,7 @@
                 <w:noProof/>
                 <w:webHidden/>
               </w:rPr>
-              <w:t>5</w:t>
+              <w:t>6</w:t>
             </w:r>
             <w:r>
               <w:rPr>
@@ -744,7 +744,7 @@
               <w:noProof/>
             </w:rPr>
           </w:pPr>
-          <w:hyperlink w:anchor="_Toc227880630" w:history="1">
+          <w:hyperlink w:anchor="_Toc227907259" w:history="1">
             <w:r>
               <w:rPr>
                 <w:rStyle w:val="Hyperlink"/>
@@ -784,7 +784,7 @@
                 <w:noProof/>
                 <w:webHidden/>
               </w:rPr>
-              <w:instrText xml:space="preserve"> PAGEREF _Toc227880630 \h </w:instrText>
+              <w:instrText xml:space="preserve"> PAGEREF _Toc227907259 \h </w:instrText>
             </w:r>
             <w:r>
               <w:rPr>
@@ -825,7 +825,7 @@
               <w:noProof/>
             </w:rPr>
           </w:pPr>
-          <w:hyperlink w:anchor="_Toc227880631" w:history="1">
+          <w:hyperlink w:anchor="_Toc227907260" w:history="1">
             <w:r>
               <w:rPr>
                 <w:rStyle w:val="Hyperlink"/>
@@ -852,7 +852,7 @@
                 <w:noProof/>
                 <w:webHidden/>
               </w:rPr>
-              <w:instrText xml:space="preserve"> PAGEREF _Toc227880631 \h </w:instrText>
+              <w:instrText xml:space="preserve"> PAGEREF _Toc227907260 \h </w:instrText>
             </w:r>
             <w:r>
               <w:rPr>
@@ -893,7 +893,7 @@
               <w:noProof/>
             </w:rPr>
           </w:pPr>
-          <w:hyperlink w:anchor="_Toc227880632" w:history="1">
+          <w:hyperlink w:anchor="_Toc227907261" w:history="1">
             <w:r>
               <w:rPr>
                 <w:rStyle w:val="Hyperlink"/>
@@ -920,7 +920,7 @@
                 <w:noProof/>
                 <w:webHidden/>
               </w:rPr>
-              <w:instrText xml:space="preserve"> PAGEREF _Toc227880632 \h </w:instrText>
+              <w:instrText xml:space="preserve"> PAGEREF _Toc227907261 \h </w:instrText>
             </w:r>
             <w:r>
               <w:rPr>
@@ -940,7 +940,7 @@
                 <w:noProof/>
                 <w:webHidden/>
               </w:rPr>
-              <w:t>9</w:t>
+              <w:t>8</w:t>
             </w:r>
             <w:r>
               <w:rPr>
@@ -961,7 +961,7 @@
               <w:noProof/>
             </w:rPr>
           </w:pPr>
-          <w:hyperlink w:anchor="_Toc227880633" w:history="1">
+          <w:hyperlink w:anchor="_Toc227907262" w:history="1">
             <w:r>
               <w:rPr>
                 <w:rStyle w:val="Hyperlink"/>
@@ -988,7 +988,7 @@
                 <w:noProof/>
                 <w:webHidden/>
               </w:rPr>
-              <w:instrText xml:space="preserve"> PAGEREF _Toc227880633 \h </w:instrText>
+              <w:instrText xml:space="preserve"> PAGEREF _Toc227907262 \h </w:instrText>
             </w:r>
             <w:r>
               <w:rPr>
@@ -1008,7 +1008,7 @@
                 <w:noProof/>
                 <w:webHidden/>
               </w:rPr>
-              <w:t>10</w:t>
+              <w:t>9</w:t>
             </w:r>
             <w:r>
               <w:rPr>
@@ -1029,7 +1029,7 @@
               <w:noProof/>
             </w:rPr>
           </w:pPr>
-          <w:hyperlink w:anchor="_Toc227880634" w:history="1">
+          <w:hyperlink w:anchor="_Toc227907263" w:history="1">
             <w:r>
               <w:rPr>
                 <w:rStyle w:val="Hyperlink"/>
@@ -1056,7 +1056,7 @@
                 <w:noProof/>
                 <w:webHidden/>
               </w:rPr>
-              <w:instrText xml:space="preserve"> PAGEREF _Toc227880634 \h </w:instrText>
+              <w:instrText xml:space="preserve"> PAGEREF _Toc227907263 \h </w:instrText>
             </w:r>
             <w:r>
               <w:rPr>
@@ -1076,7 +1076,7 @@
                 <w:noProof/>
                 <w:webHidden/>
               </w:rPr>
-              <w:t>11</w:t>
+              <w:t>10</w:t>
             </w:r>
             <w:r>
               <w:rPr>
@@ -1098,7 +1098,7 @@
               <w:noProof/>
             </w:rPr>
           </w:pPr>
-          <w:hyperlink w:anchor="_Toc227880635" w:history="1">
+          <w:hyperlink w:anchor="_Toc227907264" w:history="1">
             <w:r>
               <w:rPr>
                 <w:rStyle w:val="Hyperlink"/>
@@ -1138,7 +1138,7 @@
                 <w:noProof/>
                 <w:webHidden/>
               </w:rPr>
-              <w:instrText xml:space="preserve"> PAGEREF _Toc227880635 \h </w:instrText>
+              <w:instrText xml:space="preserve"> PAGEREF _Toc227907264 \h </w:instrText>
             </w:r>
             <w:r>
               <w:rPr>
@@ -1180,7 +1180,7 @@
               <w:noProof/>
             </w:rPr>
           </w:pPr>
-          <w:hyperlink w:anchor="_Toc227880636" w:history="1">
+          <w:hyperlink w:anchor="_Toc227907265" w:history="1">
             <w:r>
               <w:rPr>
                 <w:rStyle w:val="Hyperlink"/>
@@ -1220,7 +1220,7 @@
                 <w:noProof/>
                 <w:webHidden/>
               </w:rPr>
-              <w:instrText xml:space="preserve"> PAGEREF _Toc227880636 \h </w:instrText>
+              <w:instrText xml:space="preserve"> PAGEREF _Toc227907265 \h </w:instrText>
             </w:r>
             <w:r>
               <w:rPr>
@@ -1240,7 +1240,7 @@
                 <w:noProof/>
                 <w:webHidden/>
               </w:rPr>
-              <w:t>12</w:t>
+              <w:t>11</w:t>
             </w:r>
             <w:r>
               <w:rPr>
@@ -1261,7 +1261,7 @@
               <w:noProof/>
             </w:rPr>
           </w:pPr>
-          <w:hyperlink w:anchor="_Toc227880637" w:history="1">
+          <w:hyperlink w:anchor="_Toc227907266" w:history="1">
             <w:r>
               <w:rPr>
                 <w:rStyle w:val="Hyperlink"/>
@@ -1288,7 +1288,7 @@
                 <w:noProof/>
                 <w:webHidden/>
               </w:rPr>
-              <w:instrText xml:space="preserve"> PAGEREF _Toc227880637 \h </w:instrText>
+              <w:instrText xml:space="preserve"> PAGEREF _Toc227907266 \h </w:instrText>
             </w:r>
             <w:r>
               <w:rPr>
@@ -1308,7 +1308,7 @@
                 <w:noProof/>
                 <w:webHidden/>
               </w:rPr>
-              <w:t>12</w:t>
+              <w:t>11</w:t>
             </w:r>
             <w:r>
               <w:rPr>
@@ -1329,7 +1329,7 @@
               <w:noProof/>
             </w:rPr>
           </w:pPr>
-          <w:hyperlink w:anchor="_Toc227880638" w:history="1">
+          <w:hyperlink w:anchor="_Toc227907267" w:history="1">
             <w:r>
               <w:rPr>
                 <w:rStyle w:val="Hyperlink"/>
@@ -1356,7 +1356,7 @@
                 <w:noProof/>
                 <w:webHidden/>
               </w:rPr>
-              <w:instrText xml:space="preserve"> PAGEREF _Toc227880638 \h </w:instrText>
+              <w:instrText xml:space="preserve"> PAGEREF _Toc227907267 \h </w:instrText>
             </w:r>
             <w:r>
               <w:rPr>
@@ -1376,7 +1376,7 @@
                 <w:noProof/>
                 <w:webHidden/>
               </w:rPr>
-              <w:t>13</w:t>
+              <w:t>12</w:t>
             </w:r>
             <w:r>
               <w:rPr>
@@ -1398,7 +1398,7 @@
               <w:noProof/>
             </w:rPr>
           </w:pPr>
-          <w:hyperlink w:anchor="_Toc227880639" w:history="1">
+          <w:hyperlink w:anchor="_Toc227907268" w:history="1">
             <w:r>
               <w:rPr>
                 <w:rStyle w:val="Hyperlink"/>
@@ -1438,7 +1438,7 @@
                 <w:noProof/>
                 <w:webHidden/>
               </w:rPr>
-              <w:instrText xml:space="preserve"> PAGEREF _Toc227880639 \h </w:instrText>
+              <w:instrText xml:space="preserve"> PAGEREF _Toc227907268 \h </w:instrText>
             </w:r>
             <w:r>
               <w:rPr>
@@ -1458,7 +1458,7 @@
                 <w:noProof/>
                 <w:webHidden/>
               </w:rPr>
-              <w:t>15</w:t>
+              <w:t>13</w:t>
             </w:r>
             <w:r>
               <w:rPr>
@@ -1480,7 +1480,7 @@
               <w:noProof/>
             </w:rPr>
           </w:pPr>
-          <w:hyperlink w:anchor="_Toc227880640" w:history="1">
+          <w:hyperlink w:anchor="_Toc227907269" w:history="1">
             <w:r>
               <w:rPr>
                 <w:rStyle w:val="Hyperlink"/>
@@ -1520,7 +1520,7 @@
                 <w:noProof/>
                 <w:webHidden/>
               </w:rPr>
-              <w:instrText xml:space="preserve"> PAGEREF _Toc227880640 \h </w:instrText>
+              <w:instrText xml:space="preserve"> PAGEREF _Toc227907269 \h </w:instrText>
             </w:r>
             <w:r>
               <w:rPr>
@@ -1540,7 +1540,7 @@
                 <w:noProof/>
                 <w:webHidden/>
               </w:rPr>
-              <w:t>16</w:t>
+              <w:t>15</w:t>
             </w:r>
             <w:r>
               <w:rPr>
@@ -1598,7 +1598,7 @@
           <w:numId w:val="20"/>
         </w:numPr>
       </w:pPr>
-      <w:bookmarkStart w:id="0" w:name="_Toc227880623"/>
+      <w:bookmarkStart w:id="0" w:name="_Toc227907252"/>
       <w:r>
         <w:lastRenderedPageBreak/>
         <w:t>REQUREMENTS</w:t>
@@ -1616,7 +1616,7 @@
           <w:numId w:val="14"/>
         </w:numPr>
       </w:pPr>
-      <w:bookmarkStart w:id="1" w:name="_Toc227880624"/>
+      <w:bookmarkStart w:id="1" w:name="_Toc227907253"/>
       <w:r>
         <w:t>Objectives</w:t>
       </w:r>
@@ -1832,7 +1832,7 @@
           <w:numId w:val="14"/>
         </w:numPr>
       </w:pPr>
-      <w:bookmarkStart w:id="2" w:name="_Toc227880625"/>
+      <w:bookmarkStart w:id="2" w:name="_Toc227907254"/>
       <w:r>
         <w:t>Constraints</w:t>
       </w:r>
@@ -1963,8 +1963,16 @@
         <w:rPr>
           <w:rFonts w:ascii="Times New Roman" w:hAnsi="Times New Roman" w:cs="Times New Roman"/>
         </w:rPr>
-        <w:t xml:space="preserve"> explicit .join</w:t>
-      </w:r>
+        <w:t xml:space="preserve"> </w:t>
+      </w:r>
+      <w:proofErr w:type="gramStart"/>
+      <w:r>
+        <w:rPr>
+          <w:rFonts w:ascii="Times New Roman" w:hAnsi="Times New Roman" w:cs="Times New Roman"/>
+        </w:rPr>
+        <w:t>explicit .join</w:t>
+      </w:r>
+      <w:proofErr w:type="gramEnd"/>
       <w:r>
         <w:rPr>
           <w:rFonts w:ascii="Times New Roman" w:hAnsi="Times New Roman" w:cs="Times New Roman"/>
@@ -2089,7 +2097,7 @@
       <w:pPr>
         <w:pStyle w:val="Heading1"/>
       </w:pPr>
-      <w:bookmarkStart w:id="3" w:name="_Toc227880626"/>
+      <w:bookmarkStart w:id="3" w:name="_Toc227907255"/>
       <w:r>
         <w:lastRenderedPageBreak/>
         <w:t xml:space="preserve">2. </w:t>
@@ -2107,7 +2115,7 @@
           <w:numId w:val="15"/>
         </w:numPr>
       </w:pPr>
-      <w:bookmarkStart w:id="4" w:name="_Toc227880627"/>
+      <w:bookmarkStart w:id="4" w:name="_Toc227907256"/>
       <w:r>
         <w:t>Project Structure Design</w:t>
       </w:r>
@@ -2364,7 +2372,7 @@
           <w:szCs w:val="21"/>
           <w14:ligatures w14:val="none"/>
         </w:rPr>
-        <w:t>  ├─ main.py                      Entry point: CLI parsing, .env loading,</w:t>
+        <w:t>  ├─ main.py                      Entry point: CLI parsing,</w:t>
       </w:r>
     </w:p>
     <w:p>
@@ -2649,7 +2657,7 @@
           <w:szCs w:val="21"/>
           <w14:ligatures w14:val="none"/>
         </w:rPr>
-        <w:t>  │   ├─ task1_etl_job.py         Main ETL job: orchestrates full pipeline</w:t>
+        <w:t>  │   ├─ task1_etl_job.py         ETL job (baseline pipeline)</w:t>
       </w:r>
     </w:p>
     <w:p>
@@ -2674,7 +2682,7 @@
           <w:szCs w:val="21"/>
           <w14:ligatures w14:val="none"/>
         </w:rPr>
-        <w:t>  │   ├─ schema/</w:t>
+        <w:t>  │   ├─ task2_etl_job.py         ETL job with data-skew detection +</w:t>
       </w:r>
     </w:p>
     <w:p>
@@ -2699,10 +2707,13 @@
           <w:szCs w:val="21"/>
           <w14:ligatures w14:val="none"/>
         </w:rPr>
-        <w:t xml:space="preserve">  │   │   └─ mapping.py           </w:t>
-      </w:r>
-      <w:proofErr w:type="spellStart"/>
-      <w:r>
+        <w:t>  │   │                            salted aggregation when skew detected</w:t>
+      </w:r>
+    </w:p>
+    <w:p>
+      <w:pPr>
+        <w:shd w:val="clear" w:color="auto" w:fill="0D1117"/>
+        <w:spacing w:after="0" w:line="285" w:lineRule="atLeast"/>
         <w:rPr>
           <w:rFonts w:ascii="Consolas" w:eastAsia="Times New Roman" w:hAnsi="Consolas" w:cs="Times New Roman"/>
           <w:color w:val="E6EDF3"/>
@@ -2711,9 +2722,7 @@
           <w:szCs w:val="21"/>
           <w14:ligatures w14:val="none"/>
         </w:rPr>
-        <w:t>StructType</w:t>
-      </w:r>
-      <w:proofErr w:type="spellEnd"/>
+      </w:pPr>
       <w:r>
         <w:rPr>
           <w:rFonts w:ascii="Consolas" w:eastAsia="Times New Roman" w:hAnsi="Consolas" w:cs="Times New Roman"/>
@@ -2723,7 +2732,7 @@
           <w:szCs w:val="21"/>
           <w14:ligatures w14:val="none"/>
         </w:rPr>
-        <w:t xml:space="preserve"> schemas for input/output datasets</w:t>
+        <w:t>  │   ├─ quality/</w:t>
       </w:r>
     </w:p>
     <w:p>
@@ -2748,7 +2757,7 @@
           <w:szCs w:val="21"/>
           <w14:ligatures w14:val="none"/>
         </w:rPr>
-        <w:t>  │   └─ transforms/</w:t>
+        <w:t>  │   │   └─ skew_validator.py    Partition-skew detection helper for task2</w:t>
       </w:r>
     </w:p>
     <w:p>
@@ -2773,10 +2782,13 @@
           <w:szCs w:val="21"/>
           <w14:ligatures w14:val="none"/>
         </w:rPr>
-        <w:t xml:space="preserve">  │       ├─ base.py              Abstract </w:t>
-      </w:r>
-      <w:proofErr w:type="spellStart"/>
-      <w:r>
+        <w:t>  │   ├─ schema/</w:t>
+      </w:r>
+    </w:p>
+    <w:p>
+      <w:pPr>
+        <w:shd w:val="clear" w:color="auto" w:fill="0D1117"/>
+        <w:spacing w:after="0" w:line="285" w:lineRule="atLeast"/>
         <w:rPr>
           <w:rFonts w:ascii="Consolas" w:eastAsia="Times New Roman" w:hAnsi="Consolas" w:cs="Times New Roman"/>
           <w:color w:val="E6EDF3"/>
@@ -2785,9 +2797,7 @@
           <w:szCs w:val="21"/>
           <w14:ligatures w14:val="none"/>
         </w:rPr>
-        <w:t>RDDTransformation</w:t>
-      </w:r>
-      <w:proofErr w:type="spellEnd"/>
+      </w:pPr>
       <w:r>
         <w:rPr>
           <w:rFonts w:ascii="Consolas" w:eastAsia="Times New Roman" w:hAnsi="Consolas" w:cs="Times New Roman"/>
@@ -2797,7 +2807,31 @@
           <w:szCs w:val="21"/>
           <w14:ligatures w14:val="none"/>
         </w:rPr>
-        <w:t xml:space="preserve"> base class</w:t>
+        <w:t xml:space="preserve">  │   │   └─ mapping.py           </w:t>
+      </w:r>
+      <w:proofErr w:type="spellStart"/>
+      <w:r>
+        <w:rPr>
+          <w:rFonts w:ascii="Consolas" w:eastAsia="Times New Roman" w:hAnsi="Consolas" w:cs="Times New Roman"/>
+          <w:color w:val="E6EDF3"/>
+          <w:kern w:val="0"/>
+          <w:sz w:val="21"/>
+          <w:szCs w:val="21"/>
+          <w14:ligatures w14:val="none"/>
+        </w:rPr>
+        <w:t>StructType</w:t>
+      </w:r>
+      <w:proofErr w:type="spellEnd"/>
+      <w:r>
+        <w:rPr>
+          <w:rFonts w:ascii="Consolas" w:eastAsia="Times New Roman" w:hAnsi="Consolas" w:cs="Times New Roman"/>
+          <w:color w:val="E6EDF3"/>
+          <w:kern w:val="0"/>
+          <w:sz w:val="21"/>
+          <w:szCs w:val="21"/>
+          <w14:ligatures w14:val="none"/>
+        </w:rPr>
+        <w:t xml:space="preserve"> schemas for input/output datasets</w:t>
       </w:r>
     </w:p>
     <w:p>
@@ -2822,9 +2856,13 @@
           <w:szCs w:val="21"/>
           <w14:ligatures w14:val="none"/>
         </w:rPr>
-        <w:t>  │       ├─ deduplicator.py      </w:t>
-      </w:r>
-      <w:r>
+        <w:t>  │   └─ transforms/</w:t>
+      </w:r>
+    </w:p>
+    <w:p>
+      <w:pPr>
+        <w:shd w:val="clear" w:color="auto" w:fill="0D1117"/>
+        <w:spacing w:after="0" w:line="285" w:lineRule="atLeast"/>
         <w:rPr>
           <w:rFonts w:ascii="Consolas" w:eastAsia="Times New Roman" w:hAnsi="Consolas" w:cs="Times New Roman"/>
           <w:color w:val="E6EDF3"/>
@@ -2833,8 +2871,7 @@
           <w:szCs w:val="21"/>
           <w14:ligatures w14:val="none"/>
         </w:rPr>
-        <w:t xml:space="preserve">Remove </w:t>
-      </w:r>
+      </w:pPr>
       <w:r>
         <w:rPr>
           <w:rFonts w:ascii="Consolas" w:eastAsia="Times New Roman" w:hAnsi="Consolas" w:cs="Times New Roman"/>
@@ -2844,7 +2881,7 @@
           <w:szCs w:val="21"/>
           <w14:ligatures w14:val="none"/>
         </w:rPr>
-        <w:t xml:space="preserve">duplicate by </w:t>
+        <w:t xml:space="preserve">  │       ├─ base.py              Abstract </w:t>
       </w:r>
       <w:proofErr w:type="spellStart"/>
       <w:r>
@@ -2856,9 +2893,20 @@
           <w:szCs w:val="21"/>
           <w14:ligatures w14:val="none"/>
         </w:rPr>
-        <w:t>detection_oid</w:t>
+        <w:t>RDDTransformation</w:t>
       </w:r>
       <w:proofErr w:type="spellEnd"/>
+      <w:r>
+        <w:rPr>
+          <w:rFonts w:ascii="Consolas" w:eastAsia="Times New Roman" w:hAnsi="Consolas" w:cs="Times New Roman"/>
+          <w:color w:val="E6EDF3"/>
+          <w:kern w:val="0"/>
+          <w:sz w:val="21"/>
+          <w:szCs w:val="21"/>
+          <w14:ligatures w14:val="none"/>
+        </w:rPr>
+        <w:t xml:space="preserve"> base class</w:t>
+      </w:r>
     </w:p>
     <w:p>
       <w:pPr>
@@ -2882,8 +2930,21 @@
           <w:szCs w:val="21"/>
           <w14:ligatures w14:val="none"/>
         </w:rPr>
-        <w:t>  │       ├─ aggregator.py        Count items per (location, item) pair</w:t>
-      </w:r>
+        <w:t xml:space="preserve">  │       ├─ deduplicator.py      Deduplicate by </w:t>
+      </w:r>
+      <w:proofErr w:type="spellStart"/>
+      <w:r>
+        <w:rPr>
+          <w:rFonts w:ascii="Consolas" w:eastAsia="Times New Roman" w:hAnsi="Consolas" w:cs="Times New Roman"/>
+          <w:color w:val="E6EDF3"/>
+          <w:kern w:val="0"/>
+          <w:sz w:val="21"/>
+          <w:szCs w:val="21"/>
+          <w14:ligatures w14:val="none"/>
+        </w:rPr>
+        <w:t>detection_oid</w:t>
+      </w:r>
+      <w:proofErr w:type="spellEnd"/>
     </w:p>
     <w:p>
       <w:pPr>
@@ -2907,7 +2968,7 @@
           <w:szCs w:val="21"/>
           <w14:ligatures w14:val="none"/>
         </w:rPr>
-        <w:t>  │       ├─ ranking.py           Rank + top-X filter per location</w:t>
+        <w:t>  │       ├─ aggregator.py        Count items per (location, item) pair</w:t>
       </w:r>
     </w:p>
     <w:p>
@@ -2932,7 +2993,7 @@
           <w:szCs w:val="21"/>
           <w14:ligatures w14:val="none"/>
         </w:rPr>
-        <w:t>  │       ├─ enricher.py          Broadcast map-side join with location names</w:t>
+        <w:t>  │       ├─ salted_aggregator.py Two-phase salted aggregation for skew</w:t>
       </w:r>
     </w:p>
     <w:p>
@@ -2957,10 +3018,13 @@
           <w:szCs w:val="21"/>
           <w14:ligatures w14:val="none"/>
         </w:rPr>
-        <w:t>  │       └─ pipeline.py          </w:t>
-      </w:r>
-      <w:proofErr w:type="spellStart"/>
-      <w:r>
+        <w:t>  │       ├─ ranking.py           Rank + top-X filter per location</w:t>
+      </w:r>
+    </w:p>
+    <w:p>
+      <w:pPr>
+        <w:shd w:val="clear" w:color="auto" w:fill="0D1117"/>
+        <w:spacing w:after="0" w:line="285" w:lineRule="atLeast"/>
         <w:rPr>
           <w:rFonts w:ascii="Consolas" w:eastAsia="Times New Roman" w:hAnsi="Consolas" w:cs="Times New Roman"/>
           <w:color w:val="E6EDF3"/>
@@ -2969,9 +3033,7 @@
           <w:szCs w:val="21"/>
           <w14:ligatures w14:val="none"/>
         </w:rPr>
-        <w:t>TransformationPipeline</w:t>
-      </w:r>
-      <w:proofErr w:type="spellEnd"/>
+      </w:pPr>
       <w:r>
         <w:rPr>
           <w:rFonts w:ascii="Consolas" w:eastAsia="Times New Roman" w:hAnsi="Consolas" w:cs="Times New Roman"/>
@@ -2981,7 +3043,7 @@
           <w:szCs w:val="21"/>
           <w14:ligatures w14:val="none"/>
         </w:rPr>
-        <w:t xml:space="preserve"> orchestrator</w:t>
+        <w:t>  │       ├─ enricher.py          Broadcast map-side join with location names</w:t>
       </w:r>
     </w:p>
     <w:p>
@@ -3006,7 +3068,31 @@
           <w:szCs w:val="21"/>
           <w14:ligatures w14:val="none"/>
         </w:rPr>
-        <w:t>  └─ util/</w:t>
+        <w:t>  │       └─ pipeline.py          </w:t>
+      </w:r>
+      <w:proofErr w:type="spellStart"/>
+      <w:r>
+        <w:rPr>
+          <w:rFonts w:ascii="Consolas" w:eastAsia="Times New Roman" w:hAnsi="Consolas" w:cs="Times New Roman"/>
+          <w:color w:val="E6EDF3"/>
+          <w:kern w:val="0"/>
+          <w:sz w:val="21"/>
+          <w:szCs w:val="21"/>
+          <w14:ligatures w14:val="none"/>
+        </w:rPr>
+        <w:t>TransformationPipeline</w:t>
+      </w:r>
+      <w:proofErr w:type="spellEnd"/>
+      <w:r>
+        <w:rPr>
+          <w:rFonts w:ascii="Consolas" w:eastAsia="Times New Roman" w:hAnsi="Consolas" w:cs="Times New Roman"/>
+          <w:color w:val="E6EDF3"/>
+          <w:kern w:val="0"/>
+          <w:sz w:val="21"/>
+          <w:szCs w:val="21"/>
+          <w14:ligatures w14:val="none"/>
+        </w:rPr>
+        <w:t xml:space="preserve"> orchestrator</w:t>
       </w:r>
     </w:p>
     <w:p>
@@ -3031,10 +3117,14 @@
           <w:szCs w:val="21"/>
           <w14:ligatures w14:val="none"/>
         </w:rPr>
-        <w:t>      ├─ environment.py           .env loading via python-</w:t>
-      </w:r>
-      <w:proofErr w:type="spellStart"/>
-      <w:r>
+        <w:lastRenderedPageBreak/>
+        <w:t>  └─ util/</w:t>
+      </w:r>
+    </w:p>
+    <w:p>
+      <w:pPr>
+        <w:shd w:val="clear" w:color="auto" w:fill="0D1117"/>
+        <w:spacing w:after="0" w:line="285" w:lineRule="atLeast"/>
         <w:rPr>
           <w:rFonts w:ascii="Consolas" w:eastAsia="Times New Roman" w:hAnsi="Consolas" w:cs="Times New Roman"/>
           <w:color w:val="E6EDF3"/>
@@ -3043,6 +3133,52 @@
           <w:szCs w:val="21"/>
           <w14:ligatures w14:val="none"/>
         </w:rPr>
+      </w:pPr>
+      <w:r>
+        <w:rPr>
+          <w:rFonts w:ascii="Consolas" w:eastAsia="Times New Roman" w:hAnsi="Consolas" w:cs="Times New Roman"/>
+          <w:color w:val="E6EDF3"/>
+          <w:kern w:val="0"/>
+          <w:sz w:val="21"/>
+          <w:szCs w:val="21"/>
+          <w14:ligatures w14:val="none"/>
+        </w:rPr>
+        <w:t xml:space="preserve">      ├─ environment.py         </w:t>
+      </w:r>
+      <w:proofErr w:type="gramStart"/>
+      <w:r>
+        <w:rPr>
+          <w:rFonts w:ascii="Consolas" w:eastAsia="Times New Roman" w:hAnsi="Consolas" w:cs="Times New Roman"/>
+          <w:color w:val="E6EDF3"/>
+          <w:kern w:val="0"/>
+          <w:sz w:val="21"/>
+          <w:szCs w:val="21"/>
+          <w14:ligatures w14:val="none"/>
+        </w:rPr>
+        <w:t>  .env</w:t>
+      </w:r>
+      <w:proofErr w:type="gramEnd"/>
+      <w:r>
+        <w:rPr>
+          <w:rFonts w:ascii="Consolas" w:eastAsia="Times New Roman" w:hAnsi="Consolas" w:cs="Times New Roman"/>
+          <w:color w:val="E6EDF3"/>
+          <w:kern w:val="0"/>
+          <w:sz w:val="21"/>
+          <w:szCs w:val="21"/>
+          <w14:ligatures w14:val="none"/>
+        </w:rPr>
+        <w:t xml:space="preserve"> loading via python-</w:t>
+      </w:r>
+      <w:proofErr w:type="spellStart"/>
+      <w:r>
+        <w:rPr>
+          <w:rFonts w:ascii="Consolas" w:eastAsia="Times New Roman" w:hAnsi="Consolas" w:cs="Times New Roman"/>
+          <w:color w:val="E6EDF3"/>
+          <w:kern w:val="0"/>
+          <w:sz w:val="21"/>
+          <w:szCs w:val="21"/>
+          <w14:ligatures w14:val="none"/>
+        </w:rPr>
         <w:t>dotenv</w:t>
       </w:r>
       <w:proofErr w:type="spellEnd"/>
@@ -3070,6 +3206,662 @@
           <w14:ligatures w14:val="none"/>
         </w:rPr>
         <w:t>      └─ log_manager.py           Centralized logging configuration</w:t>
+      </w:r>
+    </w:p>
+    <w:p>
+      <w:pPr>
+        <w:shd w:val="clear" w:color="auto" w:fill="0D1117"/>
+        <w:spacing w:after="0" w:line="285" w:lineRule="atLeast"/>
+        <w:rPr>
+          <w:rFonts w:ascii="Consolas" w:eastAsia="Times New Roman" w:hAnsi="Consolas" w:cs="Times New Roman"/>
+          <w:color w:val="E6EDF3"/>
+          <w:kern w:val="0"/>
+          <w:sz w:val="21"/>
+          <w:szCs w:val="21"/>
+          <w14:ligatures w14:val="none"/>
+        </w:rPr>
+      </w:pPr>
+    </w:p>
+    <w:p>
+      <w:pPr>
+        <w:shd w:val="clear" w:color="auto" w:fill="0D1117"/>
+        <w:spacing w:after="0" w:line="285" w:lineRule="atLeast"/>
+        <w:rPr>
+          <w:rFonts w:ascii="Consolas" w:eastAsia="Times New Roman" w:hAnsi="Consolas" w:cs="Times New Roman"/>
+          <w:color w:val="E6EDF3"/>
+          <w:kern w:val="0"/>
+          <w:sz w:val="21"/>
+          <w:szCs w:val="21"/>
+          <w14:ligatures w14:val="none"/>
+        </w:rPr>
+      </w:pPr>
+      <w:r>
+        <w:rPr>
+          <w:rFonts w:ascii="Consolas" w:eastAsia="Times New Roman" w:hAnsi="Consolas" w:cs="Times New Roman"/>
+          <w:color w:val="E6EDF3"/>
+          <w:kern w:val="0"/>
+          <w:sz w:val="21"/>
+          <w:szCs w:val="21"/>
+          <w14:ligatures w14:val="none"/>
+        </w:rPr>
+        <w:t>  tests/</w:t>
+      </w:r>
+    </w:p>
+    <w:p>
+      <w:pPr>
+        <w:shd w:val="clear" w:color="auto" w:fill="0D1117"/>
+        <w:spacing w:after="0" w:line="285" w:lineRule="atLeast"/>
+        <w:rPr>
+          <w:rFonts w:ascii="Consolas" w:eastAsia="Times New Roman" w:hAnsi="Consolas" w:cs="Times New Roman"/>
+          <w:color w:val="E6EDF3"/>
+          <w:kern w:val="0"/>
+          <w:sz w:val="21"/>
+          <w:szCs w:val="21"/>
+          <w14:ligatures w14:val="none"/>
+        </w:rPr>
+      </w:pPr>
+      <w:r>
+        <w:rPr>
+          <w:rFonts w:ascii="Consolas" w:eastAsia="Times New Roman" w:hAnsi="Consolas" w:cs="Times New Roman"/>
+          <w:color w:val="E6EDF3"/>
+          <w:kern w:val="0"/>
+          <w:sz w:val="21"/>
+          <w:szCs w:val="21"/>
+          <w14:ligatures w14:val="none"/>
+        </w:rPr>
+        <w:t xml:space="preserve">  ├─ conftest.py                  Session-scoped local </w:t>
+      </w:r>
+      <w:proofErr w:type="spellStart"/>
+      <w:r>
+        <w:rPr>
+          <w:rFonts w:ascii="Consolas" w:eastAsia="Times New Roman" w:hAnsi="Consolas" w:cs="Times New Roman"/>
+          <w:color w:val="E6EDF3"/>
+          <w:kern w:val="0"/>
+          <w:sz w:val="21"/>
+          <w:szCs w:val="21"/>
+          <w14:ligatures w14:val="none"/>
+        </w:rPr>
+        <w:t>SparkSession</w:t>
+      </w:r>
+      <w:proofErr w:type="spellEnd"/>
+      <w:r>
+        <w:rPr>
+          <w:rFonts w:ascii="Consolas" w:eastAsia="Times New Roman" w:hAnsi="Consolas" w:cs="Times New Roman"/>
+          <w:color w:val="E6EDF3"/>
+          <w:kern w:val="0"/>
+          <w:sz w:val="21"/>
+          <w:szCs w:val="21"/>
+          <w14:ligatures w14:val="none"/>
+        </w:rPr>
+        <w:t xml:space="preserve"> fixture</w:t>
+      </w:r>
+    </w:p>
+    <w:p>
+      <w:pPr>
+        <w:shd w:val="clear" w:color="auto" w:fill="0D1117"/>
+        <w:spacing w:after="0" w:line="285" w:lineRule="atLeast"/>
+        <w:rPr>
+          <w:rFonts w:ascii="Consolas" w:eastAsia="Times New Roman" w:hAnsi="Consolas" w:cs="Times New Roman"/>
+          <w:color w:val="E6EDF3"/>
+          <w:kern w:val="0"/>
+          <w:sz w:val="21"/>
+          <w:szCs w:val="21"/>
+          <w14:ligatures w14:val="none"/>
+        </w:rPr>
+      </w:pPr>
+      <w:r>
+        <w:rPr>
+          <w:rFonts w:ascii="Consolas" w:eastAsia="Times New Roman" w:hAnsi="Consolas" w:cs="Times New Roman"/>
+          <w:color w:val="E6EDF3"/>
+          <w:kern w:val="0"/>
+          <w:sz w:val="21"/>
+          <w:szCs w:val="21"/>
+          <w14:ligatures w14:val="none"/>
+        </w:rPr>
+        <w:t>  ├─ test_environment.py        </w:t>
+      </w:r>
+      <w:proofErr w:type="gramStart"/>
+      <w:r>
+        <w:rPr>
+          <w:rFonts w:ascii="Consolas" w:eastAsia="Times New Roman" w:hAnsi="Consolas" w:cs="Times New Roman"/>
+          <w:color w:val="E6EDF3"/>
+          <w:kern w:val="0"/>
+          <w:sz w:val="21"/>
+          <w:szCs w:val="21"/>
+          <w14:ligatures w14:val="none"/>
+        </w:rPr>
+        <w:t xml:space="preserve">  .env</w:t>
+      </w:r>
+      <w:proofErr w:type="gramEnd"/>
+      <w:r>
+        <w:rPr>
+          <w:rFonts w:ascii="Consolas" w:eastAsia="Times New Roman" w:hAnsi="Consolas" w:cs="Times New Roman"/>
+          <w:color w:val="E6EDF3"/>
+          <w:kern w:val="0"/>
+          <w:sz w:val="21"/>
+          <w:szCs w:val="21"/>
+          <w14:ligatures w14:val="none"/>
+        </w:rPr>
+        <w:t xml:space="preserve"> loader unit tests</w:t>
+      </w:r>
+    </w:p>
+    <w:p>
+      <w:pPr>
+        <w:shd w:val="clear" w:color="auto" w:fill="0D1117"/>
+        <w:spacing w:after="0" w:line="285" w:lineRule="atLeast"/>
+        <w:rPr>
+          <w:rFonts w:ascii="Consolas" w:eastAsia="Times New Roman" w:hAnsi="Consolas" w:cs="Times New Roman"/>
+          <w:color w:val="E6EDF3"/>
+          <w:kern w:val="0"/>
+          <w:sz w:val="21"/>
+          <w:szCs w:val="21"/>
+          <w14:ligatures w14:val="none"/>
+        </w:rPr>
+      </w:pPr>
+      <w:r>
+        <w:rPr>
+          <w:rFonts w:ascii="Consolas" w:eastAsia="Times New Roman" w:hAnsi="Consolas" w:cs="Times New Roman"/>
+          <w:color w:val="E6EDF3"/>
+          <w:kern w:val="0"/>
+          <w:sz w:val="21"/>
+          <w:szCs w:val="21"/>
+          <w14:ligatures w14:val="none"/>
+        </w:rPr>
+        <w:t>  ├─ test_log_manager.py          </w:t>
+      </w:r>
+      <w:proofErr w:type="spellStart"/>
+      <w:r>
+        <w:rPr>
+          <w:rFonts w:ascii="Consolas" w:eastAsia="Times New Roman" w:hAnsi="Consolas" w:cs="Times New Roman"/>
+          <w:color w:val="E6EDF3"/>
+          <w:kern w:val="0"/>
+          <w:sz w:val="21"/>
+          <w:szCs w:val="21"/>
+          <w14:ligatures w14:val="none"/>
+        </w:rPr>
+        <w:t>LogManager</w:t>
+      </w:r>
+      <w:proofErr w:type="spellEnd"/>
+      <w:r>
+        <w:rPr>
+          <w:rFonts w:ascii="Consolas" w:eastAsia="Times New Roman" w:hAnsi="Consolas" w:cs="Times New Roman"/>
+          <w:color w:val="E6EDF3"/>
+          <w:kern w:val="0"/>
+          <w:sz w:val="21"/>
+          <w:szCs w:val="21"/>
+          <w14:ligatures w14:val="none"/>
+        </w:rPr>
+        <w:t xml:space="preserve"> unit tests</w:t>
+      </w:r>
+    </w:p>
+    <w:p>
+      <w:pPr>
+        <w:shd w:val="clear" w:color="auto" w:fill="0D1117"/>
+        <w:spacing w:after="0" w:line="285" w:lineRule="atLeast"/>
+        <w:rPr>
+          <w:rFonts w:ascii="Consolas" w:eastAsia="Times New Roman" w:hAnsi="Consolas" w:cs="Times New Roman"/>
+          <w:color w:val="E6EDF3"/>
+          <w:kern w:val="0"/>
+          <w:sz w:val="21"/>
+          <w:szCs w:val="21"/>
+          <w14:ligatures w14:val="none"/>
+        </w:rPr>
+      </w:pPr>
+      <w:r>
+        <w:rPr>
+          <w:rFonts w:ascii="Consolas" w:eastAsia="Times New Roman" w:hAnsi="Consolas" w:cs="Times New Roman"/>
+          <w:color w:val="E6EDF3"/>
+          <w:kern w:val="0"/>
+          <w:sz w:val="21"/>
+          <w:szCs w:val="21"/>
+          <w14:ligatures w14:val="none"/>
+        </w:rPr>
+        <w:t>  ├─ unit/</w:t>
+      </w:r>
+    </w:p>
+    <w:p>
+      <w:pPr>
+        <w:shd w:val="clear" w:color="auto" w:fill="0D1117"/>
+        <w:spacing w:after="0" w:line="285" w:lineRule="atLeast"/>
+        <w:rPr>
+          <w:rFonts w:ascii="Consolas" w:eastAsia="Times New Roman" w:hAnsi="Consolas" w:cs="Times New Roman"/>
+          <w:color w:val="E6EDF3"/>
+          <w:kern w:val="0"/>
+          <w:sz w:val="21"/>
+          <w:szCs w:val="21"/>
+          <w14:ligatures w14:val="none"/>
+        </w:rPr>
+      </w:pPr>
+      <w:r>
+        <w:rPr>
+          <w:rFonts w:ascii="Consolas" w:eastAsia="Times New Roman" w:hAnsi="Consolas" w:cs="Times New Roman"/>
+          <w:color w:val="E6EDF3"/>
+          <w:kern w:val="0"/>
+          <w:sz w:val="21"/>
+          <w:szCs w:val="21"/>
+          <w14:ligatures w14:val="none"/>
+        </w:rPr>
+        <w:t xml:space="preserve">  │   ├─ test_config.py           </w:t>
+      </w:r>
+      <w:proofErr w:type="spellStart"/>
+      <w:r>
+        <w:rPr>
+          <w:rFonts w:ascii="Consolas" w:eastAsia="Times New Roman" w:hAnsi="Consolas" w:cs="Times New Roman"/>
+          <w:color w:val="E6EDF3"/>
+          <w:kern w:val="0"/>
+          <w:sz w:val="21"/>
+          <w:szCs w:val="21"/>
+          <w14:ligatures w14:val="none"/>
+        </w:rPr>
+        <w:t>PipelineConfig</w:t>
+      </w:r>
+      <w:proofErr w:type="spellEnd"/>
+      <w:r>
+        <w:rPr>
+          <w:rFonts w:ascii="Consolas" w:eastAsia="Times New Roman" w:hAnsi="Consolas" w:cs="Times New Roman"/>
+          <w:color w:val="E6EDF3"/>
+          <w:kern w:val="0"/>
+          <w:sz w:val="21"/>
+          <w:szCs w:val="21"/>
+          <w14:ligatures w14:val="none"/>
+        </w:rPr>
+        <w:t xml:space="preserve"> unit tests</w:t>
+      </w:r>
+    </w:p>
+    <w:p>
+      <w:pPr>
+        <w:shd w:val="clear" w:color="auto" w:fill="0D1117"/>
+        <w:spacing w:after="0" w:line="285" w:lineRule="atLeast"/>
+        <w:rPr>
+          <w:rFonts w:ascii="Consolas" w:eastAsia="Times New Roman" w:hAnsi="Consolas" w:cs="Times New Roman"/>
+          <w:color w:val="E6EDF3"/>
+          <w:kern w:val="0"/>
+          <w:sz w:val="21"/>
+          <w:szCs w:val="21"/>
+          <w14:ligatures w14:val="none"/>
+        </w:rPr>
+      </w:pPr>
+      <w:r>
+        <w:rPr>
+          <w:rFonts w:ascii="Consolas" w:eastAsia="Times New Roman" w:hAnsi="Consolas" w:cs="Times New Roman"/>
+          <w:color w:val="E6EDF3"/>
+          <w:kern w:val="0"/>
+          <w:sz w:val="21"/>
+          <w:szCs w:val="21"/>
+          <w14:ligatures w14:val="none"/>
+        </w:rPr>
+        <w:t xml:space="preserve">  │   ├─ test_io_factory.py       </w:t>
+      </w:r>
+      <w:proofErr w:type="spellStart"/>
+      <w:r>
+        <w:rPr>
+          <w:rFonts w:ascii="Consolas" w:eastAsia="Times New Roman" w:hAnsi="Consolas" w:cs="Times New Roman"/>
+          <w:color w:val="E6EDF3"/>
+          <w:kern w:val="0"/>
+          <w:sz w:val="21"/>
+          <w:szCs w:val="21"/>
+          <w14:ligatures w14:val="none"/>
+        </w:rPr>
+        <w:t>RDDIOFactory</w:t>
+      </w:r>
+      <w:proofErr w:type="spellEnd"/>
+      <w:r>
+        <w:rPr>
+          <w:rFonts w:ascii="Consolas" w:eastAsia="Times New Roman" w:hAnsi="Consolas" w:cs="Times New Roman"/>
+          <w:color w:val="E6EDF3"/>
+          <w:kern w:val="0"/>
+          <w:sz w:val="21"/>
+          <w:szCs w:val="21"/>
+          <w14:ligatures w14:val="none"/>
+        </w:rPr>
+        <w:t xml:space="preserve"> unit tests</w:t>
+      </w:r>
+    </w:p>
+    <w:p>
+      <w:pPr>
+        <w:shd w:val="clear" w:color="auto" w:fill="0D1117"/>
+        <w:spacing w:after="0" w:line="285" w:lineRule="atLeast"/>
+        <w:rPr>
+          <w:rFonts w:ascii="Consolas" w:eastAsia="Times New Roman" w:hAnsi="Consolas" w:cs="Times New Roman"/>
+          <w:color w:val="E6EDF3"/>
+          <w:kern w:val="0"/>
+          <w:sz w:val="21"/>
+          <w:szCs w:val="21"/>
+          <w14:ligatures w14:val="none"/>
+        </w:rPr>
+      </w:pPr>
+      <w:r>
+        <w:rPr>
+          <w:rFonts w:ascii="Consolas" w:eastAsia="Times New Roman" w:hAnsi="Consolas" w:cs="Times New Roman"/>
+          <w:color w:val="E6EDF3"/>
+          <w:kern w:val="0"/>
+          <w:sz w:val="21"/>
+          <w:szCs w:val="21"/>
+          <w14:ligatures w14:val="none"/>
+        </w:rPr>
+        <w:t>  │   ├─ test_main_cli.py         CLI parsing + job-loader unit tests</w:t>
+      </w:r>
+    </w:p>
+    <w:p>
+      <w:pPr>
+        <w:shd w:val="clear" w:color="auto" w:fill="0D1117"/>
+        <w:spacing w:after="0" w:line="285" w:lineRule="atLeast"/>
+        <w:rPr>
+          <w:rFonts w:ascii="Consolas" w:eastAsia="Times New Roman" w:hAnsi="Consolas" w:cs="Times New Roman"/>
+          <w:color w:val="E6EDF3"/>
+          <w:kern w:val="0"/>
+          <w:sz w:val="21"/>
+          <w:szCs w:val="21"/>
+          <w14:ligatures w14:val="none"/>
+        </w:rPr>
+      </w:pPr>
+      <w:r>
+        <w:rPr>
+          <w:rFonts w:ascii="Consolas" w:eastAsia="Times New Roman" w:hAnsi="Consolas" w:cs="Times New Roman"/>
+          <w:color w:val="E6EDF3"/>
+          <w:kern w:val="0"/>
+          <w:sz w:val="21"/>
+          <w:szCs w:val="21"/>
+          <w14:ligatures w14:val="none"/>
+        </w:rPr>
+        <w:t>  │   ├─ test_schema_mapping.py   Schema contract unit tests</w:t>
+      </w:r>
+    </w:p>
+    <w:p>
+      <w:pPr>
+        <w:shd w:val="clear" w:color="auto" w:fill="0D1117"/>
+        <w:spacing w:after="0" w:line="285" w:lineRule="atLeast"/>
+        <w:rPr>
+          <w:rFonts w:ascii="Consolas" w:eastAsia="Times New Roman" w:hAnsi="Consolas" w:cs="Times New Roman"/>
+          <w:color w:val="E6EDF3"/>
+          <w:kern w:val="0"/>
+          <w:sz w:val="21"/>
+          <w:szCs w:val="21"/>
+          <w14:ligatures w14:val="none"/>
+        </w:rPr>
+      </w:pPr>
+      <w:r>
+        <w:rPr>
+          <w:rFonts w:ascii="Consolas" w:eastAsia="Times New Roman" w:hAnsi="Consolas" w:cs="Times New Roman"/>
+          <w:color w:val="E6EDF3"/>
+          <w:kern w:val="0"/>
+          <w:sz w:val="21"/>
+          <w:szCs w:val="21"/>
+          <w14:ligatures w14:val="none"/>
+        </w:rPr>
+        <w:t>  │   ├─ test_skew_check.py       Skew-detection unit tests</w:t>
+      </w:r>
+    </w:p>
+    <w:p>
+      <w:pPr>
+        <w:shd w:val="clear" w:color="auto" w:fill="0D1117"/>
+        <w:spacing w:after="0" w:line="285" w:lineRule="atLeast"/>
+        <w:rPr>
+          <w:rFonts w:ascii="Consolas" w:eastAsia="Times New Roman" w:hAnsi="Consolas" w:cs="Times New Roman"/>
+          <w:color w:val="E6EDF3"/>
+          <w:kern w:val="0"/>
+          <w:sz w:val="21"/>
+          <w:szCs w:val="21"/>
+          <w14:ligatures w14:val="none"/>
+        </w:rPr>
+      </w:pPr>
+      <w:r>
+        <w:rPr>
+          <w:rFonts w:ascii="Consolas" w:eastAsia="Times New Roman" w:hAnsi="Consolas" w:cs="Times New Roman"/>
+          <w:color w:val="E6EDF3"/>
+          <w:kern w:val="0"/>
+          <w:sz w:val="21"/>
+          <w:szCs w:val="21"/>
+          <w14:ligatures w14:val="none"/>
+        </w:rPr>
+        <w:t>  │   ├─ test_writer_dated_path.py Dated-output-path writer tests</w:t>
+      </w:r>
+    </w:p>
+    <w:p>
+      <w:pPr>
+        <w:shd w:val="clear" w:color="auto" w:fill="0D1117"/>
+        <w:spacing w:after="0" w:line="285" w:lineRule="atLeast"/>
+        <w:rPr>
+          <w:rFonts w:ascii="Consolas" w:eastAsia="Times New Roman" w:hAnsi="Consolas" w:cs="Times New Roman"/>
+          <w:color w:val="E6EDF3"/>
+          <w:kern w:val="0"/>
+          <w:sz w:val="21"/>
+          <w:szCs w:val="21"/>
+          <w14:ligatures w14:val="none"/>
+        </w:rPr>
+      </w:pPr>
+      <w:r>
+        <w:rPr>
+          <w:rFonts w:ascii="Consolas" w:eastAsia="Times New Roman" w:hAnsi="Consolas" w:cs="Times New Roman"/>
+          <w:color w:val="E6EDF3"/>
+          <w:kern w:val="0"/>
+          <w:sz w:val="21"/>
+          <w:szCs w:val="21"/>
+          <w14:ligatures w14:val="none"/>
+        </w:rPr>
+        <w:t>  │   └─ transforms/              One file per transform class</w:t>
+      </w:r>
+    </w:p>
+    <w:p>
+      <w:pPr>
+        <w:shd w:val="clear" w:color="auto" w:fill="0D1117"/>
+        <w:spacing w:after="0" w:line="285" w:lineRule="atLeast"/>
+        <w:rPr>
+          <w:rFonts w:ascii="Consolas" w:eastAsia="Times New Roman" w:hAnsi="Consolas" w:cs="Times New Roman"/>
+          <w:color w:val="E6EDF3"/>
+          <w:kern w:val="0"/>
+          <w:sz w:val="21"/>
+          <w:szCs w:val="21"/>
+          <w14:ligatures w14:val="none"/>
+        </w:rPr>
+      </w:pPr>
+      <w:r>
+        <w:rPr>
+          <w:rFonts w:ascii="Consolas" w:eastAsia="Times New Roman" w:hAnsi="Consolas" w:cs="Times New Roman"/>
+          <w:color w:val="E6EDF3"/>
+          <w:kern w:val="0"/>
+          <w:sz w:val="21"/>
+          <w:szCs w:val="21"/>
+          <w14:ligatures w14:val="none"/>
+        </w:rPr>
+        <w:t>  └─ integration/                 End-to-end pipeline tests on local Spark</w:t>
+      </w:r>
+    </w:p>
+    <w:p>
+      <w:pPr>
+        <w:shd w:val="clear" w:color="auto" w:fill="0D1117"/>
+        <w:spacing w:after="0" w:line="285" w:lineRule="atLeast"/>
+        <w:rPr>
+          <w:rFonts w:ascii="Consolas" w:eastAsia="Times New Roman" w:hAnsi="Consolas" w:cs="Times New Roman"/>
+          <w:color w:val="E6EDF3"/>
+          <w:kern w:val="0"/>
+          <w:sz w:val="21"/>
+          <w:szCs w:val="21"/>
+          <w14:ligatures w14:val="none"/>
+        </w:rPr>
+      </w:pPr>
+      <w:r>
+        <w:rPr>
+          <w:rFonts w:ascii="Consolas" w:eastAsia="Times New Roman" w:hAnsi="Consolas" w:cs="Times New Roman"/>
+          <w:color w:val="E6EDF3"/>
+          <w:kern w:val="0"/>
+          <w:sz w:val="21"/>
+          <w:szCs w:val="21"/>
+          <w14:ligatures w14:val="none"/>
+        </w:rPr>
+        <w:t>      ├─ test_task1_etl_job.py    Synthetic-data full pipeline (task1)</w:t>
+      </w:r>
+    </w:p>
+    <w:p>
+      <w:pPr>
+        <w:shd w:val="clear" w:color="auto" w:fill="0D1117"/>
+        <w:spacing w:after="0" w:line="285" w:lineRule="atLeast"/>
+        <w:rPr>
+          <w:rFonts w:ascii="Consolas" w:eastAsia="Times New Roman" w:hAnsi="Consolas" w:cs="Times New Roman"/>
+          <w:color w:val="E6EDF3"/>
+          <w:kern w:val="0"/>
+          <w:sz w:val="21"/>
+          <w:szCs w:val="21"/>
+          <w14:ligatures w14:val="none"/>
+        </w:rPr>
+      </w:pPr>
+      <w:r>
+        <w:rPr>
+          <w:rFonts w:ascii="Consolas" w:eastAsia="Times New Roman" w:hAnsi="Consolas" w:cs="Times New Roman"/>
+          <w:color w:val="E6EDF3"/>
+          <w:kern w:val="0"/>
+          <w:sz w:val="21"/>
+          <w:szCs w:val="21"/>
+          <w14:ligatures w14:val="none"/>
+        </w:rPr>
+        <w:t>      ├─ test_task2_etl_job.py    Balanced + skewed-data paths (task2)</w:t>
+      </w:r>
+    </w:p>
+    <w:p>
+      <w:pPr>
+        <w:shd w:val="clear" w:color="auto" w:fill="0D1117"/>
+        <w:spacing w:after="0" w:line="285" w:lineRule="atLeast"/>
+        <w:rPr>
+          <w:rFonts w:ascii="Consolas" w:eastAsia="Times New Roman" w:hAnsi="Consolas" w:cs="Times New Roman"/>
+          <w:color w:val="E6EDF3"/>
+          <w:kern w:val="0"/>
+          <w:sz w:val="21"/>
+          <w:szCs w:val="21"/>
+          <w14:ligatures w14:val="none"/>
+        </w:rPr>
+      </w:pPr>
+      <w:r>
+        <w:rPr>
+          <w:rFonts w:ascii="Consolas" w:eastAsia="Times New Roman" w:hAnsi="Consolas" w:cs="Times New Roman"/>
+          <w:color w:val="E6EDF3"/>
+          <w:kern w:val="0"/>
+          <w:sz w:val="21"/>
+          <w:szCs w:val="21"/>
+          <w14:ligatures w14:val="none"/>
+        </w:rPr>
+        <w:t xml:space="preserve">      ├─ </w:t>
+      </w:r>
+      <w:proofErr w:type="gramStart"/>
+      <w:r>
+        <w:rPr>
+          <w:rFonts w:ascii="Consolas" w:eastAsia="Times New Roman" w:hAnsi="Consolas" w:cs="Times New Roman"/>
+          <w:color w:val="E6EDF3"/>
+          <w:kern w:val="0"/>
+          <w:sz w:val="21"/>
+          <w:szCs w:val="21"/>
+          <w14:ligatures w14:val="none"/>
+        </w:rPr>
+        <w:t>test_main_end_to_end.py  CLI</w:t>
+      </w:r>
+      <w:proofErr w:type="gramEnd"/>
+      <w:r>
+        <w:rPr>
+          <w:rFonts w:ascii="Consolas" w:eastAsia="Times New Roman" w:hAnsi="Consolas" w:cs="Times New Roman"/>
+          <w:color w:val="E6EDF3"/>
+          <w:kern w:val="0"/>
+          <w:sz w:val="21"/>
+          <w:szCs w:val="21"/>
+          <w14:ligatures w14:val="none"/>
+        </w:rPr>
+        <w:t xml:space="preserve"> subprocess driving </w:t>
+      </w:r>
+      <w:proofErr w:type="gramStart"/>
+      <w:r>
+        <w:rPr>
+          <w:rFonts w:ascii="Consolas" w:eastAsia="Times New Roman" w:hAnsi="Consolas" w:cs="Times New Roman"/>
+          <w:color w:val="E6EDF3"/>
+          <w:kern w:val="0"/>
+          <w:sz w:val="21"/>
+          <w:szCs w:val="21"/>
+          <w14:ligatures w14:val="none"/>
+        </w:rPr>
+        <w:t>main(</w:t>
+      </w:r>
+      <w:proofErr w:type="gramEnd"/>
+      <w:r>
+        <w:rPr>
+          <w:rFonts w:ascii="Consolas" w:eastAsia="Times New Roman" w:hAnsi="Consolas" w:cs="Times New Roman"/>
+          <w:color w:val="E6EDF3"/>
+          <w:kern w:val="0"/>
+          <w:sz w:val="21"/>
+          <w:szCs w:val="21"/>
+          <w14:ligatures w14:val="none"/>
+        </w:rPr>
+        <w:t>)</w:t>
+      </w:r>
+    </w:p>
+    <w:p>
+      <w:pPr>
+        <w:shd w:val="clear" w:color="auto" w:fill="0D1117"/>
+        <w:spacing w:after="0" w:line="285" w:lineRule="atLeast"/>
+        <w:rPr>
+          <w:rFonts w:ascii="Consolas" w:eastAsia="Times New Roman" w:hAnsi="Consolas" w:cs="Times New Roman"/>
+          <w:color w:val="E6EDF3"/>
+          <w:kern w:val="0"/>
+          <w:sz w:val="21"/>
+          <w:szCs w:val="21"/>
+          <w14:ligatures w14:val="none"/>
+        </w:rPr>
+      </w:pPr>
+      <w:r>
+        <w:rPr>
+          <w:rFonts w:ascii="Consolas" w:eastAsia="Times New Roman" w:hAnsi="Consolas" w:cs="Times New Roman"/>
+          <w:color w:val="E6EDF3"/>
+          <w:kern w:val="0"/>
+          <w:sz w:val="21"/>
+          <w:szCs w:val="21"/>
+          <w14:ligatures w14:val="none"/>
+        </w:rPr>
+        <w:t xml:space="preserve">      └─ </w:t>
+      </w:r>
+      <w:proofErr w:type="gramStart"/>
+      <w:r>
+        <w:rPr>
+          <w:rFonts w:ascii="Consolas" w:eastAsia="Times New Roman" w:hAnsi="Consolas" w:cs="Times New Roman"/>
+          <w:color w:val="E6EDF3"/>
+          <w:kern w:val="0"/>
+          <w:sz w:val="21"/>
+          <w:szCs w:val="21"/>
+          <w14:ligatures w14:val="none"/>
+        </w:rPr>
+        <w:t>test_with_real_fixtures.py  Smoke</w:t>
+      </w:r>
+      <w:proofErr w:type="gramEnd"/>
+      <w:r>
+        <w:rPr>
+          <w:rFonts w:ascii="Consolas" w:eastAsia="Times New Roman" w:hAnsi="Consolas" w:cs="Times New Roman"/>
+          <w:color w:val="E6EDF3"/>
+          <w:kern w:val="0"/>
+          <w:sz w:val="21"/>
+          <w:szCs w:val="21"/>
+          <w14:ligatures w14:val="none"/>
+        </w:rPr>
+        <w:t xml:space="preserve"> test on data/input/*.parquet</w:t>
+      </w:r>
+    </w:p>
+    <w:p>
+      <w:pPr>
+        <w:shd w:val="clear" w:color="auto" w:fill="0D1117"/>
+        <w:spacing w:after="0" w:line="285" w:lineRule="atLeast"/>
+        <w:rPr>
+          <w:rFonts w:ascii="Consolas" w:eastAsia="Times New Roman" w:hAnsi="Consolas" w:cs="Times New Roman"/>
+          <w:color w:val="E6EDF3"/>
+          <w:kern w:val="0"/>
+          <w:sz w:val="21"/>
+          <w:szCs w:val="21"/>
+          <w14:ligatures w14:val="none"/>
+        </w:rPr>
+      </w:pPr>
+      <w:r>
+        <w:rPr>
+          <w:rFonts w:ascii="Consolas" w:eastAsia="Times New Roman" w:hAnsi="Consolas" w:cs="Times New Roman"/>
+          <w:color w:val="E6EDF3"/>
+          <w:kern w:val="0"/>
+          <w:sz w:val="21"/>
+          <w:szCs w:val="21"/>
+          <w14:ligatures w14:val="none"/>
+        </w:rPr>
+        <w:t>                                      (parametrized for task1 + task2)</w:t>
       </w:r>
     </w:p>
     <w:p>
@@ -3104,9 +3896,8 @@
           <w:numId w:val="15"/>
         </w:numPr>
       </w:pPr>
-      <w:bookmarkStart w:id="5" w:name="_Toc227880628"/>
-      <w:r>
-        <w:lastRenderedPageBreak/>
+      <w:bookmarkStart w:id="5" w:name="_Toc227907257"/>
+      <w:r>
         <w:t>Data Pipeline Design</w:t>
       </w:r>
       <w:bookmarkEnd w:id="5"/>
@@ -3187,8 +3978,9 @@
       <w:pPr>
         <w:pStyle w:val="Heading3"/>
       </w:pPr>
-      <w:bookmarkStart w:id="6" w:name="_Toc227880629"/>
-      <w:r>
+      <w:bookmarkStart w:id="6" w:name="_Toc227907258"/>
+      <w:r>
+        <w:lastRenderedPageBreak/>
         <w:t xml:space="preserve">2.1.1 </w:t>
       </w:r>
       <w:r>
@@ -3425,12 +4217,21 @@
               </w:rPr>
               <w:t xml:space="preserve">   </w:t>
             </w:r>
+            <w:proofErr w:type="gramStart"/>
             <w:r>
               <w:rPr>
                 <w:sz w:val="20"/>
                 <w:szCs w:val="20"/>
               </w:rPr>
-              <w:t>.map(row -&gt; (row[</w:t>
+              <w:t>.map</w:t>
+            </w:r>
+            <w:proofErr w:type="gramEnd"/>
+            <w:r>
+              <w:rPr>
+                <w:sz w:val="20"/>
+                <w:szCs w:val="20"/>
+              </w:rPr>
+              <w:t>(row -&gt; (row[</w:t>
             </w:r>
             <w:proofErr w:type="spellStart"/>
             <w:r>
@@ -3463,6 +4264,7 @@
               </w:rPr>
               <w:t xml:space="preserve">   </w:t>
             </w:r>
+            <w:proofErr w:type="gramStart"/>
             <w:r>
               <w:rPr>
                 <w:sz w:val="20"/>
@@ -3479,6 +4281,7 @@
               <w:t>reduceByKey</w:t>
             </w:r>
             <w:proofErr w:type="spellEnd"/>
+            <w:proofErr w:type="gramEnd"/>
             <w:r>
               <w:rPr>
                 <w:sz w:val="20"/>
@@ -3501,44 +4304,62 @@
               </w:rPr>
               <w:t xml:space="preserve">   </w:t>
             </w:r>
+            <w:proofErr w:type="gramStart"/>
             <w:r>
               <w:rPr>
                 <w:sz w:val="20"/>
                 <w:szCs w:val="20"/>
               </w:rPr>
-              <w:t>.map(</w:t>
-            </w:r>
-            <w:proofErr w:type="spellStart"/>
+              <w:t>.map</w:t>
+            </w:r>
+            <w:proofErr w:type="gramEnd"/>
             <w:r>
               <w:rPr>
                 <w:sz w:val="20"/>
                 <w:szCs w:val="20"/>
               </w:rPr>
-              <w:t>kv</w:t>
-            </w:r>
-            <w:proofErr w:type="spellEnd"/>
+              <w:t>(</w:t>
+            </w:r>
+            <w:proofErr w:type="spellStart"/>
             <w:r>
               <w:rPr>
                 <w:sz w:val="20"/>
                 <w:szCs w:val="20"/>
               </w:rPr>
-              <w:t xml:space="preserve"> -&gt; </w:t>
-            </w:r>
-            <w:proofErr w:type="spellStart"/>
+              <w:t>kv</w:t>
+            </w:r>
+            <w:proofErr w:type="spellEnd"/>
             <w:r>
               <w:rPr>
                 <w:sz w:val="20"/>
                 <w:szCs w:val="20"/>
               </w:rPr>
-              <w:t>kv</w:t>
-            </w:r>
-            <w:proofErr w:type="spellEnd"/>
+              <w:t xml:space="preserve"> -&gt; </w:t>
+            </w:r>
+            <w:proofErr w:type="spellStart"/>
+            <w:proofErr w:type="gramStart"/>
             <w:r>
               <w:rPr>
                 <w:sz w:val="20"/>
                 <w:szCs w:val="20"/>
               </w:rPr>
-              <w:t>[1])</w:t>
+              <w:t>kv</w:t>
+            </w:r>
+            <w:proofErr w:type="spellEnd"/>
+            <w:r>
+              <w:rPr>
+                <w:sz w:val="20"/>
+                <w:szCs w:val="20"/>
+              </w:rPr>
+              <w:t>[</w:t>
+            </w:r>
+            <w:proofErr w:type="gramEnd"/>
+            <w:r>
+              <w:rPr>
+                <w:sz w:val="20"/>
+                <w:szCs w:val="20"/>
+              </w:rPr>
+              <w:t>1])</w:t>
             </w:r>
           </w:p>
           <w:p>
@@ -3678,12 +4499,21 @@
                 <w:szCs w:val="20"/>
               </w:rPr>
             </w:pPr>
+            <w:proofErr w:type="gramStart"/>
             <w:r>
               <w:rPr>
                 <w:sz w:val="20"/>
                 <w:szCs w:val="20"/>
               </w:rPr>
-              <w:t>0(n) time, 1 shuffle stage</w:t>
+              <w:t>0(n) time</w:t>
+            </w:r>
+            <w:proofErr w:type="gramEnd"/>
+            <w:r>
+              <w:rPr>
+                <w:sz w:val="20"/>
+                <w:szCs w:val="20"/>
+              </w:rPr>
+              <w:t>, 1 shuffle stage</w:t>
             </w:r>
           </w:p>
         </w:tc>
@@ -3698,35 +4528,35 @@
       </w:pPr>
     </w:p>
     <w:p>
-      <w:pPr>
+      <w:r>
         <w:rPr>
           <w:b/>
           <w:bCs/>
         </w:rPr>
-      </w:pPr>
+        <w:t>Rationale to use</w:t>
+      </w:r>
       <w:r>
         <w:rPr>
           <w:b/>
           <w:bCs/>
         </w:rPr>
-        <w:br w:type="page"/>
-      </w:r>
-    </w:p>
-    <w:p>
+        <w:t xml:space="preserve"> </w:t>
+      </w:r>
+      <w:proofErr w:type="spellStart"/>
       <w:r>
         <w:rPr>
           <w:b/>
           <w:bCs/>
         </w:rPr>
-        <w:lastRenderedPageBreak/>
-        <w:t>Rationale to use</w:t>
-      </w:r>
+        <w:t>reduceByKey</w:t>
+      </w:r>
+      <w:proofErr w:type="spellEnd"/>
       <w:r>
         <w:rPr>
           <w:b/>
           <w:bCs/>
         </w:rPr>
-        <w:t xml:space="preserve"> </w:t>
+        <w:t xml:space="preserve"> over </w:t>
       </w:r>
       <w:proofErr w:type="spellStart"/>
       <w:r>
@@ -3734,7 +4564,7 @@
           <w:b/>
           <w:bCs/>
         </w:rPr>
-        <w:t>reduceByKey</w:t>
+        <w:t>groupByKey</w:t>
       </w:r>
       <w:proofErr w:type="spellEnd"/>
       <w:r>
@@ -3742,23 +4572,23 @@
           <w:b/>
           <w:bCs/>
         </w:rPr>
-        <w:t xml:space="preserve"> over </w:t>
-      </w:r>
-      <w:proofErr w:type="spellStart"/>
+        <w:t xml:space="preserve"> or </w:t>
+      </w:r>
+      <w:proofErr w:type="gramStart"/>
       <w:r>
         <w:rPr>
           <w:b/>
           <w:bCs/>
         </w:rPr>
-        <w:t>groupByKey</w:t>
-      </w:r>
-      <w:proofErr w:type="spellEnd"/>
+        <w:t>distinct(</w:t>
+      </w:r>
+      <w:proofErr w:type="gramEnd"/>
       <w:r>
         <w:rPr>
           <w:b/>
           <w:bCs/>
         </w:rPr>
-        <w:t xml:space="preserve"> or distinct()</w:t>
+        <w:t>)</w:t>
       </w:r>
       <w:r>
         <w:t>:</w:t>
@@ -3993,6 +4823,7 @@
               </w:rPr>
             </w:pPr>
             <w:proofErr w:type="spellStart"/>
+            <w:proofErr w:type="gramStart"/>
             <w:r>
               <w:rPr>
                 <w:sz w:val="20"/>
@@ -4006,7 +4837,15 @@
                 <w:sz w:val="20"/>
                 <w:szCs w:val="20"/>
               </w:rPr>
-              <w:t xml:space="preserve">(row -&gt; </w:t>
+              <w:t>(</w:t>
+            </w:r>
+            <w:proofErr w:type="gramEnd"/>
+            <w:r>
+              <w:rPr>
+                <w:sz w:val="20"/>
+                <w:szCs w:val="20"/>
+              </w:rPr>
+              <w:t xml:space="preserve">row -&gt; </w:t>
             </w:r>
           </w:p>
           <w:p>
@@ -4091,6 +4930,7 @@
               </w:rPr>
               <w:t xml:space="preserve">  </w:t>
             </w:r>
+            <w:proofErr w:type="gramStart"/>
             <w:r>
               <w:rPr>
                 <w:sz w:val="20"/>
@@ -4107,6 +4947,7 @@
               <w:t>reduceByKey</w:t>
             </w:r>
             <w:proofErr w:type="spellEnd"/>
+            <w:proofErr w:type="gramEnd"/>
             <w:r>
               <w:rPr>
                 <w:sz w:val="20"/>
@@ -4136,6 +4977,7 @@
                 <w:szCs w:val="20"/>
               </w:rPr>
             </w:pPr>
+            <w:proofErr w:type="gramStart"/>
             <w:r>
               <w:rPr>
                 <w:rFonts w:ascii="Times New Roman" w:hAnsi="Times New Roman" w:cs="Times New Roman"/>
@@ -4161,6 +5003,7 @@
               <w:t>(</w:t>
             </w:r>
             <w:proofErr w:type="spellStart"/>
+            <w:proofErr w:type="gramEnd"/>
             <w:r>
               <w:rPr>
                 <w:rFonts w:ascii="Times New Roman" w:hAnsi="Times New Roman" w:cs="Times New Roman"/>
@@ -4221,12 +5064,21 @@
                 <w:szCs w:val="20"/>
               </w:rPr>
             </w:pPr>
+            <w:proofErr w:type="gramStart"/>
             <w:r>
               <w:rPr>
                 <w:sz w:val="20"/>
                 <w:szCs w:val="20"/>
               </w:rPr>
-              <w:t>0(n) time, 1 shuffle stage</w:t>
+              <w:t>0(n) time</w:t>
+            </w:r>
+            <w:proofErr w:type="gramEnd"/>
+            <w:r>
+              <w:rPr>
+                <w:sz w:val="20"/>
+                <w:szCs w:val="20"/>
+              </w:rPr>
+              <w:t>, 1 shuffle stage</w:t>
             </w:r>
           </w:p>
         </w:tc>
@@ -4481,6 +5333,7 @@
               </w:rPr>
             </w:pPr>
             <w:proofErr w:type="spellStart"/>
+            <w:proofErr w:type="gramStart"/>
             <w:r>
               <w:rPr>
                 <w:sz w:val="20"/>
@@ -4497,6 +5350,7 @@
               <w:t>(</w:t>
             </w:r>
             <w:proofErr w:type="spellStart"/>
+            <w:proofErr w:type="gramEnd"/>
             <w:r>
               <w:rPr>
                 <w:sz w:val="20"/>
@@ -4579,17 +5433,26 @@
                 <w:sz w:val="20"/>
                 <w:szCs w:val="20"/>
               </w:rPr>
-              <w:t>   .</w:t>
-            </w:r>
-            <w:proofErr w:type="spellStart"/>
+              <w:t>   </w:t>
+            </w:r>
+            <w:proofErr w:type="gramStart"/>
             <w:r>
               <w:rPr>
                 <w:sz w:val="20"/>
                 <w:szCs w:val="20"/>
               </w:rPr>
+              <w:t>.</w:t>
+            </w:r>
+            <w:proofErr w:type="spellStart"/>
+            <w:r>
+              <w:rPr>
+                <w:sz w:val="20"/>
+                <w:szCs w:val="20"/>
+              </w:rPr>
               <w:t>groupByKey</w:t>
             </w:r>
             <w:proofErr w:type="spellEnd"/>
+            <w:proofErr w:type="gramEnd"/>
             <w:r>
               <w:rPr>
                 <w:sz w:val="20"/>
@@ -4610,17 +5473,26 @@
                 <w:sz w:val="20"/>
                 <w:szCs w:val="20"/>
               </w:rPr>
-              <w:t>   .</w:t>
-            </w:r>
-            <w:proofErr w:type="spellStart"/>
+              <w:t>   </w:t>
+            </w:r>
+            <w:proofErr w:type="gramStart"/>
             <w:r>
               <w:rPr>
                 <w:sz w:val="20"/>
                 <w:szCs w:val="20"/>
               </w:rPr>
+              <w:t>.</w:t>
+            </w:r>
+            <w:proofErr w:type="spellStart"/>
+            <w:r>
+              <w:rPr>
+                <w:sz w:val="20"/>
+                <w:szCs w:val="20"/>
+              </w:rPr>
               <w:t>flatMap</w:t>
             </w:r>
             <w:proofErr w:type="spellEnd"/>
+            <w:proofErr w:type="gramEnd"/>
             <w:r>
               <w:rPr>
                 <w:sz w:val="20"/>
@@ -4739,7 +5611,23 @@
                 <w:sz w:val="20"/>
                 <w:szCs w:val="20"/>
               </w:rPr>
-              <w:t>rank 1..top_x via enumerate)</w:t>
+              <w:t xml:space="preserve">rank </w:t>
+            </w:r>
+            <w:proofErr w:type="gramStart"/>
+            <w:r>
+              <w:rPr>
+                <w:sz w:val="20"/>
+                <w:szCs w:val="20"/>
+              </w:rPr>
+              <w:t>1..</w:t>
+            </w:r>
+            <w:proofErr w:type="gramEnd"/>
+            <w:r>
+              <w:rPr>
+                <w:sz w:val="20"/>
+                <w:szCs w:val="20"/>
+              </w:rPr>
+              <w:t>top_x via enumerate)</w:t>
             </w:r>
           </w:p>
           <w:p>
@@ -4849,7 +5737,23 @@
                 <w:sz w:val="20"/>
                 <w:szCs w:val="20"/>
               </w:rPr>
-              <w:t>stage. Per-group sorting is O(k log k) per location.</w:t>
+              <w:t xml:space="preserve">stage. Per-group sorting is </w:t>
+            </w:r>
+            <w:proofErr w:type="gramStart"/>
+            <w:r>
+              <w:rPr>
+                <w:sz w:val="20"/>
+                <w:szCs w:val="20"/>
+              </w:rPr>
+              <w:t>O(</w:t>
+            </w:r>
+            <w:proofErr w:type="gramEnd"/>
+            <w:r>
+              <w:rPr>
+                <w:sz w:val="20"/>
+                <w:szCs w:val="20"/>
+              </w:rPr>
+              <w:t>k log k) per location.</w:t>
             </w:r>
           </w:p>
           <w:p>
@@ -4868,7 +5772,6 @@
     <w:p/>
     <w:p>
       <w:r>
-        <w:lastRenderedPageBreak/>
         <w:t xml:space="preserve"> </w:t>
       </w:r>
       <w:r>
@@ -4929,7 +5832,15 @@
         </w:numPr>
       </w:pPr>
       <w:r>
-        <w:t xml:space="preserve">Sorting need to occur over complete set of items to assign the ranking, thus </w:t>
+        <w:t xml:space="preserve">Sorting </w:t>
+      </w:r>
+      <w:proofErr w:type="gramStart"/>
+      <w:r>
+        <w:t>need</w:t>
+      </w:r>
+      <w:proofErr w:type="gramEnd"/>
+      <w:r>
+        <w:t xml:space="preserve"> to occur over complete set of items to assign the ranking, thus </w:t>
       </w:r>
       <w:proofErr w:type="spellStart"/>
       <w:r>
@@ -5144,6 +6055,7 @@
               <w:t xml:space="preserve"> = </w:t>
             </w:r>
             <w:proofErr w:type="spellStart"/>
+            <w:proofErr w:type="gramStart"/>
             <w:r>
               <w:rPr>
                 <w:sz w:val="20"/>
@@ -5152,6 +6064,7 @@
               <w:t>sc.broadcast</w:t>
             </w:r>
             <w:proofErr w:type="spellEnd"/>
+            <w:proofErr w:type="gramEnd"/>
             <w:r>
               <w:rPr>
                 <w:sz w:val="20"/>
@@ -5199,6 +6112,7 @@
               </w:rPr>
             </w:pPr>
             <w:proofErr w:type="spellStart"/>
+            <w:proofErr w:type="gramStart"/>
             <w:r>
               <w:rPr>
                 <w:sz w:val="20"/>
@@ -5212,7 +6126,15 @@
                 <w:sz w:val="20"/>
                 <w:szCs w:val="20"/>
               </w:rPr>
-              <w:t xml:space="preserve">(row -&gt; insert </w:t>
+              <w:t>(</w:t>
+            </w:r>
+            <w:proofErr w:type="gramEnd"/>
+            <w:r>
+              <w:rPr>
+                <w:sz w:val="20"/>
+                <w:szCs w:val="20"/>
+              </w:rPr>
+              <w:t xml:space="preserve">row -&gt; insert </w:t>
             </w:r>
             <w:proofErr w:type="spellStart"/>
             <w:r>
@@ -5461,6 +6383,7 @@
         </w:numPr>
       </w:pPr>
       <w:r>
+        <w:lastRenderedPageBreak/>
         <w:t>Dataset B (~10k rows) can easily fit into executor memory</w:t>
       </w:r>
     </w:p>
@@ -5489,11 +6412,6 @@
       </w:r>
     </w:p>
     <w:p>
-      <w:r>
-        <w:br w:type="page"/>
-      </w:r>
-    </w:p>
-    <w:p>
       <w:pPr>
         <w:pStyle w:val="Heading2"/>
         <w:numPr>
@@ -5501,9 +6419,8 @@
           <w:numId w:val="15"/>
         </w:numPr>
       </w:pPr>
-      <w:bookmarkStart w:id="7" w:name="_Toc227880630"/>
-      <w:r>
-        <w:lastRenderedPageBreak/>
+      <w:bookmarkStart w:id="7" w:name="_Toc227907259"/>
+      <w:r>
         <w:t xml:space="preserve">Usage of </w:t>
       </w:r>
       <w:r>
@@ -5515,7 +6432,7 @@
       <w:pPr>
         <w:pStyle w:val="Heading3"/>
       </w:pPr>
-      <w:bookmarkStart w:id="8" w:name="_Toc227880631"/>
+      <w:bookmarkStart w:id="8" w:name="_Toc227907260"/>
       <w:r>
         <w:t xml:space="preserve">2.3.1 </w:t>
       </w:r>
@@ -5620,7 +6537,31 @@
                                 <w:szCs w:val="16"/>
                                 <w14:ligatures w14:val="none"/>
                               </w:rPr>
-                              <w:t xml:space="preserve"># read the parquet file using </w:t>
+                              <w:t xml:space="preserve"># </w:t>
+                            </w:r>
+                            <w:proofErr w:type="gramStart"/>
+                            <w:r>
+                              <w:rPr>
+                                <w:rFonts w:ascii="Consolas" w:eastAsia="Times New Roman" w:hAnsi="Consolas" w:cs="Times New Roman"/>
+                                <w:color w:val="E6EDF3"/>
+                                <w:kern w:val="0"/>
+                                <w:sz w:val="16"/>
+                                <w:szCs w:val="16"/>
+                                <w14:ligatures w14:val="none"/>
+                              </w:rPr>
+                              <w:t>read</w:t>
+                            </w:r>
+                            <w:proofErr w:type="gramEnd"/>
+                            <w:r>
+                              <w:rPr>
+                                <w:rFonts w:ascii="Consolas" w:eastAsia="Times New Roman" w:hAnsi="Consolas" w:cs="Times New Roman"/>
+                                <w:color w:val="E6EDF3"/>
+                                <w:kern w:val="0"/>
+                                <w:sz w:val="16"/>
+                                <w:szCs w:val="16"/>
+                                <w14:ligatures w14:val="none"/>
+                              </w:rPr>
+                              <w:t xml:space="preserve"> the parquet file using </w:t>
                             </w:r>
                             <w:proofErr w:type="spellStart"/>
                             <w:r>
@@ -5644,18 +6585,7 @@
                                 <w:szCs w:val="16"/>
                                 <w14:ligatures w14:val="none"/>
                               </w:rPr>
-                              <w:t xml:space="preserve"> </w:t>
-                            </w:r>
-                            <w:r>
-                              <w:rPr>
-                                <w:rFonts w:ascii="Consolas" w:eastAsia="Times New Roman" w:hAnsi="Consolas" w:cs="Times New Roman"/>
-                                <w:color w:val="E6EDF3"/>
-                                <w:kern w:val="0"/>
-                                <w:sz w:val="16"/>
-                                <w:szCs w:val="16"/>
-                                <w14:ligatures w14:val="none"/>
-                              </w:rPr>
-                              <w:t xml:space="preserve">factory     </w:t>
+                              <w:t xml:space="preserve"> factory     </w:t>
                             </w:r>
                           </w:p>
                           <w:p>
@@ -5749,7 +6679,19 @@
                                 <w:szCs w:val="16"/>
                                 <w14:ligatures w14:val="none"/>
                               </w:rPr>
-                              <w:t>read_rdd</w:t>
+                              <w:t>read_</w:t>
+                            </w:r>
+                            <w:proofErr w:type="gramStart"/>
+                            <w:r>
+                              <w:rPr>
+                                <w:rFonts w:ascii="Consolas" w:eastAsia="Times New Roman" w:hAnsi="Consolas" w:cs="Times New Roman"/>
+                                <w:color w:val="D2A8FF"/>
+                                <w:kern w:val="0"/>
+                                <w:sz w:val="16"/>
+                                <w:szCs w:val="16"/>
+                                <w14:ligatures w14:val="none"/>
+                              </w:rPr>
+                              <w:t>rdd</w:t>
                             </w:r>
                             <w:proofErr w:type="spellEnd"/>
                             <w:r>
@@ -5763,6 +6705,7 @@
                               </w:rPr>
                               <w:t>(</w:t>
                             </w:r>
+                            <w:proofErr w:type="gramEnd"/>
                           </w:p>
                           <w:p>
                             <w:pPr>
@@ -5833,6 +6776,7 @@
                               <w:t xml:space="preserve">, </w:t>
                             </w:r>
                             <w:proofErr w:type="spellStart"/>
+                            <w:proofErr w:type="gramStart"/>
                             <w:r>
                               <w:rPr>
                                 <w:rFonts w:ascii="Consolas" w:eastAsia="Times New Roman" w:hAnsi="Consolas" w:cs="Times New Roman"/>
@@ -5853,7 +6797,19 @@
                                 <w:szCs w:val="16"/>
                                 <w14:ligatures w14:val="none"/>
                               </w:rPr>
-                              <w:t>.dataset_a_path</w:t>
+                              <w:t>.dataset</w:t>
+                            </w:r>
+                            <w:proofErr w:type="gramEnd"/>
+                            <w:r>
+                              <w:rPr>
+                                <w:rFonts w:ascii="Consolas" w:eastAsia="Times New Roman" w:hAnsi="Consolas" w:cs="Times New Roman"/>
+                                <w:color w:val="E6EDF3"/>
+                                <w:kern w:val="0"/>
+                                <w:sz w:val="16"/>
+                                <w:szCs w:val="16"/>
+                                <w14:ligatures w14:val="none"/>
+                              </w:rPr>
+                              <w:t>_a_path</w:t>
                             </w:r>
                             <w:proofErr w:type="spellEnd"/>
                             <w:r>
@@ -5905,7 +6861,19 @@
                                 <w:szCs w:val="16"/>
                                 <w14:ligatures w14:val="none"/>
                               </w:rPr>
-                              <w:t>RDDIOFactory.write_rdd</w:t>
+                              <w:t>RDDIOFactory.write_</w:t>
+                            </w:r>
+                            <w:proofErr w:type="gramStart"/>
+                            <w:r>
+                              <w:rPr>
+                                <w:rFonts w:ascii="Consolas" w:eastAsia="Times New Roman" w:hAnsi="Consolas" w:cs="Times New Roman"/>
+                                <w:color w:val="E6EDF3"/>
+                                <w:kern w:val="0"/>
+                                <w:sz w:val="16"/>
+                                <w:szCs w:val="16"/>
+                                <w14:ligatures w14:val="none"/>
+                              </w:rPr>
+                              <w:t>rdd</w:t>
                             </w:r>
                             <w:proofErr w:type="spellEnd"/>
                             <w:r>
@@ -5919,6 +6887,7 @@
                               </w:rPr>
                               <w:t>(</w:t>
                             </w:r>
+                            <w:proofErr w:type="gramEnd"/>
                           </w:p>
                           <w:p>
                             <w:pPr>
@@ -6044,6 +7013,7 @@
                               <w:t xml:space="preserve">        </w:t>
                             </w:r>
                             <w:proofErr w:type="spellStart"/>
+                            <w:proofErr w:type="gramStart"/>
                             <w:r>
                               <w:rPr>
                                 <w:rFonts w:ascii="Consolas" w:eastAsia="Times New Roman" w:hAnsi="Consolas" w:cs="Times New Roman"/>
@@ -6053,7 +7023,19 @@
                                 <w:szCs w:val="16"/>
                                 <w14:ligatures w14:val="none"/>
                               </w:rPr>
-                              <w:t>config.output_path</w:t>
+                              <w:t>config.output</w:t>
+                            </w:r>
+                            <w:proofErr w:type="gramEnd"/>
+                            <w:r>
+                              <w:rPr>
+                                <w:rFonts w:ascii="Consolas" w:eastAsia="Times New Roman" w:hAnsi="Consolas" w:cs="Times New Roman"/>
+                                <w:color w:val="E6EDF3"/>
+                                <w:kern w:val="0"/>
+                                <w:sz w:val="16"/>
+                                <w:szCs w:val="16"/>
+                                <w14:ligatures w14:val="none"/>
+                              </w:rPr>
+                              <w:t>_path</w:t>
                             </w:r>
                             <w:proofErr w:type="spellEnd"/>
                             <w:r>
@@ -6237,7 +7219,31 @@
                           <w:szCs w:val="16"/>
                           <w14:ligatures w14:val="none"/>
                         </w:rPr>
-                        <w:t xml:space="preserve"># read the parquet file using </w:t>
+                        <w:t xml:space="preserve"># </w:t>
+                      </w:r>
+                      <w:proofErr w:type="gramStart"/>
+                      <w:r>
+                        <w:rPr>
+                          <w:rFonts w:ascii="Consolas" w:eastAsia="Times New Roman" w:hAnsi="Consolas" w:cs="Times New Roman"/>
+                          <w:color w:val="E6EDF3"/>
+                          <w:kern w:val="0"/>
+                          <w:sz w:val="16"/>
+                          <w:szCs w:val="16"/>
+                          <w14:ligatures w14:val="none"/>
+                        </w:rPr>
+                        <w:t>read</w:t>
+                      </w:r>
+                      <w:proofErr w:type="gramEnd"/>
+                      <w:r>
+                        <w:rPr>
+                          <w:rFonts w:ascii="Consolas" w:eastAsia="Times New Roman" w:hAnsi="Consolas" w:cs="Times New Roman"/>
+                          <w:color w:val="E6EDF3"/>
+                          <w:kern w:val="0"/>
+                          <w:sz w:val="16"/>
+                          <w:szCs w:val="16"/>
+                          <w14:ligatures w14:val="none"/>
+                        </w:rPr>
+                        <w:t xml:space="preserve"> the parquet file using </w:t>
                       </w:r>
                       <w:proofErr w:type="spellStart"/>
                       <w:r>
@@ -6261,18 +7267,7 @@
                           <w:szCs w:val="16"/>
                           <w14:ligatures w14:val="none"/>
                         </w:rPr>
-                        <w:t xml:space="preserve"> </w:t>
-                      </w:r>
-                      <w:r>
-                        <w:rPr>
-                          <w:rFonts w:ascii="Consolas" w:eastAsia="Times New Roman" w:hAnsi="Consolas" w:cs="Times New Roman"/>
-                          <w:color w:val="E6EDF3"/>
-                          <w:kern w:val="0"/>
-                          <w:sz w:val="16"/>
-                          <w:szCs w:val="16"/>
-                          <w14:ligatures w14:val="none"/>
-                        </w:rPr>
-                        <w:t xml:space="preserve">factory     </w:t>
+                        <w:t xml:space="preserve"> factory     </w:t>
                       </w:r>
                     </w:p>
                     <w:p>
@@ -6366,7 +7361,19 @@
                           <w:szCs w:val="16"/>
                           <w14:ligatures w14:val="none"/>
                         </w:rPr>
-                        <w:t>read_rdd</w:t>
+                        <w:t>read_</w:t>
+                      </w:r>
+                      <w:proofErr w:type="gramStart"/>
+                      <w:r>
+                        <w:rPr>
+                          <w:rFonts w:ascii="Consolas" w:eastAsia="Times New Roman" w:hAnsi="Consolas" w:cs="Times New Roman"/>
+                          <w:color w:val="D2A8FF"/>
+                          <w:kern w:val="0"/>
+                          <w:sz w:val="16"/>
+                          <w:szCs w:val="16"/>
+                          <w14:ligatures w14:val="none"/>
+                        </w:rPr>
+                        <w:t>rdd</w:t>
                       </w:r>
                       <w:proofErr w:type="spellEnd"/>
                       <w:r>
@@ -6380,6 +7387,7 @@
                         </w:rPr>
                         <w:t>(</w:t>
                       </w:r>
+                      <w:proofErr w:type="gramEnd"/>
                     </w:p>
                     <w:p>
                       <w:pPr>
@@ -6450,6 +7458,7 @@
                         <w:t xml:space="preserve">, </w:t>
                       </w:r>
                       <w:proofErr w:type="spellStart"/>
+                      <w:proofErr w:type="gramStart"/>
                       <w:r>
                         <w:rPr>
                           <w:rFonts w:ascii="Consolas" w:eastAsia="Times New Roman" w:hAnsi="Consolas" w:cs="Times New Roman"/>
@@ -6470,7 +7479,19 @@
                           <w:szCs w:val="16"/>
                           <w14:ligatures w14:val="none"/>
                         </w:rPr>
-                        <w:t>.dataset_a_path</w:t>
+                        <w:t>.dataset</w:t>
+                      </w:r>
+                      <w:proofErr w:type="gramEnd"/>
+                      <w:r>
+                        <w:rPr>
+                          <w:rFonts w:ascii="Consolas" w:eastAsia="Times New Roman" w:hAnsi="Consolas" w:cs="Times New Roman"/>
+                          <w:color w:val="E6EDF3"/>
+                          <w:kern w:val="0"/>
+                          <w:sz w:val="16"/>
+                          <w:szCs w:val="16"/>
+                          <w14:ligatures w14:val="none"/>
+                        </w:rPr>
+                        <w:t>_a_path</w:t>
                       </w:r>
                       <w:proofErr w:type="spellEnd"/>
                       <w:r>
@@ -6522,7 +7543,19 @@
                           <w:szCs w:val="16"/>
                           <w14:ligatures w14:val="none"/>
                         </w:rPr>
-                        <w:t>RDDIOFactory.write_rdd</w:t>
+                        <w:t>RDDIOFactory.write_</w:t>
+                      </w:r>
+                      <w:proofErr w:type="gramStart"/>
+                      <w:r>
+                        <w:rPr>
+                          <w:rFonts w:ascii="Consolas" w:eastAsia="Times New Roman" w:hAnsi="Consolas" w:cs="Times New Roman"/>
+                          <w:color w:val="E6EDF3"/>
+                          <w:kern w:val="0"/>
+                          <w:sz w:val="16"/>
+                          <w:szCs w:val="16"/>
+                          <w14:ligatures w14:val="none"/>
+                        </w:rPr>
+                        <w:t>rdd</w:t>
                       </w:r>
                       <w:proofErr w:type="spellEnd"/>
                       <w:r>
@@ -6536,6 +7569,7 @@
                         </w:rPr>
                         <w:t>(</w:t>
                       </w:r>
+                      <w:proofErr w:type="gramEnd"/>
                     </w:p>
                     <w:p>
                       <w:pPr>
@@ -6661,6 +7695,7 @@
                         <w:t xml:space="preserve">        </w:t>
                       </w:r>
                       <w:proofErr w:type="spellStart"/>
+                      <w:proofErr w:type="gramStart"/>
                       <w:r>
                         <w:rPr>
                           <w:rFonts w:ascii="Consolas" w:eastAsia="Times New Roman" w:hAnsi="Consolas" w:cs="Times New Roman"/>
@@ -6670,7 +7705,19 @@
                           <w:szCs w:val="16"/>
                           <w14:ligatures w14:val="none"/>
                         </w:rPr>
-                        <w:t>config.output_path</w:t>
+                        <w:t>config.output</w:t>
+                      </w:r>
+                      <w:proofErr w:type="gramEnd"/>
+                      <w:r>
+                        <w:rPr>
+                          <w:rFonts w:ascii="Consolas" w:eastAsia="Times New Roman" w:hAnsi="Consolas" w:cs="Times New Roman"/>
+                          <w:color w:val="E6EDF3"/>
+                          <w:kern w:val="0"/>
+                          <w:sz w:val="16"/>
+                          <w:szCs w:val="16"/>
+                          <w14:ligatures w14:val="none"/>
+                        </w:rPr>
+                        <w:t>_path</w:t>
                       </w:r>
                       <w:proofErr w:type="spellEnd"/>
                       <w:r>
@@ -6869,11 +7916,6 @@
     </w:p>
     <w:p>
       <w:pPr>
-        <w:pStyle w:val="Heading3"/>
-      </w:pPr>
-    </w:p>
-    <w:p>
-      <w:pPr>
         <w:rPr>
           <w:rFonts w:eastAsiaTheme="majorEastAsia" w:cstheme="majorBidi"/>
           <w:color w:val="2F5496" w:themeColor="accent1" w:themeShade="BF"/>
@@ -6881,17 +7923,13 @@
           <w:szCs w:val="28"/>
         </w:rPr>
       </w:pPr>
-      <w:r>
-        <w:br w:type="page"/>
-      </w:r>
     </w:p>
     <w:p>
       <w:pPr>
         <w:pStyle w:val="Heading3"/>
       </w:pPr>
-      <w:bookmarkStart w:id="9" w:name="_Toc227880632"/>
-      <w:r>
-        <w:lastRenderedPageBreak/>
+      <w:bookmarkStart w:id="9" w:name="_Toc227907261"/>
+      <w:r>
         <w:t xml:space="preserve">2.3.2 </w:t>
       </w:r>
       <w:r>
@@ -7083,6 +8121,7 @@
         <w:t xml:space="preserve">class </w:t>
       </w:r>
       <w:proofErr w:type="spellStart"/>
+      <w:proofErr w:type="gramStart"/>
       <w:r>
         <w:rPr>
           <w:rFonts w:ascii="Consolas" w:eastAsia="Times New Roman" w:hAnsi="Consolas" w:cs="Times New Roman"/>
@@ -7104,7 +8143,19 @@
           <w:szCs w:val="16"/>
           <w14:ligatures w14:val="none"/>
         </w:rPr>
-        <w:t>(ABC):</w:t>
+        <w:t>(</w:t>
+      </w:r>
+      <w:proofErr w:type="gramEnd"/>
+      <w:r>
+        <w:rPr>
+          <w:rFonts w:ascii="Consolas" w:eastAsia="Times New Roman" w:hAnsi="Consolas" w:cs="Times New Roman"/>
+          <w:color w:val="E6EDF3"/>
+          <w:kern w:val="0"/>
+          <w:sz w:val="16"/>
+          <w:szCs w:val="16"/>
+          <w14:ligatures w14:val="none"/>
+        </w:rPr>
+        <w:t>ABC):</w:t>
       </w:r>
     </w:p>
     <w:p>
@@ -7286,7 +8337,31 @@
           <w:szCs w:val="16"/>
           <w14:ligatures w14:val="none"/>
         </w:rPr>
-        <w:t xml:space="preserve">    def execute(self, </w:t>
+        <w:t xml:space="preserve">    def </w:t>
+      </w:r>
+      <w:proofErr w:type="gramStart"/>
+      <w:r>
+        <w:rPr>
+          <w:rFonts w:ascii="Consolas" w:eastAsia="Times New Roman" w:hAnsi="Consolas" w:cs="Times New Roman"/>
+          <w:color w:val="E6EDF3"/>
+          <w:kern w:val="0"/>
+          <w:sz w:val="16"/>
+          <w:szCs w:val="16"/>
+          <w14:ligatures w14:val="none"/>
+        </w:rPr>
+        <w:t>execute(</w:t>
+      </w:r>
+      <w:proofErr w:type="gramEnd"/>
+      <w:r>
+        <w:rPr>
+          <w:rFonts w:ascii="Consolas" w:eastAsia="Times New Roman" w:hAnsi="Consolas" w:cs="Times New Roman"/>
+          <w:color w:val="E6EDF3"/>
+          <w:kern w:val="0"/>
+          <w:sz w:val="16"/>
+          <w:szCs w:val="16"/>
+          <w14:ligatures w14:val="none"/>
+        </w:rPr>
+        <w:t xml:space="preserve">self, </w:t>
       </w:r>
       <w:proofErr w:type="spellStart"/>
       <w:r>
@@ -7419,6 +8494,7 @@
         <w:t xml:space="preserve">class </w:t>
       </w:r>
       <w:proofErr w:type="spellStart"/>
+      <w:proofErr w:type="gramStart"/>
       <w:r>
         <w:rPr>
           <w:rFonts w:ascii="Consolas" w:eastAsia="Times New Roman" w:hAnsi="Consolas" w:cs="Times New Roman"/>
@@ -7443,6 +8519,7 @@
         <w:t>(</w:t>
       </w:r>
       <w:proofErr w:type="spellStart"/>
+      <w:proofErr w:type="gramEnd"/>
       <w:r>
         <w:rPr>
           <w:rFonts w:ascii="Consolas" w:eastAsia="Times New Roman" w:hAnsi="Consolas" w:cs="Times New Roman"/>
@@ -7490,6 +8567,7 @@
           <w:szCs w:val="16"/>
           <w14:ligatures w14:val="none"/>
         </w:rPr>
+        <w:lastRenderedPageBreak/>
         <w:t>    """Deduplicate rows by a specified key index.</w:t>
       </w:r>
     </w:p>
@@ -7837,7 +8915,31 @@
           <w:szCs w:val="16"/>
           <w14:ligatures w14:val="none"/>
         </w:rPr>
-        <w:t xml:space="preserve">__(self, </w:t>
+        <w:t>_</w:t>
+      </w:r>
+      <w:proofErr w:type="gramStart"/>
+      <w:r>
+        <w:rPr>
+          <w:rFonts w:ascii="Consolas" w:eastAsia="Times New Roman" w:hAnsi="Consolas" w:cs="Times New Roman"/>
+          <w:color w:val="E6EDF3"/>
+          <w:kern w:val="0"/>
+          <w:sz w:val="16"/>
+          <w:szCs w:val="16"/>
+          <w14:ligatures w14:val="none"/>
+        </w:rPr>
+        <w:t>_(</w:t>
+      </w:r>
+      <w:proofErr w:type="gramEnd"/>
+      <w:r>
+        <w:rPr>
+          <w:rFonts w:ascii="Consolas" w:eastAsia="Times New Roman" w:hAnsi="Consolas" w:cs="Times New Roman"/>
+          <w:color w:val="E6EDF3"/>
+          <w:kern w:val="0"/>
+          <w:sz w:val="16"/>
+          <w:szCs w:val="16"/>
+          <w14:ligatures w14:val="none"/>
+        </w:rPr>
+        <w:t xml:space="preserve">self, </w:t>
       </w:r>
       <w:proofErr w:type="spellStart"/>
       <w:r>
@@ -7887,9 +8989,22 @@
           <w:szCs w:val="16"/>
           <w14:ligatures w14:val="none"/>
         </w:rPr>
-        <w:t>        self._</w:t>
+        <w:t xml:space="preserve">        </w:t>
+      </w:r>
+      <w:proofErr w:type="gramStart"/>
+      <w:r>
+        <w:rPr>
+          <w:rFonts w:ascii="Consolas" w:eastAsia="Times New Roman" w:hAnsi="Consolas" w:cs="Times New Roman"/>
+          <w:color w:val="E6EDF3"/>
+          <w:kern w:val="0"/>
+          <w:sz w:val="16"/>
+          <w:szCs w:val="16"/>
+          <w14:ligatures w14:val="none"/>
+        </w:rPr>
+        <w:t>self._</w:t>
       </w:r>
       <w:proofErr w:type="spellStart"/>
+      <w:proofErr w:type="gramEnd"/>
       <w:r>
         <w:rPr>
           <w:rFonts w:ascii="Consolas" w:eastAsia="Times New Roman" w:hAnsi="Consolas" w:cs="Times New Roman"/>
@@ -7965,7 +9080,31 @@
           <w:szCs w:val="16"/>
           <w14:ligatures w14:val="none"/>
         </w:rPr>
-        <w:t xml:space="preserve">    def execute(self, </w:t>
+        <w:t xml:space="preserve">    def </w:t>
+      </w:r>
+      <w:proofErr w:type="gramStart"/>
+      <w:r>
+        <w:rPr>
+          <w:rFonts w:ascii="Consolas" w:eastAsia="Times New Roman" w:hAnsi="Consolas" w:cs="Times New Roman"/>
+          <w:color w:val="E6EDF3"/>
+          <w:kern w:val="0"/>
+          <w:sz w:val="16"/>
+          <w:szCs w:val="16"/>
+          <w14:ligatures w14:val="none"/>
+        </w:rPr>
+        <w:t>execute(</w:t>
+      </w:r>
+      <w:proofErr w:type="gramEnd"/>
+      <w:r>
+        <w:rPr>
+          <w:rFonts w:ascii="Consolas" w:eastAsia="Times New Roman" w:hAnsi="Consolas" w:cs="Times New Roman"/>
+          <w:color w:val="E6EDF3"/>
+          <w:kern w:val="0"/>
+          <w:sz w:val="16"/>
+          <w:szCs w:val="16"/>
+          <w14:ligatures w14:val="none"/>
+        </w:rPr>
+        <w:t xml:space="preserve">self, </w:t>
       </w:r>
       <w:proofErr w:type="spellStart"/>
       <w:r>
@@ -8106,7 +9245,31 @@
           <w:szCs w:val="16"/>
           <w14:ligatures w14:val="none"/>
         </w:rPr>
-        <w:t>            .map(tuple)</w:t>
+        <w:t xml:space="preserve">            </w:t>
+      </w:r>
+      <w:proofErr w:type="gramStart"/>
+      <w:r>
+        <w:rPr>
+          <w:rFonts w:ascii="Consolas" w:eastAsia="Times New Roman" w:hAnsi="Consolas" w:cs="Times New Roman"/>
+          <w:color w:val="E6EDF3"/>
+          <w:kern w:val="0"/>
+          <w:sz w:val="16"/>
+          <w:szCs w:val="16"/>
+          <w14:ligatures w14:val="none"/>
+        </w:rPr>
+        <w:t>.map</w:t>
+      </w:r>
+      <w:proofErr w:type="gramEnd"/>
+      <w:r>
+        <w:rPr>
+          <w:rFonts w:ascii="Consolas" w:eastAsia="Times New Roman" w:hAnsi="Consolas" w:cs="Times New Roman"/>
+          <w:color w:val="E6EDF3"/>
+          <w:kern w:val="0"/>
+          <w:sz w:val="16"/>
+          <w:szCs w:val="16"/>
+          <w14:ligatures w14:val="none"/>
+        </w:rPr>
+        <w:t>(tuple)</w:t>
       </w:r>
     </w:p>
     <w:p>
@@ -8132,9 +9295,46 @@
           <w:szCs w:val="16"/>
           <w14:ligatures w14:val="none"/>
         </w:rPr>
-        <w:t>            .map(lambda row: (row[self._</w:t>
+        <w:t xml:space="preserve">            </w:t>
+      </w:r>
+      <w:proofErr w:type="gramStart"/>
+      <w:r>
+        <w:rPr>
+          <w:rFonts w:ascii="Consolas" w:eastAsia="Times New Roman" w:hAnsi="Consolas" w:cs="Times New Roman"/>
+          <w:color w:val="E6EDF3"/>
+          <w:kern w:val="0"/>
+          <w:sz w:val="16"/>
+          <w:szCs w:val="16"/>
+          <w14:ligatures w14:val="none"/>
+        </w:rPr>
+        <w:t>.map</w:t>
+      </w:r>
+      <w:proofErr w:type="gramEnd"/>
+      <w:r>
+        <w:rPr>
+          <w:rFonts w:ascii="Consolas" w:eastAsia="Times New Roman" w:hAnsi="Consolas" w:cs="Times New Roman"/>
+          <w:color w:val="E6EDF3"/>
+          <w:kern w:val="0"/>
+          <w:sz w:val="16"/>
+          <w:szCs w:val="16"/>
+          <w14:ligatures w14:val="none"/>
+        </w:rPr>
+        <w:t>(lambda row: (row[</w:t>
+      </w:r>
+      <w:proofErr w:type="gramStart"/>
+      <w:r>
+        <w:rPr>
+          <w:rFonts w:ascii="Consolas" w:eastAsia="Times New Roman" w:hAnsi="Consolas" w:cs="Times New Roman"/>
+          <w:color w:val="E6EDF3"/>
+          <w:kern w:val="0"/>
+          <w:sz w:val="16"/>
+          <w:szCs w:val="16"/>
+          <w14:ligatures w14:val="none"/>
+        </w:rPr>
+        <w:t>self._</w:t>
       </w:r>
       <w:proofErr w:type="spellStart"/>
+      <w:proofErr w:type="gramEnd"/>
       <w:r>
         <w:rPr>
           <w:rFonts w:ascii="Consolas" w:eastAsia="Times New Roman" w:hAnsi="Consolas" w:cs="Times New Roman"/>
@@ -8182,7 +9382,19 @@
           <w:szCs w:val="16"/>
           <w14:ligatures w14:val="none"/>
         </w:rPr>
-        <w:t>            .</w:t>
+        <w:t xml:space="preserve">            </w:t>
+      </w:r>
+      <w:proofErr w:type="gramStart"/>
+      <w:r>
+        <w:rPr>
+          <w:rFonts w:ascii="Consolas" w:eastAsia="Times New Roman" w:hAnsi="Consolas" w:cs="Times New Roman"/>
+          <w:color w:val="E6EDF3"/>
+          <w:kern w:val="0"/>
+          <w:sz w:val="16"/>
+          <w:szCs w:val="16"/>
+          <w14:ligatures w14:val="none"/>
+        </w:rPr>
+        <w:t>.</w:t>
       </w:r>
       <w:proofErr w:type="spellStart"/>
       <w:r>
@@ -8197,6 +9409,7 @@
         <w:t>reduceByKey</w:t>
       </w:r>
       <w:proofErr w:type="spellEnd"/>
+      <w:proofErr w:type="gramEnd"/>
       <w:r>
         <w:rPr>
           <w:rFonts w:ascii="Consolas" w:eastAsia="Times New Roman" w:hAnsi="Consolas" w:cs="Times New Roman"/>
@@ -8232,7 +9445,31 @@
           <w:szCs w:val="16"/>
           <w14:ligatures w14:val="none"/>
         </w:rPr>
-        <w:t xml:space="preserve">            .map(lambda </w:t>
+        <w:t xml:space="preserve">            </w:t>
+      </w:r>
+      <w:proofErr w:type="gramStart"/>
+      <w:r>
+        <w:rPr>
+          <w:rFonts w:ascii="Consolas" w:eastAsia="Times New Roman" w:hAnsi="Consolas" w:cs="Times New Roman"/>
+          <w:color w:val="E6EDF3"/>
+          <w:kern w:val="0"/>
+          <w:sz w:val="16"/>
+          <w:szCs w:val="16"/>
+          <w14:ligatures w14:val="none"/>
+        </w:rPr>
+        <w:t>.map</w:t>
+      </w:r>
+      <w:proofErr w:type="gramEnd"/>
+      <w:r>
+        <w:rPr>
+          <w:rFonts w:ascii="Consolas" w:eastAsia="Times New Roman" w:hAnsi="Consolas" w:cs="Times New Roman"/>
+          <w:color w:val="E6EDF3"/>
+          <w:kern w:val="0"/>
+          <w:sz w:val="16"/>
+          <w:szCs w:val="16"/>
+          <w14:ligatures w14:val="none"/>
+        </w:rPr>
+        <w:t xml:space="preserve">(lambda </w:t>
       </w:r>
       <w:proofErr w:type="spellStart"/>
       <w:r>
@@ -8259,6 +9496,7 @@
         <w:t xml:space="preserve">: </w:t>
       </w:r>
       <w:proofErr w:type="spellStart"/>
+      <w:proofErr w:type="gramStart"/>
       <w:r>
         <w:rPr>
           <w:rFonts w:ascii="Consolas" w:eastAsia="Times New Roman" w:hAnsi="Consolas" w:cs="Times New Roman"/>
@@ -8280,7 +9518,19 @@
           <w:szCs w:val="16"/>
           <w14:ligatures w14:val="none"/>
         </w:rPr>
-        <w:t>[1])</w:t>
+        <w:t>[</w:t>
+      </w:r>
+      <w:proofErr w:type="gramEnd"/>
+      <w:r>
+        <w:rPr>
+          <w:rFonts w:ascii="Consolas" w:eastAsia="Times New Roman" w:hAnsi="Consolas" w:cs="Times New Roman"/>
+          <w:color w:val="E6EDF3"/>
+          <w:kern w:val="0"/>
+          <w:sz w:val="16"/>
+          <w:szCs w:val="16"/>
+          <w14:ligatures w14:val="none"/>
+        </w:rPr>
+        <w:t>1])</w:t>
       </w:r>
     </w:p>
     <w:p>
@@ -8329,9 +9579,8 @@
       <w:pPr>
         <w:pStyle w:val="Heading3"/>
       </w:pPr>
-      <w:bookmarkStart w:id="10" w:name="_Toc227880633"/>
-      <w:r>
-        <w:lastRenderedPageBreak/>
+      <w:bookmarkStart w:id="10" w:name="_Toc227907262"/>
+      <w:r>
         <w:t xml:space="preserve">2.3.3 </w:t>
       </w:r>
       <w:r>
@@ -8530,7 +9779,31 @@
           <w:szCs w:val="16"/>
           <w14:ligatures w14:val="none"/>
         </w:rPr>
-        <w:t># configure the transformation pipeline</w:t>
+        <w:t xml:space="preserve"># </w:t>
+      </w:r>
+      <w:proofErr w:type="gramStart"/>
+      <w:r>
+        <w:rPr>
+          <w:rFonts w:ascii="Consolas" w:eastAsia="Times New Roman" w:hAnsi="Consolas" w:cs="Times New Roman"/>
+          <w:color w:val="8B949E"/>
+          <w:kern w:val="0"/>
+          <w:sz w:val="16"/>
+          <w:szCs w:val="16"/>
+          <w14:ligatures w14:val="none"/>
+        </w:rPr>
+        <w:t>configure</w:t>
+      </w:r>
+      <w:proofErr w:type="gramEnd"/>
+      <w:r>
+        <w:rPr>
+          <w:rFonts w:ascii="Consolas" w:eastAsia="Times New Roman" w:hAnsi="Consolas" w:cs="Times New Roman"/>
+          <w:color w:val="8B949E"/>
+          <w:kern w:val="0"/>
+          <w:sz w:val="16"/>
+          <w:szCs w:val="16"/>
+          <w14:ligatures w14:val="none"/>
+        </w:rPr>
+        <w:t xml:space="preserve"> the transformation pipeline</w:t>
       </w:r>
     </w:p>
     <w:p>
@@ -8581,6 +9854,7 @@
         <w:t xml:space="preserve"> </w:t>
       </w:r>
       <w:proofErr w:type="spellStart"/>
+      <w:proofErr w:type="gramStart"/>
       <w:r>
         <w:rPr>
           <w:rFonts w:ascii="Consolas" w:eastAsia="Times New Roman" w:hAnsi="Consolas" w:cs="Times New Roman"/>
@@ -8602,7 +9876,19 @@
           <w:szCs w:val="16"/>
           <w14:ligatures w14:val="none"/>
         </w:rPr>
-        <w:t>([</w:t>
+        <w:t>(</w:t>
+      </w:r>
+      <w:proofErr w:type="gramEnd"/>
+      <w:r>
+        <w:rPr>
+          <w:rFonts w:ascii="Consolas" w:eastAsia="Times New Roman" w:hAnsi="Consolas" w:cs="Times New Roman"/>
+          <w:color w:val="E6EDF3"/>
+          <w:kern w:val="0"/>
+          <w:sz w:val="16"/>
+          <w:szCs w:val="16"/>
+          <w14:ligatures w14:val="none"/>
+        </w:rPr>
+        <w:t>[</w:t>
       </w:r>
     </w:p>
     <w:p>
@@ -8729,6 +10015,7 @@
         <w:t xml:space="preserve">        </w:t>
       </w:r>
       <w:proofErr w:type="spellStart"/>
+      <w:proofErr w:type="gramStart"/>
       <w:r>
         <w:rPr>
           <w:rFonts w:ascii="Consolas" w:eastAsia="Times New Roman" w:hAnsi="Consolas" w:cs="Times New Roman"/>
@@ -8753,6 +10040,7 @@
         <w:t>(</w:t>
       </w:r>
       <w:proofErr w:type="spellStart"/>
+      <w:proofErr w:type="gramEnd"/>
       <w:r>
         <w:rPr>
           <w:rFonts w:ascii="Consolas" w:eastAsia="Times New Roman" w:hAnsi="Consolas" w:cs="Times New Roman"/>
@@ -8765,6 +10053,7 @@
         <w:t>key_indices</w:t>
       </w:r>
       <w:proofErr w:type="spellEnd"/>
+      <w:proofErr w:type="gramStart"/>
       <w:r>
         <w:rPr>
           <w:rFonts w:ascii="Consolas" w:eastAsia="Times New Roman" w:hAnsi="Consolas" w:cs="Times New Roman"/>
@@ -8788,6 +10077,7 @@
         <w:t>(</w:t>
       </w:r>
       <w:proofErr w:type="spellStart"/>
+      <w:proofErr w:type="gramEnd"/>
       <w:r>
         <w:rPr>
           <w:rFonts w:ascii="Consolas" w:eastAsia="Times New Roman" w:hAnsi="Consolas" w:cs="Times New Roman"/>
@@ -8971,6 +10261,7 @@
         <w:t xml:space="preserve">        </w:t>
       </w:r>
       <w:proofErr w:type="spellStart"/>
+      <w:proofErr w:type="gramStart"/>
       <w:r>
         <w:rPr>
           <w:rFonts w:ascii="Consolas" w:eastAsia="Times New Roman" w:hAnsi="Consolas" w:cs="Times New Roman"/>
@@ -8994,6 +10285,7 @@
         </w:rPr>
         <w:t>(</w:t>
       </w:r>
+      <w:proofErr w:type="gramEnd"/>
     </w:p>
     <w:p>
       <w:pPr>
@@ -9229,6 +10521,7 @@
           <w:szCs w:val="16"/>
           <w14:ligatures w14:val="none"/>
         </w:rPr>
+        <w:lastRenderedPageBreak/>
         <w:t>        ),</w:t>
       </w:r>
     </w:p>
@@ -9292,7 +10585,31 @@
           <w:szCs w:val="16"/>
           <w14:ligatures w14:val="none"/>
         </w:rPr>
-        <w:t># run the transformation pipeline</w:t>
+        <w:t xml:space="preserve"># </w:t>
+      </w:r>
+      <w:proofErr w:type="gramStart"/>
+      <w:r>
+        <w:rPr>
+          <w:rFonts w:ascii="Consolas" w:eastAsia="Times New Roman" w:hAnsi="Consolas" w:cs="Times New Roman"/>
+          <w:color w:val="8B949E"/>
+          <w:kern w:val="0"/>
+          <w:sz w:val="16"/>
+          <w:szCs w:val="16"/>
+          <w14:ligatures w14:val="none"/>
+        </w:rPr>
+        <w:t>run</w:t>
+      </w:r>
+      <w:proofErr w:type="gramEnd"/>
+      <w:r>
+        <w:rPr>
+          <w:rFonts w:ascii="Consolas" w:eastAsia="Times New Roman" w:hAnsi="Consolas" w:cs="Times New Roman"/>
+          <w:color w:val="8B949E"/>
+          <w:kern w:val="0"/>
+          <w:sz w:val="16"/>
+          <w:szCs w:val="16"/>
+          <w14:ligatures w14:val="none"/>
+        </w:rPr>
+        <w:t xml:space="preserve"> the transformation pipeline</w:t>
       </w:r>
     </w:p>
     <w:p>
@@ -9707,7 +11024,31 @@
           <w:szCs w:val="16"/>
           <w14:ligatures w14:val="none"/>
         </w:rPr>
-        <w:t>__(self, transforms: list):</w:t>
+        <w:t>_</w:t>
+      </w:r>
+      <w:proofErr w:type="gramStart"/>
+      <w:r>
+        <w:rPr>
+          <w:rFonts w:ascii="Consolas" w:eastAsia="Times New Roman" w:hAnsi="Consolas" w:cs="Times New Roman"/>
+          <w:color w:val="E6EDF3"/>
+          <w:kern w:val="0"/>
+          <w:sz w:val="16"/>
+          <w:szCs w:val="16"/>
+          <w14:ligatures w14:val="none"/>
+        </w:rPr>
+        <w:t>_(</w:t>
+      </w:r>
+      <w:proofErr w:type="gramEnd"/>
+      <w:r>
+        <w:rPr>
+          <w:rFonts w:ascii="Consolas" w:eastAsia="Times New Roman" w:hAnsi="Consolas" w:cs="Times New Roman"/>
+          <w:color w:val="E6EDF3"/>
+          <w:kern w:val="0"/>
+          <w:sz w:val="16"/>
+          <w:szCs w:val="16"/>
+          <w14:ligatures w14:val="none"/>
+        </w:rPr>
+        <w:t>self, transforms: list):</w:t>
       </w:r>
     </w:p>
     <w:p>
@@ -9762,6 +11103,7 @@
         <w:t xml:space="preserve">            if not </w:t>
       </w:r>
       <w:proofErr w:type="spellStart"/>
+      <w:proofErr w:type="gramStart"/>
       <w:r>
         <w:rPr>
           <w:rFonts w:ascii="Consolas" w:eastAsia="Times New Roman" w:hAnsi="Consolas" w:cs="Times New Roman"/>
@@ -9783,7 +11125,19 @@
           <w:szCs w:val="16"/>
           <w14:ligatures w14:val="none"/>
         </w:rPr>
-        <w:t xml:space="preserve">(t, </w:t>
+        <w:t>(</w:t>
+      </w:r>
+      <w:proofErr w:type="gramEnd"/>
+      <w:r>
+        <w:rPr>
+          <w:rFonts w:ascii="Consolas" w:eastAsia="Times New Roman" w:hAnsi="Consolas" w:cs="Times New Roman"/>
+          <w:color w:val="E6EDF3"/>
+          <w:kern w:val="0"/>
+          <w:sz w:val="16"/>
+          <w:szCs w:val="16"/>
+          <w14:ligatures w14:val="none"/>
+        </w:rPr>
+        <w:t xml:space="preserve">t, </w:t>
       </w:r>
       <w:proofErr w:type="spellStart"/>
       <w:r>
@@ -9836,6 +11190,7 @@
         <w:t xml:space="preserve">                raise </w:t>
       </w:r>
       <w:proofErr w:type="spellStart"/>
+      <w:proofErr w:type="gramStart"/>
       <w:r>
         <w:rPr>
           <w:rFonts w:ascii="Consolas" w:eastAsia="Times New Roman" w:hAnsi="Consolas" w:cs="Times New Roman"/>
@@ -9859,6 +11214,7 @@
         </w:rPr>
         <w:t>(</w:t>
       </w:r>
+      <w:proofErr w:type="gramEnd"/>
     </w:p>
     <w:p>
       <w:pPr>
@@ -9931,7 +11287,31 @@
           <w:szCs w:val="16"/>
           <w14:ligatures w14:val="none"/>
         </w:rPr>
-        <w:t>, got {type(t).__name__}"</w:t>
+        <w:t>, got {type(t</w:t>
+      </w:r>
+      <w:proofErr w:type="gramStart"/>
+      <w:r>
+        <w:rPr>
+          <w:rFonts w:ascii="Consolas" w:eastAsia="Times New Roman" w:hAnsi="Consolas" w:cs="Times New Roman"/>
+          <w:color w:val="E6EDF3"/>
+          <w:kern w:val="0"/>
+          <w:sz w:val="16"/>
+          <w:szCs w:val="16"/>
+          <w14:ligatures w14:val="none"/>
+        </w:rPr>
+        <w:t>)._</w:t>
+      </w:r>
+      <w:proofErr w:type="gramEnd"/>
+      <w:r>
+        <w:rPr>
+          <w:rFonts w:ascii="Consolas" w:eastAsia="Times New Roman" w:hAnsi="Consolas" w:cs="Times New Roman"/>
+          <w:color w:val="E6EDF3"/>
+          <w:kern w:val="0"/>
+          <w:sz w:val="16"/>
+          <w:szCs w:val="16"/>
+          <w14:ligatures w14:val="none"/>
+        </w:rPr>
+        <w:t>_name__}"</w:t>
       </w:r>
     </w:p>
     <w:p>
@@ -9986,16 +11366,29 @@
         <w:t xml:space="preserve">        </w:t>
       </w:r>
       <w:proofErr w:type="spellStart"/>
-      <w:r>
-        <w:rPr>
-          <w:rFonts w:ascii="Consolas" w:eastAsia="Times New Roman" w:hAnsi="Consolas" w:cs="Times New Roman"/>
-          <w:color w:val="E6EDF3"/>
-          <w:kern w:val="0"/>
-          <w:sz w:val="16"/>
-          <w:szCs w:val="16"/>
-          <w14:ligatures w14:val="none"/>
-        </w:rPr>
-        <w:t>self._transforms</w:t>
+      <w:proofErr w:type="gramStart"/>
+      <w:r>
+        <w:rPr>
+          <w:rFonts w:ascii="Consolas" w:eastAsia="Times New Roman" w:hAnsi="Consolas" w:cs="Times New Roman"/>
+          <w:color w:val="E6EDF3"/>
+          <w:kern w:val="0"/>
+          <w:sz w:val="16"/>
+          <w:szCs w:val="16"/>
+          <w14:ligatures w14:val="none"/>
+        </w:rPr>
+        <w:t>self._</w:t>
+      </w:r>
+      <w:proofErr w:type="gramEnd"/>
+      <w:r>
+        <w:rPr>
+          <w:rFonts w:ascii="Consolas" w:eastAsia="Times New Roman" w:hAnsi="Consolas" w:cs="Times New Roman"/>
+          <w:color w:val="E6EDF3"/>
+          <w:kern w:val="0"/>
+          <w:sz w:val="16"/>
+          <w:szCs w:val="16"/>
+          <w14:ligatures w14:val="none"/>
+        </w:rPr>
+        <w:t>transforms</w:t>
       </w:r>
       <w:proofErr w:type="spellEnd"/>
       <w:r>
@@ -10048,7 +11441,31 @@
           <w:szCs w:val="16"/>
           <w14:ligatures w14:val="none"/>
         </w:rPr>
-        <w:t xml:space="preserve">    def run(self, </w:t>
+        <w:t xml:space="preserve">    def </w:t>
+      </w:r>
+      <w:proofErr w:type="gramStart"/>
+      <w:r>
+        <w:rPr>
+          <w:rFonts w:ascii="Consolas" w:eastAsia="Times New Roman" w:hAnsi="Consolas" w:cs="Times New Roman"/>
+          <w:color w:val="E6EDF3"/>
+          <w:kern w:val="0"/>
+          <w:sz w:val="16"/>
+          <w:szCs w:val="16"/>
+          <w14:ligatures w14:val="none"/>
+        </w:rPr>
+        <w:t>run(</w:t>
+      </w:r>
+      <w:proofErr w:type="gramEnd"/>
+      <w:r>
+        <w:rPr>
+          <w:rFonts w:ascii="Consolas" w:eastAsia="Times New Roman" w:hAnsi="Consolas" w:cs="Times New Roman"/>
+          <w:color w:val="E6EDF3"/>
+          <w:kern w:val="0"/>
+          <w:sz w:val="16"/>
+          <w:szCs w:val="16"/>
+          <w14:ligatures w14:val="none"/>
+        </w:rPr>
+        <w:t xml:space="preserve">self, </w:t>
       </w:r>
       <w:proofErr w:type="spellStart"/>
       <w:r>
@@ -10127,16 +11544,29 @@
         <w:t xml:space="preserve">        for transform in </w:t>
       </w:r>
       <w:proofErr w:type="spellStart"/>
-      <w:r>
-        <w:rPr>
-          <w:rFonts w:ascii="Consolas" w:eastAsia="Times New Roman" w:hAnsi="Consolas" w:cs="Times New Roman"/>
-          <w:color w:val="E6EDF3"/>
-          <w:kern w:val="0"/>
-          <w:sz w:val="16"/>
-          <w:szCs w:val="16"/>
-          <w14:ligatures w14:val="none"/>
-        </w:rPr>
-        <w:t>self._transforms</w:t>
+      <w:proofErr w:type="gramStart"/>
+      <w:r>
+        <w:rPr>
+          <w:rFonts w:ascii="Consolas" w:eastAsia="Times New Roman" w:hAnsi="Consolas" w:cs="Times New Roman"/>
+          <w:color w:val="E6EDF3"/>
+          <w:kern w:val="0"/>
+          <w:sz w:val="16"/>
+          <w:szCs w:val="16"/>
+          <w14:ligatures w14:val="none"/>
+        </w:rPr>
+        <w:t>self._</w:t>
+      </w:r>
+      <w:proofErr w:type="gramEnd"/>
+      <w:r>
+        <w:rPr>
+          <w:rFonts w:ascii="Consolas" w:eastAsia="Times New Roman" w:hAnsi="Consolas" w:cs="Times New Roman"/>
+          <w:color w:val="E6EDF3"/>
+          <w:kern w:val="0"/>
+          <w:sz w:val="16"/>
+          <w:szCs w:val="16"/>
+          <w14:ligatures w14:val="none"/>
+        </w:rPr>
+        <w:t>transforms</w:t>
       </w:r>
       <w:proofErr w:type="spellEnd"/>
       <w:r>
@@ -10201,6 +11631,7 @@
         <w:t xml:space="preserve"> = </w:t>
       </w:r>
       <w:proofErr w:type="spellStart"/>
+      <w:proofErr w:type="gramStart"/>
       <w:r>
         <w:rPr>
           <w:rFonts w:ascii="Consolas" w:eastAsia="Times New Roman" w:hAnsi="Consolas" w:cs="Times New Roman"/>
@@ -10213,6 +11644,7 @@
         <w:t>transform.execute</w:t>
       </w:r>
       <w:proofErr w:type="spellEnd"/>
+      <w:proofErr w:type="gramEnd"/>
       <w:r>
         <w:rPr>
           <w:rFonts w:ascii="Consolas" w:eastAsia="Times New Roman" w:hAnsi="Consolas" w:cs="Times New Roman"/>
@@ -10292,12 +11724,13 @@
       <w:pPr>
         <w:pStyle w:val="Heading3"/>
       </w:pPr>
-      <w:r>
-        <w:br w:type="page"/>
-      </w:r>
-      <w:bookmarkStart w:id="11" w:name="_Toc227880634"/>
-      <w:r>
-        <w:lastRenderedPageBreak/>
+    </w:p>
+    <w:p>
+      <w:pPr>
+        <w:pStyle w:val="Heading3"/>
+      </w:pPr>
+      <w:bookmarkStart w:id="11" w:name="_Toc227907263"/>
+      <w:r>
         <w:t xml:space="preserve">2.3.4 </w:t>
       </w:r>
       <w:r>
@@ -10399,7 +11832,19 @@
           <w:szCs w:val="16"/>
           <w14:ligatures w14:val="none"/>
         </w:rPr>
-        <w:t>broadcast_dataset_b</w:t>
+        <w:t>broadcast_dataset_</w:t>
+      </w:r>
+      <w:proofErr w:type="gramStart"/>
+      <w:r>
+        <w:rPr>
+          <w:rFonts w:ascii="Consolas" w:eastAsia="Times New Roman" w:hAnsi="Consolas" w:cs="Times New Roman"/>
+          <w:color w:val="E6EDF3"/>
+          <w:kern w:val="0"/>
+          <w:sz w:val="16"/>
+          <w:szCs w:val="16"/>
+          <w14:ligatures w14:val="none"/>
+        </w:rPr>
+        <w:t>b</w:t>
       </w:r>
       <w:proofErr w:type="spellEnd"/>
       <w:r>
@@ -10411,7 +11856,19 @@
           <w:szCs w:val="16"/>
           <w14:ligatures w14:val="none"/>
         </w:rPr>
-        <w:t xml:space="preserve">(spark, </w:t>
+        <w:t>(</w:t>
+      </w:r>
+      <w:proofErr w:type="gramEnd"/>
+      <w:r>
+        <w:rPr>
+          <w:rFonts w:ascii="Consolas" w:eastAsia="Times New Roman" w:hAnsi="Consolas" w:cs="Times New Roman"/>
+          <w:color w:val="E6EDF3"/>
+          <w:kern w:val="0"/>
+          <w:sz w:val="16"/>
+          <w:szCs w:val="16"/>
+          <w14:ligatures w14:val="none"/>
+        </w:rPr>
+        <w:t xml:space="preserve">spark, </w:t>
       </w:r>
       <w:proofErr w:type="spellStart"/>
       <w:r>
@@ -10838,6 +12295,7 @@
           <w:szCs w:val="16"/>
           <w14:ligatures w14:val="none"/>
         </w:rPr>
+        <w:lastRenderedPageBreak/>
         <w:t>    """</w:t>
       </w:r>
     </w:p>
@@ -10890,6 +12348,7 @@
         <w:t xml:space="preserve"> = </w:t>
       </w:r>
       <w:proofErr w:type="spellStart"/>
+      <w:proofErr w:type="gramStart"/>
       <w:r>
         <w:rPr>
           <w:rFonts w:ascii="Consolas" w:eastAsia="Times New Roman" w:hAnsi="Consolas" w:cs="Times New Roman"/>
@@ -10913,6 +12372,7 @@
         </w:rPr>
         <w:t>(</w:t>
       </w:r>
+      <w:proofErr w:type="gramEnd"/>
     </w:p>
     <w:p>
       <w:pPr>
@@ -10960,7 +12420,79 @@
           <w:szCs w:val="16"/>
           <w14:ligatures w14:val="none"/>
         </w:rPr>
-        <w:t>(tuple).map(lambda row: (row[0], row[1])).collect()</w:t>
+        <w:t>(tuple</w:t>
+      </w:r>
+      <w:proofErr w:type="gramStart"/>
+      <w:r>
+        <w:rPr>
+          <w:rFonts w:ascii="Consolas" w:eastAsia="Times New Roman" w:hAnsi="Consolas" w:cs="Times New Roman"/>
+          <w:color w:val="E6EDF3"/>
+          <w:kern w:val="0"/>
+          <w:sz w:val="16"/>
+          <w:szCs w:val="16"/>
+          <w14:ligatures w14:val="none"/>
+        </w:rPr>
+        <w:t>).map</w:t>
+      </w:r>
+      <w:proofErr w:type="gramEnd"/>
+      <w:r>
+        <w:rPr>
+          <w:rFonts w:ascii="Consolas" w:eastAsia="Times New Roman" w:hAnsi="Consolas" w:cs="Times New Roman"/>
+          <w:color w:val="E6EDF3"/>
+          <w:kern w:val="0"/>
+          <w:sz w:val="16"/>
+          <w:szCs w:val="16"/>
+          <w14:ligatures w14:val="none"/>
+        </w:rPr>
+        <w:t>(lambda row: (</w:t>
+      </w:r>
+      <w:proofErr w:type="gramStart"/>
+      <w:r>
+        <w:rPr>
+          <w:rFonts w:ascii="Consolas" w:eastAsia="Times New Roman" w:hAnsi="Consolas" w:cs="Times New Roman"/>
+          <w:color w:val="E6EDF3"/>
+          <w:kern w:val="0"/>
+          <w:sz w:val="16"/>
+          <w:szCs w:val="16"/>
+          <w14:ligatures w14:val="none"/>
+        </w:rPr>
+        <w:t>row[</w:t>
+      </w:r>
+      <w:proofErr w:type="gramEnd"/>
+      <w:r>
+        <w:rPr>
+          <w:rFonts w:ascii="Consolas" w:eastAsia="Times New Roman" w:hAnsi="Consolas" w:cs="Times New Roman"/>
+          <w:color w:val="E6EDF3"/>
+          <w:kern w:val="0"/>
+          <w:sz w:val="16"/>
+          <w:szCs w:val="16"/>
+          <w14:ligatures w14:val="none"/>
+        </w:rPr>
+        <w:t>0], row[1])</w:t>
+      </w:r>
+      <w:proofErr w:type="gramStart"/>
+      <w:r>
+        <w:rPr>
+          <w:rFonts w:ascii="Consolas" w:eastAsia="Times New Roman" w:hAnsi="Consolas" w:cs="Times New Roman"/>
+          <w:color w:val="E6EDF3"/>
+          <w:kern w:val="0"/>
+          <w:sz w:val="16"/>
+          <w:szCs w:val="16"/>
+          <w14:ligatures w14:val="none"/>
+        </w:rPr>
+        <w:t>).collect</w:t>
+      </w:r>
+      <w:proofErr w:type="gramEnd"/>
+      <w:r>
+        <w:rPr>
+          <w:rFonts w:ascii="Consolas" w:eastAsia="Times New Roman" w:hAnsi="Consolas" w:cs="Times New Roman"/>
+          <w:color w:val="E6EDF3"/>
+          <w:kern w:val="0"/>
+          <w:sz w:val="16"/>
+          <w:szCs w:val="16"/>
+          <w14:ligatures w14:val="none"/>
+        </w:rPr>
+        <w:t>()</w:t>
       </w:r>
     </w:p>
     <w:p>
@@ -11014,6 +12546,7 @@
         <w:t xml:space="preserve">return </w:t>
       </w:r>
       <w:proofErr w:type="spellStart"/>
+      <w:proofErr w:type="gramStart"/>
       <w:r>
         <w:rPr>
           <w:rFonts w:ascii="Consolas" w:eastAsia="Times New Roman" w:hAnsi="Consolas" w:cs="Times New Roman"/>
@@ -11026,6 +12559,7 @@
         <w:t>spark.sparkContext.broadcast</w:t>
       </w:r>
       <w:proofErr w:type="spellEnd"/>
+      <w:proofErr w:type="gramEnd"/>
       <w:r>
         <w:rPr>
           <w:rFonts w:ascii="Consolas" w:eastAsia="Times New Roman" w:hAnsi="Consolas" w:cs="Times New Roman"/>
@@ -11220,7 +12754,19 @@
           <w:szCs w:val="16"/>
           <w14:ligatures w14:val="none"/>
         </w:rPr>
-        <w:t>broadcast_dataset_b</w:t>
+        <w:t>broadcast_dataset_</w:t>
+      </w:r>
+      <w:proofErr w:type="gramStart"/>
+      <w:r>
+        <w:rPr>
+          <w:rFonts w:ascii="Consolas" w:eastAsia="Times New Roman" w:hAnsi="Consolas" w:cs="Times New Roman"/>
+          <w:color w:val="E6EDF3"/>
+          <w:kern w:val="0"/>
+          <w:sz w:val="16"/>
+          <w:szCs w:val="16"/>
+          <w14:ligatures w14:val="none"/>
+        </w:rPr>
+        <w:t>b</w:t>
       </w:r>
       <w:proofErr w:type="spellEnd"/>
       <w:r>
@@ -11232,7 +12778,19 @@
           <w:szCs w:val="16"/>
           <w14:ligatures w14:val="none"/>
         </w:rPr>
-        <w:t xml:space="preserve">(spark, </w:t>
+        <w:t>(</w:t>
+      </w:r>
+      <w:proofErr w:type="gramEnd"/>
+      <w:r>
+        <w:rPr>
+          <w:rFonts w:ascii="Consolas" w:eastAsia="Times New Roman" w:hAnsi="Consolas" w:cs="Times New Roman"/>
+          <w:color w:val="E6EDF3"/>
+          <w:kern w:val="0"/>
+          <w:sz w:val="16"/>
+          <w:szCs w:val="16"/>
+          <w14:ligatures w14:val="none"/>
+        </w:rPr>
+        <w:t xml:space="preserve">spark, </w:t>
       </w:r>
       <w:proofErr w:type="spellStart"/>
       <w:r>
@@ -11281,7 +12839,7 @@
           <w:numId w:val="15"/>
         </w:numPr>
       </w:pPr>
-      <w:bookmarkStart w:id="12" w:name="_Toc227880635"/>
+      <w:bookmarkStart w:id="12" w:name="_Toc227907264"/>
       <w:r>
         <w:t>Other Design Considerations</w:t>
       </w:r>
@@ -11377,8 +12935,13 @@
         <w:t xml:space="preserve"> the </w:t>
       </w:r>
       <w:r>
-        <w:t>{jobname}/{</w:t>
-      </w:r>
+        <w:t>{jobname}</w:t>
+      </w:r>
+      <w:proofErr w:type="gramStart"/>
+      <w:r>
+        <w:t>/{</w:t>
+      </w:r>
+      <w:proofErr w:type="gramEnd"/>
       <w:r>
         <w:t>current run date</w:t>
       </w:r>
@@ -11442,9 +13005,8 @@
           <w:numId w:val="23"/>
         </w:numPr>
       </w:pPr>
-      <w:bookmarkStart w:id="13" w:name="_Toc227880636"/>
-      <w:r>
-        <w:lastRenderedPageBreak/>
+      <w:bookmarkStart w:id="13" w:name="_Toc227907265"/>
+      <w:r>
         <w:t xml:space="preserve">PROPOSED </w:t>
       </w:r>
       <w:r>
@@ -11459,7 +13021,7 @@
       <w:r>
         <w:t xml:space="preserve"> </w:t>
       </w:r>
-      <w:bookmarkStart w:id="14" w:name="_Toc227880637"/>
+      <w:bookmarkStart w:id="14" w:name="_Toc227907266"/>
       <w:r>
         <w:t xml:space="preserve">3.1 Local </w:t>
       </w:r>
@@ -11482,6 +13044,7 @@
         <w:t xml:space="preserve">  </w:t>
       </w:r>
       <w:proofErr w:type="spellStart"/>
+      <w:proofErr w:type="gramStart"/>
       <w:r>
         <w:rPr>
           <w:rFonts w:ascii="Times New Roman" w:hAnsi="Times New Roman" w:cs="Times New Roman"/>
@@ -11489,6 +13052,7 @@
         <w:t>spark.master</w:t>
       </w:r>
       <w:proofErr w:type="spellEnd"/>
+      <w:proofErr w:type="gramEnd"/>
       <w:r>
         <w:rPr>
           <w:rFonts w:ascii="Times New Roman" w:hAnsi="Times New Roman" w:cs="Times New Roman"/>
@@ -11511,7 +13075,21 @@
         <w:rPr>
           <w:rFonts w:ascii="Times New Roman" w:hAnsi="Times New Roman" w:cs="Times New Roman"/>
         </w:rPr>
-        <w:t>= local[*]</w:t>
+        <w:t xml:space="preserve">= </w:t>
+      </w:r>
+      <w:proofErr w:type="gramStart"/>
+      <w:r>
+        <w:rPr>
+          <w:rFonts w:ascii="Times New Roman" w:hAnsi="Times New Roman" w:cs="Times New Roman"/>
+        </w:rPr>
+        <w:t>local[</w:t>
+      </w:r>
+      <w:proofErr w:type="gramEnd"/>
+      <w:r>
+        <w:rPr>
+          <w:rFonts w:ascii="Times New Roman" w:hAnsi="Times New Roman" w:cs="Times New Roman"/>
+        </w:rPr>
+        <w:t>*]</w:t>
       </w:r>
     </w:p>
     <w:p>
@@ -11532,9 +13110,17 @@
         <w:rPr>
           <w:rFonts w:ascii="Times New Roman" w:hAnsi="Times New Roman" w:cs="Times New Roman"/>
         </w:rPr>
-        <w:t>spark.ui.enabled</w:t>
+        <w:t>spark.</w:t>
+      </w:r>
+      <w:proofErr w:type="gramStart"/>
+      <w:r>
+        <w:rPr>
+          <w:rFonts w:ascii="Times New Roman" w:hAnsi="Times New Roman" w:cs="Times New Roman"/>
+        </w:rPr>
+        <w:t>ui.enabled</w:t>
       </w:r>
       <w:proofErr w:type="spellEnd"/>
+      <w:proofErr w:type="gramEnd"/>
       <w:r>
         <w:rPr>
           <w:rFonts w:ascii="Times New Roman" w:hAnsi="Times New Roman" w:cs="Times New Roman"/>
@@ -11574,11 +13160,19 @@
         <w:t xml:space="preserve">  </w:t>
       </w:r>
       <w:proofErr w:type="spellStart"/>
+      <w:proofErr w:type="gramStart"/>
       <w:r>
         <w:rPr>
           <w:rFonts w:ascii="Times New Roman" w:hAnsi="Times New Roman" w:cs="Times New Roman"/>
         </w:rPr>
-        <w:t>spark.sql.shuffle.partitions</w:t>
+        <w:t>spark.sql.shuffle</w:t>
+      </w:r>
+      <w:proofErr w:type="gramEnd"/>
+      <w:r>
+        <w:rPr>
+          <w:rFonts w:ascii="Times New Roman" w:hAnsi="Times New Roman" w:cs="Times New Roman"/>
+        </w:rPr>
+        <w:t>.partitions</w:t>
       </w:r>
       <w:proofErr w:type="spellEnd"/>
       <w:r>
@@ -11602,6 +13196,7 @@
         <w:t xml:space="preserve">  </w:t>
       </w:r>
       <w:proofErr w:type="spellStart"/>
+      <w:proofErr w:type="gramStart"/>
       <w:r>
         <w:rPr>
           <w:rFonts w:ascii="Times New Roman" w:hAnsi="Times New Roman" w:cs="Times New Roman"/>
@@ -11609,6 +13204,7 @@
         <w:t>spark.serializer</w:t>
       </w:r>
       <w:proofErr w:type="spellEnd"/>
+      <w:proofErr w:type="gramEnd"/>
       <w:r>
         <w:rPr>
           <w:rFonts w:ascii="Times New Roman" w:hAnsi="Times New Roman" w:cs="Times New Roman"/>
@@ -11628,11 +13224,33 @@
         <w:t xml:space="preserve">= </w:t>
       </w:r>
       <w:proofErr w:type="spellStart"/>
+      <w:proofErr w:type="gramStart"/>
       <w:r>
         <w:rPr>
           <w:rFonts w:ascii="Times New Roman" w:hAnsi="Times New Roman" w:cs="Times New Roman"/>
         </w:rPr>
-        <w:t>org.apache.spark.serializer.KryoSerializer</w:t>
+        <w:t>org.apache</w:t>
+      </w:r>
+      <w:proofErr w:type="gramEnd"/>
+      <w:r>
+        <w:rPr>
+          <w:rFonts w:ascii="Times New Roman" w:hAnsi="Times New Roman" w:cs="Times New Roman"/>
+        </w:rPr>
+        <w:t>.</w:t>
+      </w:r>
+      <w:proofErr w:type="gramStart"/>
+      <w:r>
+        <w:rPr>
+          <w:rFonts w:ascii="Times New Roman" w:hAnsi="Times New Roman" w:cs="Times New Roman"/>
+        </w:rPr>
+        <w:t>spark.serializer</w:t>
+      </w:r>
+      <w:proofErr w:type="gramEnd"/>
+      <w:r>
+        <w:rPr>
+          <w:rFonts w:ascii="Times New Roman" w:hAnsi="Times New Roman" w:cs="Times New Roman"/>
+        </w:rPr>
+        <w:t>.KryoSerializer</w:t>
       </w:r>
       <w:proofErr w:type="spellEnd"/>
     </w:p>
@@ -11650,11 +13268,19 @@
         <w:t xml:space="preserve">  </w:t>
       </w:r>
       <w:proofErr w:type="spellStart"/>
+      <w:proofErr w:type="gramStart"/>
       <w:r>
         <w:rPr>
           <w:rFonts w:ascii="Times New Roman" w:hAnsi="Times New Roman" w:cs="Times New Roman"/>
         </w:rPr>
-        <w:t>spark.driver.memory</w:t>
+        <w:t>spark.driver</w:t>
+      </w:r>
+      <w:proofErr w:type="gramEnd"/>
+      <w:r>
+        <w:rPr>
+          <w:rFonts w:ascii="Times New Roman" w:hAnsi="Times New Roman" w:cs="Times New Roman"/>
+        </w:rPr>
+        <w:t>.memory</w:t>
       </w:r>
       <w:proofErr w:type="spellEnd"/>
       <w:r>
@@ -11742,6 +13368,7 @@
               </w:rPr>
             </w:pPr>
             <w:proofErr w:type="spellStart"/>
+            <w:proofErr w:type="gramStart"/>
             <w:r>
               <w:rPr>
                 <w:rFonts w:ascii="Times New Roman" w:hAnsi="Times New Roman" w:cs="Times New Roman"/>
@@ -11749,6 +13376,7 @@
               <w:t>spark.serializer</w:t>
             </w:r>
             <w:proofErr w:type="spellEnd"/>
+            <w:proofErr w:type="gramEnd"/>
             <w:r>
               <w:rPr>
                 <w:rFonts w:ascii="Times New Roman" w:hAnsi="Times New Roman" w:cs="Times New Roman"/>
@@ -11756,11 +13384,33 @@
               <w:t xml:space="preserve">= </w:t>
             </w:r>
             <w:proofErr w:type="spellStart"/>
-            <w:r>
-              <w:rPr>
-                <w:rFonts w:ascii="Times New Roman" w:hAnsi="Times New Roman" w:cs="Times New Roman"/>
-              </w:rPr>
-              <w:t>org.apache.spark.serializer.KryoSerializer</w:t>
+            <w:proofErr w:type="gramStart"/>
+            <w:r>
+              <w:rPr>
+                <w:rFonts w:ascii="Times New Roman" w:hAnsi="Times New Roman" w:cs="Times New Roman"/>
+              </w:rPr>
+              <w:t>org.apache</w:t>
+            </w:r>
+            <w:proofErr w:type="gramEnd"/>
+            <w:r>
+              <w:rPr>
+                <w:rFonts w:ascii="Times New Roman" w:hAnsi="Times New Roman" w:cs="Times New Roman"/>
+              </w:rPr>
+              <w:t>.</w:t>
+            </w:r>
+            <w:proofErr w:type="gramStart"/>
+            <w:r>
+              <w:rPr>
+                <w:rFonts w:ascii="Times New Roman" w:hAnsi="Times New Roman" w:cs="Times New Roman"/>
+              </w:rPr>
+              <w:t>spark.serializer</w:t>
+            </w:r>
+            <w:proofErr w:type="gramEnd"/>
+            <w:r>
+              <w:rPr>
+                <w:rFonts w:ascii="Times New Roman" w:hAnsi="Times New Roman" w:cs="Times New Roman"/>
+              </w:rPr>
+              <w:t>.KryoSerializer</w:t>
             </w:r>
             <w:proofErr w:type="spellEnd"/>
           </w:p>
@@ -11809,11 +13459,19 @@
               </w:rPr>
             </w:pPr>
             <w:proofErr w:type="spellStart"/>
-            <w:r>
-              <w:rPr>
-                <w:rFonts w:ascii="Times New Roman" w:hAnsi="Times New Roman" w:cs="Times New Roman"/>
-              </w:rPr>
-              <w:t>spark.sql.shuffle.partitions</w:t>
+            <w:proofErr w:type="gramStart"/>
+            <w:r>
+              <w:rPr>
+                <w:rFonts w:ascii="Times New Roman" w:hAnsi="Times New Roman" w:cs="Times New Roman"/>
+              </w:rPr>
+              <w:t>spark.sql.shuffle</w:t>
+            </w:r>
+            <w:proofErr w:type="gramEnd"/>
+            <w:r>
+              <w:rPr>
+                <w:rFonts w:ascii="Times New Roman" w:hAnsi="Times New Roman" w:cs="Times New Roman"/>
+              </w:rPr>
+              <w:t>.partitions</w:t>
             </w:r>
             <w:proofErr w:type="spellEnd"/>
             <w:r>
@@ -11868,6 +13526,7 @@
               <w:rPr>
                 <w:rFonts w:ascii="Times New Roman" w:hAnsi="Times New Roman" w:cs="Times New Roman"/>
               </w:rPr>
+              <w:lastRenderedPageBreak/>
               <w:t>Data size is not huge</w:t>
             </w:r>
           </w:p>
@@ -11892,11 +13551,20 @@
               </w:rPr>
             </w:pPr>
             <w:proofErr w:type="spellStart"/>
-            <w:r>
-              <w:rPr>
-                <w:rFonts w:ascii="Times New Roman" w:hAnsi="Times New Roman" w:cs="Times New Roman"/>
-              </w:rPr>
-              <w:t>spark.driver.memory</w:t>
+            <w:proofErr w:type="gramStart"/>
+            <w:r>
+              <w:rPr>
+                <w:rFonts w:ascii="Times New Roman" w:hAnsi="Times New Roman" w:cs="Times New Roman"/>
+              </w:rPr>
+              <w:lastRenderedPageBreak/>
+              <w:t>spark.driver</w:t>
+            </w:r>
+            <w:proofErr w:type="gramEnd"/>
+            <w:r>
+              <w:rPr>
+                <w:rFonts w:ascii="Times New Roman" w:hAnsi="Times New Roman" w:cs="Times New Roman"/>
+              </w:rPr>
+              <w:t>.memory</w:t>
             </w:r>
             <w:proofErr w:type="spellEnd"/>
             <w:r>
@@ -11986,24 +13654,10 @@
     </w:p>
     <w:p>
       <w:pPr>
-        <w:rPr>
-          <w:rFonts w:asciiTheme="majorHAnsi" w:eastAsiaTheme="majorEastAsia" w:hAnsiTheme="majorHAnsi" w:cstheme="majorBidi"/>
-          <w:color w:val="2F5496" w:themeColor="accent1" w:themeShade="BF"/>
-          <w:sz w:val="32"/>
-          <w:szCs w:val="32"/>
-        </w:rPr>
-      </w:pPr>
-      <w:r>
-        <w:br w:type="page"/>
-      </w:r>
-    </w:p>
-    <w:p>
-      <w:pPr>
         <w:pStyle w:val="Heading2"/>
       </w:pPr>
-      <w:bookmarkStart w:id="15" w:name="_Toc227880638"/>
-      <w:r>
-        <w:lastRenderedPageBreak/>
+      <w:bookmarkStart w:id="15" w:name="_Toc227907267"/>
+      <w:r>
         <w:t xml:space="preserve">3.2 </w:t>
       </w:r>
       <w:r>
@@ -12019,10 +13673,12 @@
         <w:t xml:space="preserve">  </w:t>
       </w:r>
       <w:proofErr w:type="spellStart"/>
+      <w:proofErr w:type="gramStart"/>
       <w:r>
         <w:t>spark.master</w:t>
       </w:r>
       <w:proofErr w:type="spellEnd"/>
+      <w:proofErr w:type="gramEnd"/>
       <w:r>
         <w:t xml:space="preserve">                       </w:t>
       </w:r>
@@ -12030,7 +13686,15 @@
         <w:tab/>
       </w:r>
       <w:r>
-        <w:t>= local[*] or yarn</w:t>
+        <w:t xml:space="preserve">= </w:t>
+      </w:r>
+      <w:proofErr w:type="gramStart"/>
+      <w:r>
+        <w:t>local[</w:t>
+      </w:r>
+      <w:proofErr w:type="gramEnd"/>
+      <w:r>
+        <w:t>*] or yarn</w:t>
       </w:r>
     </w:p>
     <w:p>
@@ -12041,10 +13705,12 @@
         <w:t xml:space="preserve">  </w:t>
       </w:r>
       <w:proofErr w:type="spellStart"/>
+      <w:proofErr w:type="gramStart"/>
       <w:r>
         <w:t>spark.serializer</w:t>
       </w:r>
       <w:proofErr w:type="spellEnd"/>
+      <w:proofErr w:type="gramEnd"/>
       <w:r>
         <w:t xml:space="preserve">                   </w:t>
       </w:r>
@@ -12055,8 +13721,21 @@
         <w:t xml:space="preserve">= </w:t>
       </w:r>
       <w:proofErr w:type="spellStart"/>
-      <w:r>
-        <w:t>org.apache.spark.serializer.KryoSerializer</w:t>
+      <w:proofErr w:type="gramStart"/>
+      <w:r>
+        <w:t>org.apache</w:t>
+      </w:r>
+      <w:proofErr w:type="gramEnd"/>
+      <w:r>
+        <w:t>.</w:t>
+      </w:r>
+      <w:proofErr w:type="gramStart"/>
+      <w:r>
+        <w:t>spark.serializer</w:t>
+      </w:r>
+      <w:proofErr w:type="gramEnd"/>
+      <w:r>
+        <w:t>.KryoSerializer</w:t>
       </w:r>
       <w:proofErr w:type="spellEnd"/>
     </w:p>
@@ -12068,8 +13747,13 @@
         <w:t xml:space="preserve">  </w:t>
       </w:r>
       <w:proofErr w:type="spellStart"/>
-      <w:r>
-        <w:t>spark.sql.shuffle.partitions</w:t>
+      <w:proofErr w:type="gramStart"/>
+      <w:r>
+        <w:t>spark.sql.shuffle</w:t>
+      </w:r>
+      <w:proofErr w:type="gramEnd"/>
+      <w:r>
+        <w:t>.partitions</w:t>
       </w:r>
       <w:proofErr w:type="spellEnd"/>
       <w:r>
@@ -12088,9 +13772,14 @@
       </w:r>
       <w:proofErr w:type="spellStart"/>
       <w:r>
-        <w:t>spark.default.parallelism</w:t>
+        <w:t>spark.</w:t>
+      </w:r>
+      <w:proofErr w:type="gramStart"/>
+      <w:r>
+        <w:t>default.parallelism</w:t>
       </w:r>
       <w:proofErr w:type="spellEnd"/>
+      <w:proofErr w:type="gramEnd"/>
       <w:r>
         <w:tab/>
       </w:r>
@@ -12106,8 +13795,13 @@
         <w:t xml:space="preserve">  </w:t>
       </w:r>
       <w:proofErr w:type="spellStart"/>
-      <w:r>
-        <w:t>spark.driver.memory</w:t>
+      <w:proofErr w:type="gramStart"/>
+      <w:r>
+        <w:t>spark.driver</w:t>
+      </w:r>
+      <w:proofErr w:type="gramEnd"/>
+      <w:r>
+        <w:t>.memory</w:t>
       </w:r>
       <w:proofErr w:type="spellEnd"/>
       <w:r>
@@ -12128,8 +13822,13 @@
         <w:t xml:space="preserve">  </w:t>
       </w:r>
       <w:proofErr w:type="spellStart"/>
-      <w:r>
-        <w:t>spark.executor.memory</w:t>
+      <w:proofErr w:type="gramStart"/>
+      <w:r>
+        <w:t>spark.executor</w:t>
+      </w:r>
+      <w:proofErr w:type="gramEnd"/>
+      <w:r>
+        <w:t>.memory</w:t>
       </w:r>
       <w:proofErr w:type="spellEnd"/>
       <w:r>
@@ -12147,8 +13846,13 @@
         <w:t xml:space="preserve">  </w:t>
       </w:r>
       <w:proofErr w:type="spellStart"/>
-      <w:r>
-        <w:t>spark.executor.cores</w:t>
+      <w:proofErr w:type="gramStart"/>
+      <w:r>
+        <w:t>spark.executor</w:t>
+      </w:r>
+      <w:proofErr w:type="gramEnd"/>
+      <w:r>
+        <w:t>.cores</w:t>
       </w:r>
       <w:proofErr w:type="spellEnd"/>
       <w:r>
@@ -12163,10 +13867,12 @@
         <w:t xml:space="preserve">  </w:t>
       </w:r>
       <w:proofErr w:type="spellStart"/>
+      <w:proofErr w:type="gramStart"/>
       <w:r>
         <w:t>spark.rdd.compress</w:t>
       </w:r>
       <w:proofErr w:type="spellEnd"/>
+      <w:proofErr w:type="gramEnd"/>
       <w:r>
         <w:t xml:space="preserve">                 = true</w:t>
       </w:r>
@@ -12179,8 +13885,13 @@
         <w:t xml:space="preserve">  </w:t>
       </w:r>
       <w:proofErr w:type="spellStart"/>
-      <w:r>
-        <w:t>spark.shuffle.compress</w:t>
+      <w:proofErr w:type="gramStart"/>
+      <w:r>
+        <w:t>spark.shuffle</w:t>
+      </w:r>
+      <w:proofErr w:type="gramEnd"/>
+      <w:r>
+        <w:t>.compress</w:t>
       </w:r>
       <w:proofErr w:type="spellEnd"/>
       <w:r>
@@ -12199,10 +13910,20 @@
         <w:t xml:space="preserve">  </w:t>
       </w:r>
       <w:proofErr w:type="spellStart"/>
-      <w:r>
-        <w:t>spark.shuffle.spill.compress</w:t>
+      <w:proofErr w:type="gramStart"/>
+      <w:r>
+        <w:t>spark.shuffle</w:t>
+      </w:r>
+      <w:proofErr w:type="gramEnd"/>
+      <w:r>
+        <w:t>.</w:t>
+      </w:r>
+      <w:proofErr w:type="gramStart"/>
+      <w:r>
+        <w:t>spill.compress</w:t>
       </w:r>
       <w:proofErr w:type="spellEnd"/>
+      <w:proofErr w:type="gramEnd"/>
       <w:r>
         <w:tab/>
         <w:t xml:space="preserve"> </w:t>
@@ -12219,8 +13940,13 @@
         <w:t xml:space="preserve">  </w:t>
       </w:r>
       <w:proofErr w:type="spellStart"/>
-      <w:r>
-        <w:t>spark.sql.adaptive.enabled</w:t>
+      <w:proofErr w:type="gramStart"/>
+      <w:r>
+        <w:t>spark.sql.adaptive</w:t>
+      </w:r>
+      <w:proofErr w:type="gramEnd"/>
+      <w:r>
+        <w:t>.enabled</w:t>
       </w:r>
       <w:proofErr w:type="spellEnd"/>
       <w:r>
@@ -12312,6 +14038,7 @@
               </w:rPr>
             </w:pPr>
             <w:proofErr w:type="spellStart"/>
+            <w:proofErr w:type="gramStart"/>
             <w:r>
               <w:rPr>
                 <w:rFonts w:ascii="Times New Roman" w:hAnsi="Times New Roman" w:cs="Times New Roman"/>
@@ -12319,6 +14046,7 @@
               <w:t>spark.serializer</w:t>
             </w:r>
             <w:proofErr w:type="spellEnd"/>
+            <w:proofErr w:type="gramEnd"/>
             <w:r>
               <w:rPr>
                 <w:rFonts w:ascii="Times New Roman" w:hAnsi="Times New Roman" w:cs="Times New Roman"/>
@@ -12326,11 +14054,33 @@
               <w:t xml:space="preserve">= </w:t>
             </w:r>
             <w:proofErr w:type="spellStart"/>
-            <w:r>
-              <w:rPr>
-                <w:rFonts w:ascii="Times New Roman" w:hAnsi="Times New Roman" w:cs="Times New Roman"/>
-              </w:rPr>
-              <w:t>org.apache.spark.serializer.KryoSerializer</w:t>
+            <w:proofErr w:type="gramStart"/>
+            <w:r>
+              <w:rPr>
+                <w:rFonts w:ascii="Times New Roman" w:hAnsi="Times New Roman" w:cs="Times New Roman"/>
+              </w:rPr>
+              <w:t>org.apache</w:t>
+            </w:r>
+            <w:proofErr w:type="gramEnd"/>
+            <w:r>
+              <w:rPr>
+                <w:rFonts w:ascii="Times New Roman" w:hAnsi="Times New Roman" w:cs="Times New Roman"/>
+              </w:rPr>
+              <w:t>.</w:t>
+            </w:r>
+            <w:proofErr w:type="gramStart"/>
+            <w:r>
+              <w:rPr>
+                <w:rFonts w:ascii="Times New Roman" w:hAnsi="Times New Roman" w:cs="Times New Roman"/>
+              </w:rPr>
+              <w:t>spark.serializer</w:t>
+            </w:r>
+            <w:proofErr w:type="gramEnd"/>
+            <w:r>
+              <w:rPr>
+                <w:rFonts w:ascii="Times New Roman" w:hAnsi="Times New Roman" w:cs="Times New Roman"/>
+              </w:rPr>
+              <w:t>.KryoSerializer</w:t>
             </w:r>
             <w:proofErr w:type="spellEnd"/>
           </w:p>
@@ -12379,11 +14129,19 @@
               </w:rPr>
             </w:pPr>
             <w:proofErr w:type="spellStart"/>
-            <w:r>
-              <w:rPr>
-                <w:rFonts w:ascii="Times New Roman" w:hAnsi="Times New Roman" w:cs="Times New Roman"/>
-              </w:rPr>
-              <w:t>spark.sql.shuffle.partitions</w:t>
+            <w:proofErr w:type="gramStart"/>
+            <w:r>
+              <w:rPr>
+                <w:rFonts w:ascii="Times New Roman" w:hAnsi="Times New Roman" w:cs="Times New Roman"/>
+              </w:rPr>
+              <w:t>spark.sql.shuffle</w:t>
+            </w:r>
+            <w:proofErr w:type="gramEnd"/>
+            <w:r>
+              <w:rPr>
+                <w:rFonts w:ascii="Times New Roman" w:hAnsi="Times New Roman" w:cs="Times New Roman"/>
+              </w:rPr>
+              <w:t>.partitions</w:t>
             </w:r>
             <w:proofErr w:type="spellEnd"/>
             <w:r>
@@ -12411,9 +14169,17 @@
               <w:rPr>
                 <w:rFonts w:ascii="Times New Roman" w:hAnsi="Times New Roman" w:cs="Times New Roman"/>
               </w:rPr>
-              <w:t>spark.default.parallelism</w:t>
+              <w:t>spark.</w:t>
+            </w:r>
+            <w:proofErr w:type="gramStart"/>
+            <w:r>
+              <w:rPr>
+                <w:rFonts w:ascii="Times New Roman" w:hAnsi="Times New Roman" w:cs="Times New Roman"/>
+              </w:rPr>
+              <w:t>default.parallelism</w:t>
             </w:r>
             <w:proofErr w:type="spellEnd"/>
+            <w:proofErr w:type="gramEnd"/>
             <w:r>
               <w:rPr>
                 <w:rFonts w:ascii="Times New Roman" w:hAnsi="Times New Roman" w:cs="Times New Roman"/>
@@ -12516,11 +14282,19 @@
               </w:rPr>
             </w:pPr>
             <w:proofErr w:type="spellStart"/>
-            <w:r>
-              <w:rPr>
-                <w:rFonts w:ascii="Times New Roman" w:hAnsi="Times New Roman" w:cs="Times New Roman"/>
-              </w:rPr>
-              <w:t>spark.driver.memory</w:t>
+            <w:proofErr w:type="gramStart"/>
+            <w:r>
+              <w:rPr>
+                <w:rFonts w:ascii="Times New Roman" w:hAnsi="Times New Roman" w:cs="Times New Roman"/>
+              </w:rPr>
+              <w:t>spark.driver</w:t>
+            </w:r>
+            <w:proofErr w:type="gramEnd"/>
+            <w:r>
+              <w:rPr>
+                <w:rFonts w:ascii="Times New Roman" w:hAnsi="Times New Roman" w:cs="Times New Roman"/>
+              </w:rPr>
+              <w:t>.memory</w:t>
             </w:r>
             <w:proofErr w:type="spellEnd"/>
             <w:r>
@@ -12549,8 +14323,13 @@
               </w:rPr>
             </w:pPr>
             <w:proofErr w:type="spellStart"/>
-            <w:r>
-              <w:t>spark.executor.memor</w:t>
+            <w:proofErr w:type="gramStart"/>
+            <w:r>
+              <w:t>spark.executor</w:t>
+            </w:r>
+            <w:proofErr w:type="gramEnd"/>
+            <w:r>
+              <w:t>.memor</w:t>
             </w:r>
             <w:r>
               <w:t>y</w:t>
@@ -12625,6 +14404,7 @@
               <w:rPr>
                 <w:rFonts w:ascii="Times New Roman" w:hAnsi="Times New Roman" w:cs="Times New Roman"/>
               </w:rPr>
+              <w:lastRenderedPageBreak/>
               <w:t xml:space="preserve">Executor memory is typically 2x (common rule of thumb) </w:t>
             </w:r>
             <w:r>
@@ -12689,13 +14469,16 @@
               </w:rPr>
             </w:pPr>
             <w:proofErr w:type="spellStart"/>
-            <w:r>
-              <w:rPr>
-                <w:rFonts w:ascii="Times New Roman" w:hAnsi="Times New Roman" w:cs="Times New Roman"/>
-              </w:rPr>
+            <w:proofErr w:type="gramStart"/>
+            <w:r>
+              <w:rPr>
+                <w:rFonts w:ascii="Times New Roman" w:hAnsi="Times New Roman" w:cs="Times New Roman"/>
+              </w:rPr>
+              <w:lastRenderedPageBreak/>
               <w:t>spark.rdd.compress</w:t>
             </w:r>
             <w:proofErr w:type="spellEnd"/>
+            <w:proofErr w:type="gramEnd"/>
             <w:r>
               <w:rPr>
                 <w:rFonts w:ascii="Times New Roman" w:hAnsi="Times New Roman" w:cs="Times New Roman"/>
@@ -12722,11 +14505,19 @@
               </w:rPr>
             </w:pPr>
             <w:proofErr w:type="spellStart"/>
-            <w:r>
-              <w:rPr>
-                <w:rFonts w:ascii="Times New Roman" w:hAnsi="Times New Roman" w:cs="Times New Roman"/>
-              </w:rPr>
-              <w:t>spark.shuffle.compress</w:t>
+            <w:proofErr w:type="gramStart"/>
+            <w:r>
+              <w:rPr>
+                <w:rFonts w:ascii="Times New Roman" w:hAnsi="Times New Roman" w:cs="Times New Roman"/>
+              </w:rPr>
+              <w:t>spark.shuffle</w:t>
+            </w:r>
+            <w:proofErr w:type="gramEnd"/>
+            <w:r>
+              <w:rPr>
+                <w:rFonts w:ascii="Times New Roman" w:hAnsi="Times New Roman" w:cs="Times New Roman"/>
+              </w:rPr>
+              <w:t>.compress</w:t>
             </w:r>
             <w:proofErr w:type="spellEnd"/>
             <w:r>
@@ -12755,13 +14546,29 @@
               </w:rPr>
             </w:pPr>
             <w:proofErr w:type="spellStart"/>
-            <w:r>
-              <w:rPr>
-                <w:rFonts w:ascii="Times New Roman" w:hAnsi="Times New Roman" w:cs="Times New Roman"/>
-              </w:rPr>
-              <w:t>spark.shuffle.spill.compress</w:t>
+            <w:proofErr w:type="gramStart"/>
+            <w:r>
+              <w:rPr>
+                <w:rFonts w:ascii="Times New Roman" w:hAnsi="Times New Roman" w:cs="Times New Roman"/>
+              </w:rPr>
+              <w:t>spark.shuffle</w:t>
+            </w:r>
+            <w:proofErr w:type="gramEnd"/>
+            <w:r>
+              <w:rPr>
+                <w:rFonts w:ascii="Times New Roman" w:hAnsi="Times New Roman" w:cs="Times New Roman"/>
+              </w:rPr>
+              <w:t>.</w:t>
+            </w:r>
+            <w:proofErr w:type="gramStart"/>
+            <w:r>
+              <w:rPr>
+                <w:rFonts w:ascii="Times New Roman" w:hAnsi="Times New Roman" w:cs="Times New Roman"/>
+              </w:rPr>
+              <w:t>spill.compress</w:t>
             </w:r>
             <w:proofErr w:type="spellEnd"/>
+            <w:proofErr w:type="gramEnd"/>
             <w:r>
               <w:rPr>
                 <w:rFonts w:ascii="Times New Roman" w:hAnsi="Times New Roman" w:cs="Times New Roman"/>
@@ -12852,12 +14659,19 @@
               </w:rPr>
             </w:pPr>
             <w:proofErr w:type="spellStart"/>
-            <w:r>
-              <w:rPr>
-                <w:rFonts w:ascii="Times New Roman" w:hAnsi="Times New Roman" w:cs="Times New Roman"/>
-              </w:rPr>
-              <w:lastRenderedPageBreak/>
-              <w:t>spark.sql.adaptive.enabled</w:t>
+            <w:proofErr w:type="gramStart"/>
+            <w:r>
+              <w:rPr>
+                <w:rFonts w:ascii="Times New Roman" w:hAnsi="Times New Roman" w:cs="Times New Roman"/>
+              </w:rPr>
+              <w:t>spark.sql.adaptive</w:t>
+            </w:r>
+            <w:proofErr w:type="gramEnd"/>
+            <w:r>
+              <w:rPr>
+                <w:rFonts w:ascii="Times New Roman" w:hAnsi="Times New Roman" w:cs="Times New Roman"/>
+              </w:rPr>
+              <w:t>.enabled</w:t>
             </w:r>
             <w:proofErr w:type="spellEnd"/>
             <w:r>
@@ -12969,7 +14783,6 @@
         </w:tc>
       </w:tr>
     </w:tbl>
-    <w:p/>
     <w:p>
       <w:pPr>
         <w:rPr>
@@ -12979,9 +14792,6 @@
           <w:szCs w:val="32"/>
         </w:rPr>
       </w:pPr>
-      <w:r>
-        <w:br w:type="page"/>
-      </w:r>
     </w:p>
     <w:p>
       <w:pPr>
@@ -12991,9 +14801,8 @@
           <w:numId w:val="23"/>
         </w:numPr>
       </w:pPr>
-      <w:bookmarkStart w:id="16" w:name="_Toc227880639"/>
-      <w:r>
-        <w:lastRenderedPageBreak/>
+      <w:bookmarkStart w:id="16" w:name="_Toc227907268"/>
+      <w:r>
         <w:t>Production Cluster (Yarn/Kubernetes, larger dataset)</w:t>
       </w:r>
       <w:bookmarkEnd w:id="16"/>
@@ -13006,10 +14815,12 @@
         <w:t xml:space="preserve">  </w:t>
       </w:r>
       <w:proofErr w:type="spellStart"/>
+      <w:proofErr w:type="gramStart"/>
       <w:r>
         <w:t>spark.master</w:t>
       </w:r>
       <w:proofErr w:type="spellEnd"/>
+      <w:proofErr w:type="gramEnd"/>
       <w:r>
         <w:tab/>
       </w:r>
@@ -13030,9 +14841,14 @@
       </w:r>
       <w:proofErr w:type="spellStart"/>
       <w:r>
-        <w:t>spark.deploy.mode</w:t>
+        <w:t>spark.</w:t>
+      </w:r>
+      <w:proofErr w:type="gramStart"/>
+      <w:r>
+        <w:t>deploy.mode</w:t>
       </w:r>
       <w:proofErr w:type="spellEnd"/>
+      <w:proofErr w:type="gramEnd"/>
       <w:r>
         <w:tab/>
       </w:r>
@@ -13049,10 +14865,12 @@
         <w:t xml:space="preserve">  </w:t>
       </w:r>
       <w:proofErr w:type="spellStart"/>
+      <w:proofErr w:type="gramStart"/>
       <w:r>
         <w:t>spark.num.executors</w:t>
       </w:r>
       <w:proofErr w:type="spellEnd"/>
+      <w:proofErr w:type="gramEnd"/>
       <w:r>
         <w:tab/>
       </w:r>
@@ -13069,8 +14887,13 @@
         <w:t xml:space="preserve">  </w:t>
       </w:r>
       <w:proofErr w:type="spellStart"/>
-      <w:r>
-        <w:t>spark.executor.cores</w:t>
+      <w:proofErr w:type="gramStart"/>
+      <w:r>
+        <w:t>spark.executor</w:t>
+      </w:r>
+      <w:proofErr w:type="gramEnd"/>
+      <w:r>
+        <w:t>.cores</w:t>
       </w:r>
       <w:proofErr w:type="spellEnd"/>
       <w:r>
@@ -13089,8 +14912,13 @@
         <w:t xml:space="preserve">  </w:t>
       </w:r>
       <w:proofErr w:type="spellStart"/>
-      <w:r>
-        <w:t>spark.executor.memory</w:t>
+      <w:proofErr w:type="gramStart"/>
+      <w:r>
+        <w:t>spark.executor</w:t>
+      </w:r>
+      <w:proofErr w:type="gramEnd"/>
+      <w:r>
+        <w:t>.memory</w:t>
       </w:r>
       <w:proofErr w:type="spellEnd"/>
       <w:r>
@@ -13106,8 +14934,13 @@
         <w:t xml:space="preserve">  </w:t>
       </w:r>
       <w:proofErr w:type="spellStart"/>
-      <w:r>
-        <w:t>spark.driver.memory</w:t>
+      <w:proofErr w:type="gramStart"/>
+      <w:r>
+        <w:t>spark.driver</w:t>
+      </w:r>
+      <w:proofErr w:type="gramEnd"/>
+      <w:r>
+        <w:t>.memory</w:t>
       </w:r>
       <w:proofErr w:type="spellEnd"/>
       <w:r>
@@ -13126,10 +14959,12 @@
         <w:t xml:space="preserve">  </w:t>
       </w:r>
       <w:proofErr w:type="spellStart"/>
+      <w:proofErr w:type="gramStart"/>
       <w:r>
         <w:t>spark.serializer</w:t>
       </w:r>
       <w:proofErr w:type="spellEnd"/>
+      <w:proofErr w:type="gramEnd"/>
       <w:r>
         <w:tab/>
       </w:r>
@@ -13138,8 +14973,21 @@
         <w:t xml:space="preserve">= </w:t>
       </w:r>
       <w:proofErr w:type="spellStart"/>
-      <w:r>
-        <w:t>org.apache.spark.serializer.KryoSerializer</w:t>
+      <w:proofErr w:type="gramStart"/>
+      <w:r>
+        <w:t>org.apache</w:t>
+      </w:r>
+      <w:proofErr w:type="gramEnd"/>
+      <w:r>
+        <w:t>.</w:t>
+      </w:r>
+      <w:proofErr w:type="gramStart"/>
+      <w:r>
+        <w:t>spark.serializer</w:t>
+      </w:r>
+      <w:proofErr w:type="gramEnd"/>
+      <w:r>
+        <w:t>.KryoSerializer</w:t>
       </w:r>
       <w:proofErr w:type="spellEnd"/>
     </w:p>
@@ -13151,8 +14999,13 @@
         <w:t xml:space="preserve">  </w:t>
       </w:r>
       <w:proofErr w:type="spellStart"/>
-      <w:r>
-        <w:t>spark.sql.shuffle.partitions</w:t>
+      <w:proofErr w:type="gramStart"/>
+      <w:r>
+        <w:t>spark.sql.shuffle</w:t>
+      </w:r>
+      <w:proofErr w:type="gramEnd"/>
+      <w:r>
+        <w:t>.partitions</w:t>
       </w:r>
       <w:proofErr w:type="spellEnd"/>
       <w:r>
@@ -13169,9 +15022,14 @@
       </w:r>
       <w:proofErr w:type="spellStart"/>
       <w:r>
-        <w:t>spark.default.parallelism</w:t>
+        <w:t>spark.</w:t>
+      </w:r>
+      <w:proofErr w:type="gramStart"/>
+      <w:r>
+        <w:t>default.parallelism</w:t>
       </w:r>
       <w:proofErr w:type="spellEnd"/>
+      <w:proofErr w:type="gramEnd"/>
       <w:r>
         <w:tab/>
         <w:t>= 200</w:t>
@@ -13185,10 +15043,12 @@
         <w:t xml:space="preserve">  </w:t>
       </w:r>
       <w:proofErr w:type="spellStart"/>
+      <w:proofErr w:type="gramStart"/>
       <w:r>
         <w:t>spark.rdd.compress</w:t>
       </w:r>
       <w:proofErr w:type="spellEnd"/>
+      <w:proofErr w:type="gramEnd"/>
       <w:r>
         <w:tab/>
       </w:r>
@@ -13205,8 +15065,13 @@
         <w:t xml:space="preserve">  </w:t>
       </w:r>
       <w:proofErr w:type="spellStart"/>
-      <w:r>
-        <w:t>spark.shuffle.compress</w:t>
+      <w:proofErr w:type="gramStart"/>
+      <w:r>
+        <w:t>spark.shuffle</w:t>
+      </w:r>
+      <w:proofErr w:type="gramEnd"/>
+      <w:r>
+        <w:t>.compress</w:t>
       </w:r>
       <w:proofErr w:type="spellEnd"/>
       <w:r>
@@ -13225,10 +15090,20 @@
         <w:t xml:space="preserve">  </w:t>
       </w:r>
       <w:proofErr w:type="spellStart"/>
-      <w:r>
-        <w:t>spark.shuffle.spill.compress</w:t>
+      <w:proofErr w:type="gramStart"/>
+      <w:r>
+        <w:t>spark.shuffle</w:t>
+      </w:r>
+      <w:proofErr w:type="gramEnd"/>
+      <w:r>
+        <w:t>.</w:t>
+      </w:r>
+      <w:proofErr w:type="gramStart"/>
+      <w:r>
+        <w:t>spill.compress</w:t>
       </w:r>
       <w:proofErr w:type="spellEnd"/>
+      <w:proofErr w:type="gramEnd"/>
       <w:r>
         <w:t xml:space="preserve"> </w:t>
       </w:r>
@@ -13245,8 +15120,13 @@
         <w:t xml:space="preserve">  </w:t>
       </w:r>
       <w:proofErr w:type="spellStart"/>
-      <w:r>
-        <w:t>spark.sql.adaptive.enabled</w:t>
+      <w:proofErr w:type="gramStart"/>
+      <w:r>
+        <w:t>spark.sql.adaptive</w:t>
+      </w:r>
+      <w:proofErr w:type="gramEnd"/>
+      <w:r>
+        <w:t>.enabled</w:t>
       </w:r>
       <w:proofErr w:type="spellEnd"/>
       <w:r>
@@ -13262,8 +15142,13 @@
         <w:t xml:space="preserve">  </w:t>
       </w:r>
       <w:proofErr w:type="spellStart"/>
-      <w:r>
-        <w:t>spark.sql.adaptive.coalescePartitions.enabled</w:t>
+      <w:proofErr w:type="gramStart"/>
+      <w:r>
+        <w:t>spark.sql.adaptive</w:t>
+      </w:r>
+      <w:proofErr w:type="gramEnd"/>
+      <w:r>
+        <w:t>.coalescePartitions.enabled</w:t>
       </w:r>
       <w:proofErr w:type="spellEnd"/>
       <w:r>
@@ -13278,10 +15163,12 @@
         <w:t xml:space="preserve">  </w:t>
       </w:r>
       <w:proofErr w:type="spellStart"/>
+      <w:proofErr w:type="gramStart"/>
       <w:r>
         <w:t>spark.speculation</w:t>
       </w:r>
       <w:proofErr w:type="spellEnd"/>
+      <w:proofErr w:type="gramEnd"/>
       <w:r>
         <w:t xml:space="preserve">                   = true</w:t>
       </w:r>
@@ -13294,8 +15181,13 @@
         <w:t xml:space="preserve">  </w:t>
       </w:r>
       <w:proofErr w:type="spellStart"/>
-      <w:r>
-        <w:t>spark.speculation.quantile</w:t>
+      <w:proofErr w:type="gramStart"/>
+      <w:r>
+        <w:t>spark.speculation</w:t>
+      </w:r>
+      <w:proofErr w:type="gramEnd"/>
+      <w:r>
+        <w:t>.quantile</w:t>
       </w:r>
       <w:proofErr w:type="spellEnd"/>
       <w:r>
@@ -13311,10 +15203,12 @@
         <w:t xml:space="preserve">  </w:t>
       </w:r>
       <w:proofErr w:type="spellStart"/>
+      <w:proofErr w:type="gramStart"/>
       <w:r>
         <w:t>spark.dynamicAllocation.enabled</w:t>
       </w:r>
       <w:proofErr w:type="spellEnd"/>
+      <w:proofErr w:type="gramEnd"/>
       <w:r>
         <w:t xml:space="preserve">    = true</w:t>
       </w:r>
@@ -13327,10 +15221,12 @@
         <w:t xml:space="preserve">  </w:t>
       </w:r>
       <w:proofErr w:type="spellStart"/>
+      <w:proofErr w:type="gramStart"/>
       <w:r>
         <w:t>spark.dynamicAllocation.minExecutors</w:t>
       </w:r>
       <w:proofErr w:type="spellEnd"/>
+      <w:proofErr w:type="gramEnd"/>
       <w:r>
         <w:t xml:space="preserve"> = 2</w:t>
       </w:r>
@@ -13343,10 +15239,12 @@
         <w:t xml:space="preserve">  </w:t>
       </w:r>
       <w:proofErr w:type="spellStart"/>
+      <w:proofErr w:type="gramStart"/>
       <w:r>
         <w:t>spark.dynamicAllocation.maxExecutors</w:t>
       </w:r>
       <w:proofErr w:type="spellEnd"/>
+      <w:proofErr w:type="gramEnd"/>
       <w:r>
         <w:t xml:space="preserve"> = 16</w:t>
       </w:r>
@@ -13389,6 +15287,7 @@
                 <w:b/>
                 <w:bCs/>
               </w:rPr>
+              <w:lastRenderedPageBreak/>
               <w:t>Configuration</w:t>
             </w:r>
           </w:p>
@@ -13430,6 +15329,7 @@
               </w:rPr>
             </w:pPr>
             <w:proofErr w:type="spellStart"/>
+            <w:proofErr w:type="gramStart"/>
             <w:r>
               <w:rPr>
                 <w:rFonts w:ascii="Times New Roman" w:hAnsi="Times New Roman" w:cs="Times New Roman"/>
@@ -13437,6 +15337,7 @@
               <w:t>spark.serializer</w:t>
             </w:r>
             <w:proofErr w:type="spellEnd"/>
+            <w:proofErr w:type="gramEnd"/>
             <w:r>
               <w:rPr>
                 <w:rFonts w:ascii="Times New Roman" w:hAnsi="Times New Roman" w:cs="Times New Roman"/>
@@ -13444,11 +15345,33 @@
               <w:t xml:space="preserve">= </w:t>
             </w:r>
             <w:proofErr w:type="spellStart"/>
-            <w:r>
-              <w:rPr>
-                <w:rFonts w:ascii="Times New Roman" w:hAnsi="Times New Roman" w:cs="Times New Roman"/>
-              </w:rPr>
-              <w:t>org.apache.spark.serializer.KryoSerializer</w:t>
+            <w:proofErr w:type="gramStart"/>
+            <w:r>
+              <w:rPr>
+                <w:rFonts w:ascii="Times New Roman" w:hAnsi="Times New Roman" w:cs="Times New Roman"/>
+              </w:rPr>
+              <w:t>org.apache</w:t>
+            </w:r>
+            <w:proofErr w:type="gramEnd"/>
+            <w:r>
+              <w:rPr>
+                <w:rFonts w:ascii="Times New Roman" w:hAnsi="Times New Roman" w:cs="Times New Roman"/>
+              </w:rPr>
+              <w:t>.</w:t>
+            </w:r>
+            <w:proofErr w:type="gramStart"/>
+            <w:r>
+              <w:rPr>
+                <w:rFonts w:ascii="Times New Roman" w:hAnsi="Times New Roman" w:cs="Times New Roman"/>
+              </w:rPr>
+              <w:t>spark.serializer</w:t>
+            </w:r>
+            <w:proofErr w:type="gramEnd"/>
+            <w:r>
+              <w:rPr>
+                <w:rFonts w:ascii="Times New Roman" w:hAnsi="Times New Roman" w:cs="Times New Roman"/>
+              </w:rPr>
+              <w:t>.KryoSerializer</w:t>
             </w:r>
             <w:proofErr w:type="spellEnd"/>
           </w:p>
@@ -13497,11 +15420,19 @@
               </w:rPr>
             </w:pPr>
             <w:proofErr w:type="spellStart"/>
-            <w:r>
-              <w:rPr>
-                <w:rFonts w:ascii="Times New Roman" w:hAnsi="Times New Roman" w:cs="Times New Roman"/>
-              </w:rPr>
-              <w:t>spark.sql.shuffle.partitions</w:t>
+            <w:proofErr w:type="gramStart"/>
+            <w:r>
+              <w:rPr>
+                <w:rFonts w:ascii="Times New Roman" w:hAnsi="Times New Roman" w:cs="Times New Roman"/>
+              </w:rPr>
+              <w:t>spark.sql.shuffle</w:t>
+            </w:r>
+            <w:proofErr w:type="gramEnd"/>
+            <w:r>
+              <w:rPr>
+                <w:rFonts w:ascii="Times New Roman" w:hAnsi="Times New Roman" w:cs="Times New Roman"/>
+              </w:rPr>
+              <w:t>.partitions</w:t>
             </w:r>
             <w:proofErr w:type="spellEnd"/>
             <w:r>
@@ -13529,9 +15460,17 @@
               <w:rPr>
                 <w:rFonts w:ascii="Times New Roman" w:hAnsi="Times New Roman" w:cs="Times New Roman"/>
               </w:rPr>
-              <w:t>spark.default.parallelism</w:t>
+              <w:t>spark.</w:t>
+            </w:r>
+            <w:proofErr w:type="gramStart"/>
+            <w:r>
+              <w:rPr>
+                <w:rFonts w:ascii="Times New Roman" w:hAnsi="Times New Roman" w:cs="Times New Roman"/>
+              </w:rPr>
+              <w:t>default.parallelism</w:t>
             </w:r>
             <w:proofErr w:type="spellEnd"/>
+            <w:proofErr w:type="gramEnd"/>
             <w:r>
               <w:rPr>
                 <w:rFonts w:ascii="Times New Roman" w:hAnsi="Times New Roman" w:cs="Times New Roman"/>
@@ -13620,10 +15559,12 @@
               <w:t xml:space="preserve">  </w:t>
             </w:r>
             <w:proofErr w:type="spellStart"/>
+            <w:proofErr w:type="gramStart"/>
             <w:r>
               <w:t>spark.num.executors</w:t>
             </w:r>
             <w:proofErr w:type="spellEnd"/>
+            <w:proofErr w:type="gramEnd"/>
             <w:r>
               <w:tab/>
             </w:r>
@@ -13637,8 +15578,13 @@
               <w:t xml:space="preserve">  </w:t>
             </w:r>
             <w:proofErr w:type="spellStart"/>
-            <w:r>
-              <w:t>spark.executor.cores</w:t>
+            <w:proofErr w:type="gramStart"/>
+            <w:r>
+              <w:t>spark.executor</w:t>
+            </w:r>
+            <w:proofErr w:type="gramEnd"/>
+            <w:r>
+              <w:t>.cores</w:t>
             </w:r>
             <w:proofErr w:type="spellEnd"/>
             <w:r>
@@ -13654,8 +15600,13 @@
               <w:t xml:space="preserve">  </w:t>
             </w:r>
             <w:proofErr w:type="spellStart"/>
-            <w:r>
-              <w:t>spark.executor.memory</w:t>
+            <w:proofErr w:type="gramStart"/>
+            <w:r>
+              <w:t>spark.executor</w:t>
+            </w:r>
+            <w:proofErr w:type="gramEnd"/>
+            <w:r>
+              <w:t>.memory</w:t>
             </w:r>
             <w:proofErr w:type="spellEnd"/>
             <w:r>
@@ -13668,8 +15619,13 @@
               <w:t xml:space="preserve">  </w:t>
             </w:r>
             <w:proofErr w:type="spellStart"/>
-            <w:r>
-              <w:t>spark.driver.memory</w:t>
+            <w:proofErr w:type="gramStart"/>
+            <w:r>
+              <w:t>spark.driver</w:t>
+            </w:r>
+            <w:proofErr w:type="gramEnd"/>
+            <w:r>
+              <w:t>.memory</w:t>
             </w:r>
             <w:proofErr w:type="spellEnd"/>
             <w:r>
@@ -13752,6 +15708,7 @@
               <w:t xml:space="preserve">4 </w:t>
             </w:r>
             <w:proofErr w:type="spellStart"/>
+            <w:proofErr w:type="gramStart"/>
             <w:r>
               <w:rPr>
                 <w:rFonts w:ascii="Times New Roman" w:hAnsi="Times New Roman" w:cs="Times New Roman"/>
@@ -13759,6 +15716,7 @@
               <w:t>executor.cores</w:t>
             </w:r>
             <w:proofErr w:type="spellEnd"/>
+            <w:proofErr w:type="gramEnd"/>
             <w:r>
               <w:rPr>
                 <w:rFonts w:ascii="Times New Roman" w:hAnsi="Times New Roman" w:cs="Times New Roman"/>
@@ -13772,14 +15730,15 @@
               <w:t xml:space="preserve">4-8 </w:t>
             </w:r>
             <w:proofErr w:type="spellStart"/>
-            <w:r>
-              <w:rPr>
-                <w:rFonts w:ascii="Times New Roman" w:hAnsi="Times New Roman" w:cs="Times New Roman"/>
-              </w:rPr>
-              <w:lastRenderedPageBreak/>
+            <w:proofErr w:type="gramStart"/>
+            <w:r>
+              <w:rPr>
+                <w:rFonts w:ascii="Times New Roman" w:hAnsi="Times New Roman" w:cs="Times New Roman"/>
+              </w:rPr>
               <w:t>num.executors</w:t>
             </w:r>
             <w:proofErr w:type="spellEnd"/>
+            <w:proofErr w:type="gramEnd"/>
             <w:r>
               <w:rPr>
                 <w:rFonts w:ascii="Times New Roman" w:hAnsi="Times New Roman" w:cs="Times New Roman"/>
@@ -13810,6 +15769,7 @@
               </w:rPr>
             </w:pPr>
             <w:proofErr w:type="spellStart"/>
+            <w:proofErr w:type="gramStart"/>
             <w:r>
               <w:rPr>
                 <w:rFonts w:ascii="Times New Roman" w:hAnsi="Times New Roman" w:cs="Times New Roman"/>
@@ -13817,6 +15777,7 @@
               <w:t>spark.rdd.compress</w:t>
             </w:r>
             <w:proofErr w:type="spellEnd"/>
+            <w:proofErr w:type="gramEnd"/>
             <w:r>
               <w:rPr>
                 <w:rFonts w:ascii="Times New Roman" w:hAnsi="Times New Roman" w:cs="Times New Roman"/>
@@ -13843,11 +15804,19 @@
               </w:rPr>
             </w:pPr>
             <w:proofErr w:type="spellStart"/>
-            <w:r>
-              <w:rPr>
-                <w:rFonts w:ascii="Times New Roman" w:hAnsi="Times New Roman" w:cs="Times New Roman"/>
-              </w:rPr>
-              <w:t>spark.shuffle.compress</w:t>
+            <w:proofErr w:type="gramStart"/>
+            <w:r>
+              <w:rPr>
+                <w:rFonts w:ascii="Times New Roman" w:hAnsi="Times New Roman" w:cs="Times New Roman"/>
+              </w:rPr>
+              <w:t>spark.shuffle</w:t>
+            </w:r>
+            <w:proofErr w:type="gramEnd"/>
+            <w:r>
+              <w:rPr>
+                <w:rFonts w:ascii="Times New Roman" w:hAnsi="Times New Roman" w:cs="Times New Roman"/>
+              </w:rPr>
+              <w:t>.compress</w:t>
             </w:r>
             <w:proofErr w:type="spellEnd"/>
             <w:r>
@@ -13876,13 +15845,29 @@
               </w:rPr>
             </w:pPr>
             <w:proofErr w:type="spellStart"/>
-            <w:r>
-              <w:rPr>
-                <w:rFonts w:ascii="Times New Roman" w:hAnsi="Times New Roman" w:cs="Times New Roman"/>
-              </w:rPr>
-              <w:t>spark.shuffle.spill.compress</w:t>
+            <w:proofErr w:type="gramStart"/>
+            <w:r>
+              <w:rPr>
+                <w:rFonts w:ascii="Times New Roman" w:hAnsi="Times New Roman" w:cs="Times New Roman"/>
+              </w:rPr>
+              <w:t>spark.shuffle</w:t>
+            </w:r>
+            <w:proofErr w:type="gramEnd"/>
+            <w:r>
+              <w:rPr>
+                <w:rFonts w:ascii="Times New Roman" w:hAnsi="Times New Roman" w:cs="Times New Roman"/>
+              </w:rPr>
+              <w:t>.</w:t>
+            </w:r>
+            <w:proofErr w:type="gramStart"/>
+            <w:r>
+              <w:rPr>
+                <w:rFonts w:ascii="Times New Roman" w:hAnsi="Times New Roman" w:cs="Times New Roman"/>
+              </w:rPr>
+              <w:t>spill.compress</w:t>
             </w:r>
             <w:proofErr w:type="spellEnd"/>
+            <w:proofErr w:type="gramEnd"/>
             <w:r>
               <w:rPr>
                 <w:rFonts w:ascii="Times New Roman" w:hAnsi="Times New Roman" w:cs="Times New Roman"/>
@@ -13973,11 +15958,19 @@
               </w:rPr>
             </w:pPr>
             <w:proofErr w:type="spellStart"/>
-            <w:r>
-              <w:rPr>
-                <w:rFonts w:ascii="Times New Roman" w:hAnsi="Times New Roman" w:cs="Times New Roman"/>
-              </w:rPr>
-              <w:t>spark.sql.adaptive.enabled</w:t>
+            <w:proofErr w:type="gramStart"/>
+            <w:r>
+              <w:rPr>
+                <w:rFonts w:ascii="Times New Roman" w:hAnsi="Times New Roman" w:cs="Times New Roman"/>
+              </w:rPr>
+              <w:t>spark.sql.adaptive</w:t>
+            </w:r>
+            <w:proofErr w:type="gramEnd"/>
+            <w:r>
+              <w:rPr>
+                <w:rFonts w:ascii="Times New Roman" w:hAnsi="Times New Roman" w:cs="Times New Roman"/>
+              </w:rPr>
+              <w:t>.enabled</w:t>
             </w:r>
             <w:proofErr w:type="spellEnd"/>
             <w:r>
@@ -14095,18 +16088,25 @@
           </w:tcPr>
           <w:p>
             <w:proofErr w:type="spellStart"/>
+            <w:proofErr w:type="gramStart"/>
             <w:r>
               <w:t>spark.speculation</w:t>
             </w:r>
             <w:proofErr w:type="spellEnd"/>
+            <w:proofErr w:type="gramEnd"/>
             <w:r>
               <w:t xml:space="preserve">                   = true</w:t>
             </w:r>
           </w:p>
           <w:p>
             <w:proofErr w:type="spellStart"/>
-            <w:r>
-              <w:t>spark.speculation.quantile</w:t>
+            <w:proofErr w:type="gramStart"/>
+            <w:r>
+              <w:t>spark.speculation</w:t>
+            </w:r>
+            <w:proofErr w:type="gramEnd"/>
+            <w:r>
+              <w:t>.quantile</w:t>
             </w:r>
             <w:proofErr w:type="spellEnd"/>
             <w:r>
@@ -14197,10 +16197,12 @@
           </w:tcPr>
           <w:p>
             <w:proofErr w:type="spellStart"/>
+            <w:proofErr w:type="gramStart"/>
             <w:r>
               <w:t>spark.dynamicAllocation.minExecutors</w:t>
             </w:r>
             <w:proofErr w:type="spellEnd"/>
+            <w:proofErr w:type="gramEnd"/>
             <w:r>
               <w:t xml:space="preserve"> </w:t>
             </w:r>
@@ -14215,10 +16217,12 @@
               <w:t xml:space="preserve">  </w:t>
             </w:r>
             <w:proofErr w:type="spellStart"/>
+            <w:proofErr w:type="gramStart"/>
             <w:r>
               <w:t>spark.dynamicAllocation.maxExecutors</w:t>
             </w:r>
             <w:proofErr w:type="spellEnd"/>
+            <w:proofErr w:type="gramEnd"/>
             <w:r>
               <w:t xml:space="preserve"> = 16</w:t>
             </w:r>
@@ -14301,8 +16305,9 @@
           <w:numId w:val="23"/>
         </w:numPr>
       </w:pPr>
-      <w:bookmarkStart w:id="17" w:name="_Toc227880640"/>
-      <w:r>
+      <w:bookmarkStart w:id="17" w:name="_Toc227907269"/>
+      <w:r>
+        <w:lastRenderedPageBreak/>
         <w:t>Configuration Tuning</w:t>
       </w:r>
       <w:bookmarkEnd w:id="17"/>

</xml_diff>

<commit_message>
Add saltaggregation shuffle analysis in the docs and README
</commit_message>
<xml_diff>
--- a/docs/1. Code and Configuration.docx
+++ b/docs/1. Code and Configuration.docx
@@ -198,7 +198,7 @@
           <w:r>
             <w:fldChar w:fldCharType="separate"/>
           </w:r>
-          <w:hyperlink w:anchor="_Toc227907252" w:history="1">
+          <w:hyperlink w:anchor="_Toc227913237" w:history="1">
             <w:r>
               <w:rPr>
                 <w:rStyle w:val="Hyperlink"/>
@@ -238,7 +238,7 @@
                 <w:noProof/>
                 <w:webHidden/>
               </w:rPr>
-              <w:instrText xml:space="preserve"> PAGEREF _Toc227907252 \h </w:instrText>
+              <w:instrText xml:space="preserve"> PAGEREF _Toc227913237 \h </w:instrText>
             </w:r>
             <w:r>
               <w:rPr>
@@ -280,7 +280,7 @@
               <w:noProof/>
             </w:rPr>
           </w:pPr>
-          <w:hyperlink w:anchor="_Toc227907253" w:history="1">
+          <w:hyperlink w:anchor="_Toc227913238" w:history="1">
             <w:r>
               <w:rPr>
                 <w:rStyle w:val="Hyperlink"/>
@@ -320,7 +320,7 @@
                 <w:noProof/>
                 <w:webHidden/>
               </w:rPr>
-              <w:instrText xml:space="preserve"> PAGEREF _Toc227907253 \h </w:instrText>
+              <w:instrText xml:space="preserve"> PAGEREF _Toc227913238 \h </w:instrText>
             </w:r>
             <w:r>
               <w:rPr>
@@ -362,7 +362,7 @@
               <w:noProof/>
             </w:rPr>
           </w:pPr>
-          <w:hyperlink w:anchor="_Toc227907254" w:history="1">
+          <w:hyperlink w:anchor="_Toc227913239" w:history="1">
             <w:r>
               <w:rPr>
                 <w:rStyle w:val="Hyperlink"/>
@@ -402,7 +402,7 @@
                 <w:noProof/>
                 <w:webHidden/>
               </w:rPr>
-              <w:instrText xml:space="preserve"> PAGEREF _Toc227907254 \h </w:instrText>
+              <w:instrText xml:space="preserve"> PAGEREF _Toc227913239 \h </w:instrText>
             </w:r>
             <w:r>
               <w:rPr>
@@ -443,7 +443,7 @@
               <w:noProof/>
             </w:rPr>
           </w:pPr>
-          <w:hyperlink w:anchor="_Toc227907255" w:history="1">
+          <w:hyperlink w:anchor="_Toc227913240" w:history="1">
             <w:r>
               <w:rPr>
                 <w:rStyle w:val="Hyperlink"/>
@@ -470,7 +470,7 @@
                 <w:noProof/>
                 <w:webHidden/>
               </w:rPr>
-              <w:instrText xml:space="preserve"> PAGEREF _Toc227907255 \h </w:instrText>
+              <w:instrText xml:space="preserve"> PAGEREF _Toc227913240 \h </w:instrText>
             </w:r>
             <w:r>
               <w:rPr>
@@ -512,7 +512,7 @@
               <w:noProof/>
             </w:rPr>
           </w:pPr>
-          <w:hyperlink w:anchor="_Toc227907256" w:history="1">
+          <w:hyperlink w:anchor="_Toc227913241" w:history="1">
             <w:r>
               <w:rPr>
                 <w:rStyle w:val="Hyperlink"/>
@@ -552,7 +552,7 @@
                 <w:noProof/>
                 <w:webHidden/>
               </w:rPr>
-              <w:instrText xml:space="preserve"> PAGEREF _Toc227907256 \h </w:instrText>
+              <w:instrText xml:space="preserve"> PAGEREF _Toc227913241 \h </w:instrText>
             </w:r>
             <w:r>
               <w:rPr>
@@ -594,7 +594,7 @@
               <w:noProof/>
             </w:rPr>
           </w:pPr>
-          <w:hyperlink w:anchor="_Toc227907257" w:history="1">
+          <w:hyperlink w:anchor="_Toc227913242" w:history="1">
             <w:r>
               <w:rPr>
                 <w:rStyle w:val="Hyperlink"/>
@@ -634,7 +634,7 @@
                 <w:noProof/>
                 <w:webHidden/>
               </w:rPr>
-              <w:instrText xml:space="preserve"> PAGEREF _Toc227907257 \h </w:instrText>
+              <w:instrText xml:space="preserve"> PAGEREF _Toc227913242 \h </w:instrText>
             </w:r>
             <w:r>
               <w:rPr>
@@ -675,7 +675,7 @@
               <w:noProof/>
             </w:rPr>
           </w:pPr>
-          <w:hyperlink w:anchor="_Toc227907258" w:history="1">
+          <w:hyperlink w:anchor="_Toc227913243" w:history="1">
             <w:r>
               <w:rPr>
                 <w:rStyle w:val="Hyperlink"/>
@@ -702,7 +702,7 @@
                 <w:noProof/>
                 <w:webHidden/>
               </w:rPr>
-              <w:instrText xml:space="preserve"> PAGEREF _Toc227907258 \h </w:instrText>
+              <w:instrText xml:space="preserve"> PAGEREF _Toc227913243 \h </w:instrText>
             </w:r>
             <w:r>
               <w:rPr>
@@ -744,7 +744,7 @@
               <w:noProof/>
             </w:rPr>
           </w:pPr>
-          <w:hyperlink w:anchor="_Toc227907259" w:history="1">
+          <w:hyperlink w:anchor="_Toc227913244" w:history="1">
             <w:r>
               <w:rPr>
                 <w:rStyle w:val="Hyperlink"/>
@@ -784,7 +784,7 @@
                 <w:noProof/>
                 <w:webHidden/>
               </w:rPr>
-              <w:instrText xml:space="preserve"> PAGEREF _Toc227907259 \h </w:instrText>
+              <w:instrText xml:space="preserve"> PAGEREF _Toc227913244 \h </w:instrText>
             </w:r>
             <w:r>
               <w:rPr>
@@ -804,7 +804,7 @@
                 <w:noProof/>
                 <w:webHidden/>
               </w:rPr>
-              <w:t>8</w:t>
+              <w:t>9</w:t>
             </w:r>
             <w:r>
               <w:rPr>
@@ -825,7 +825,7 @@
               <w:noProof/>
             </w:rPr>
           </w:pPr>
-          <w:hyperlink w:anchor="_Toc227907260" w:history="1">
+          <w:hyperlink w:anchor="_Toc227913245" w:history="1">
             <w:r>
               <w:rPr>
                 <w:rStyle w:val="Hyperlink"/>
@@ -852,7 +852,7 @@
                 <w:noProof/>
                 <w:webHidden/>
               </w:rPr>
-              <w:instrText xml:space="preserve"> PAGEREF _Toc227907260 \h </w:instrText>
+              <w:instrText xml:space="preserve"> PAGEREF _Toc227913245 \h </w:instrText>
             </w:r>
             <w:r>
               <w:rPr>
@@ -872,7 +872,7 @@
                 <w:noProof/>
                 <w:webHidden/>
               </w:rPr>
-              <w:t>8</w:t>
+              <w:t>9</w:t>
             </w:r>
             <w:r>
               <w:rPr>
@@ -893,7 +893,7 @@
               <w:noProof/>
             </w:rPr>
           </w:pPr>
-          <w:hyperlink w:anchor="_Toc227907261" w:history="1">
+          <w:hyperlink w:anchor="_Toc227913246" w:history="1">
             <w:r>
               <w:rPr>
                 <w:rStyle w:val="Hyperlink"/>
@@ -920,7 +920,7 @@
                 <w:noProof/>
                 <w:webHidden/>
               </w:rPr>
-              <w:instrText xml:space="preserve"> PAGEREF _Toc227907261 \h </w:instrText>
+              <w:instrText xml:space="preserve"> PAGEREF _Toc227913246 \h </w:instrText>
             </w:r>
             <w:r>
               <w:rPr>
@@ -940,7 +940,7 @@
                 <w:noProof/>
                 <w:webHidden/>
               </w:rPr>
-              <w:t>8</w:t>
+              <w:t>9</w:t>
             </w:r>
             <w:r>
               <w:rPr>
@@ -961,7 +961,7 @@
               <w:noProof/>
             </w:rPr>
           </w:pPr>
-          <w:hyperlink w:anchor="_Toc227907262" w:history="1">
+          <w:hyperlink w:anchor="_Toc227913247" w:history="1">
             <w:r>
               <w:rPr>
                 <w:rStyle w:val="Hyperlink"/>
@@ -988,7 +988,7 @@
                 <w:noProof/>
                 <w:webHidden/>
               </w:rPr>
-              <w:instrText xml:space="preserve"> PAGEREF _Toc227907262 \h </w:instrText>
+              <w:instrText xml:space="preserve"> PAGEREF _Toc227913247 \h </w:instrText>
             </w:r>
             <w:r>
               <w:rPr>
@@ -1008,7 +1008,7 @@
                 <w:noProof/>
                 <w:webHidden/>
               </w:rPr>
-              <w:t>9</w:t>
+              <w:t>10</w:t>
             </w:r>
             <w:r>
               <w:rPr>
@@ -1029,7 +1029,7 @@
               <w:noProof/>
             </w:rPr>
           </w:pPr>
-          <w:hyperlink w:anchor="_Toc227907263" w:history="1">
+          <w:hyperlink w:anchor="_Toc227913248" w:history="1">
             <w:r>
               <w:rPr>
                 <w:rStyle w:val="Hyperlink"/>
@@ -1056,7 +1056,7 @@
                 <w:noProof/>
                 <w:webHidden/>
               </w:rPr>
-              <w:instrText xml:space="preserve"> PAGEREF _Toc227907263 \h </w:instrText>
+              <w:instrText xml:space="preserve"> PAGEREF _Toc227913248 \h </w:instrText>
             </w:r>
             <w:r>
               <w:rPr>
@@ -1076,7 +1076,7 @@
                 <w:noProof/>
                 <w:webHidden/>
               </w:rPr>
-              <w:t>10</w:t>
+              <w:t>11</w:t>
             </w:r>
             <w:r>
               <w:rPr>
@@ -1098,7 +1098,7 @@
               <w:noProof/>
             </w:rPr>
           </w:pPr>
-          <w:hyperlink w:anchor="_Toc227907264" w:history="1">
+          <w:hyperlink w:anchor="_Toc227913249" w:history="1">
             <w:r>
               <w:rPr>
                 <w:rStyle w:val="Hyperlink"/>
@@ -1138,7 +1138,7 @@
                 <w:noProof/>
                 <w:webHidden/>
               </w:rPr>
-              <w:instrText xml:space="preserve"> PAGEREF _Toc227907264 \h </w:instrText>
+              <w:instrText xml:space="preserve"> PAGEREF _Toc227913249 \h </w:instrText>
             </w:r>
             <w:r>
               <w:rPr>
@@ -1158,7 +1158,7 @@
                 <w:noProof/>
                 <w:webHidden/>
               </w:rPr>
-              <w:t>11</w:t>
+              <w:t>12</w:t>
             </w:r>
             <w:r>
               <w:rPr>
@@ -1180,7 +1180,7 @@
               <w:noProof/>
             </w:rPr>
           </w:pPr>
-          <w:hyperlink w:anchor="_Toc227907265" w:history="1">
+          <w:hyperlink w:anchor="_Toc227913250" w:history="1">
             <w:r>
               <w:rPr>
                 <w:rStyle w:val="Hyperlink"/>
@@ -1220,7 +1220,7 @@
                 <w:noProof/>
                 <w:webHidden/>
               </w:rPr>
-              <w:instrText xml:space="preserve"> PAGEREF _Toc227907265 \h </w:instrText>
+              <w:instrText xml:space="preserve"> PAGEREF _Toc227913250 \h </w:instrText>
             </w:r>
             <w:r>
               <w:rPr>
@@ -1240,7 +1240,7 @@
                 <w:noProof/>
                 <w:webHidden/>
               </w:rPr>
-              <w:t>11</w:t>
+              <w:t>12</w:t>
             </w:r>
             <w:r>
               <w:rPr>
@@ -1261,7 +1261,7 @@
               <w:noProof/>
             </w:rPr>
           </w:pPr>
-          <w:hyperlink w:anchor="_Toc227907266" w:history="1">
+          <w:hyperlink w:anchor="_Toc227913251" w:history="1">
             <w:r>
               <w:rPr>
                 <w:rStyle w:val="Hyperlink"/>
@@ -1288,7 +1288,7 @@
                 <w:noProof/>
                 <w:webHidden/>
               </w:rPr>
-              <w:instrText xml:space="preserve"> PAGEREF _Toc227907266 \h </w:instrText>
+              <w:instrText xml:space="preserve"> PAGEREF _Toc227913251 \h </w:instrText>
             </w:r>
             <w:r>
               <w:rPr>
@@ -1308,7 +1308,7 @@
                 <w:noProof/>
                 <w:webHidden/>
               </w:rPr>
-              <w:t>11</w:t>
+              <w:t>12</w:t>
             </w:r>
             <w:r>
               <w:rPr>
@@ -1329,7 +1329,7 @@
               <w:noProof/>
             </w:rPr>
           </w:pPr>
-          <w:hyperlink w:anchor="_Toc227907267" w:history="1">
+          <w:hyperlink w:anchor="_Toc227913252" w:history="1">
             <w:r>
               <w:rPr>
                 <w:rStyle w:val="Hyperlink"/>
@@ -1356,7 +1356,7 @@
                 <w:noProof/>
                 <w:webHidden/>
               </w:rPr>
-              <w:instrText xml:space="preserve"> PAGEREF _Toc227907267 \h </w:instrText>
+              <w:instrText xml:space="preserve"> PAGEREF _Toc227913252 \h </w:instrText>
             </w:r>
             <w:r>
               <w:rPr>
@@ -1376,7 +1376,7 @@
                 <w:noProof/>
                 <w:webHidden/>
               </w:rPr>
-              <w:t>12</w:t>
+              <w:t>13</w:t>
             </w:r>
             <w:r>
               <w:rPr>
@@ -1398,7 +1398,7 @@
               <w:noProof/>
             </w:rPr>
           </w:pPr>
-          <w:hyperlink w:anchor="_Toc227907268" w:history="1">
+          <w:hyperlink w:anchor="_Toc227913253" w:history="1">
             <w:r>
               <w:rPr>
                 <w:rStyle w:val="Hyperlink"/>
@@ -1410,7 +1410,7 @@
               <w:rPr>
                 <w:noProof/>
               </w:rPr>
-              <w:t xml:space="preserve"> </w:t>
+              <w:tab/>
             </w:r>
             <w:r>
               <w:rPr>
@@ -1438,7 +1438,7 @@
                 <w:noProof/>
                 <w:webHidden/>
               </w:rPr>
-              <w:instrText xml:space="preserve"> PAGEREF _Toc227907268 \h </w:instrText>
+              <w:instrText xml:space="preserve"> PAGEREF _Toc227913253 \h </w:instrText>
             </w:r>
             <w:r>
               <w:rPr>
@@ -1458,7 +1458,7 @@
                 <w:noProof/>
                 <w:webHidden/>
               </w:rPr>
-              <w:t>13</w:t>
+              <w:t>14</w:t>
             </w:r>
             <w:r>
               <w:rPr>
@@ -1480,7 +1480,7 @@
               <w:noProof/>
             </w:rPr>
           </w:pPr>
-          <w:hyperlink w:anchor="_Toc227907269" w:history="1">
+          <w:hyperlink w:anchor="_Toc227913254" w:history="1">
             <w:r>
               <w:rPr>
                 <w:rStyle w:val="Hyperlink"/>
@@ -1492,7 +1492,7 @@
               <w:rPr>
                 <w:noProof/>
               </w:rPr>
-              <w:t xml:space="preserve"> </w:t>
+              <w:tab/>
             </w:r>
             <w:r>
               <w:rPr>
@@ -1520,7 +1520,7 @@
                 <w:noProof/>
                 <w:webHidden/>
               </w:rPr>
-              <w:instrText xml:space="preserve"> PAGEREF _Toc227907269 \h </w:instrText>
+              <w:instrText xml:space="preserve"> PAGEREF _Toc227913254 \h </w:instrText>
             </w:r>
             <w:r>
               <w:rPr>
@@ -1540,7 +1540,7 @@
                 <w:noProof/>
                 <w:webHidden/>
               </w:rPr>
-              <w:t>15</w:t>
+              <w:t>16</w:t>
             </w:r>
             <w:r>
               <w:rPr>
@@ -1598,7 +1598,7 @@
           <w:numId w:val="20"/>
         </w:numPr>
       </w:pPr>
-      <w:bookmarkStart w:id="0" w:name="_Toc227907252"/>
+      <w:bookmarkStart w:id="0" w:name="_Toc227913237"/>
       <w:r>
         <w:lastRenderedPageBreak/>
         <w:t>REQUREMENTS</w:t>
@@ -1616,7 +1616,7 @@
           <w:numId w:val="14"/>
         </w:numPr>
       </w:pPr>
-      <w:bookmarkStart w:id="1" w:name="_Toc227907253"/>
+      <w:bookmarkStart w:id="1" w:name="_Toc227913238"/>
       <w:r>
         <w:t>Objectives</w:t>
       </w:r>
@@ -1832,7 +1832,7 @@
           <w:numId w:val="14"/>
         </w:numPr>
       </w:pPr>
-      <w:bookmarkStart w:id="2" w:name="_Toc227907254"/>
+      <w:bookmarkStart w:id="2" w:name="_Toc227913239"/>
       <w:r>
         <w:t>Constraints</w:t>
       </w:r>
@@ -2097,7 +2097,7 @@
       <w:pPr>
         <w:pStyle w:val="Heading1"/>
       </w:pPr>
-      <w:bookmarkStart w:id="3" w:name="_Toc227907255"/>
+      <w:bookmarkStart w:id="3" w:name="_Toc227913240"/>
       <w:r>
         <w:lastRenderedPageBreak/>
         <w:t xml:space="preserve">2. </w:t>
@@ -2115,7 +2115,7 @@
           <w:numId w:val="15"/>
         </w:numPr>
       </w:pPr>
-      <w:bookmarkStart w:id="4" w:name="_Toc227907256"/>
+      <w:bookmarkStart w:id="4" w:name="_Toc227913241"/>
       <w:r>
         <w:t>Project Structure Design</w:t>
       </w:r>
@@ -3896,7 +3896,7 @@
           <w:numId w:val="15"/>
         </w:numPr>
       </w:pPr>
-      <w:bookmarkStart w:id="5" w:name="_Toc227907257"/>
+      <w:bookmarkStart w:id="5" w:name="_Toc227913242"/>
       <w:r>
         <w:t>Data Pipeline Design</w:t>
       </w:r>
@@ -3978,7 +3978,7 @@
       <w:pPr>
         <w:pStyle w:val="Heading3"/>
       </w:pPr>
-      <w:bookmarkStart w:id="6" w:name="_Toc227907258"/>
+      <w:bookmarkStart w:id="6" w:name="_Toc227913243"/>
       <w:r>
         <w:lastRenderedPageBreak/>
         <w:t xml:space="preserve">2.1.1 </w:t>
@@ -4721,6 +4721,14 @@
         </w:rPr>
         <w:t>)</w:t>
       </w:r>
+      <w:r>
+        <w:rPr>
+          <w:b/>
+          <w:bCs/>
+          <w:u w:val="single"/>
+        </w:rPr>
+        <w:t xml:space="preserve"> for task1_etl_job</w:t>
+      </w:r>
     </w:p>
     <w:p>
       <w:r>
@@ -5085,19 +5093,12 @@
       </w:tr>
     </w:tbl>
     <w:p>
-      <w:pPr>
+      <w:r>
         <w:rPr>
           <w:b/>
           <w:bCs/>
         </w:rPr>
-      </w:pPr>
-    </w:p>
-    <w:p>
-      <w:r>
-        <w:rPr>
-          <w:b/>
-          <w:bCs/>
-        </w:rPr>
+        <w:lastRenderedPageBreak/>
         <w:t>Rationale to use</w:t>
       </w:r>
       <w:r>
@@ -5171,15 +5172,16 @@
           <w:bCs/>
           <w:u w:val="single"/>
         </w:rPr>
-        <w:t xml:space="preserve">Stage </w:t>
-      </w:r>
+        <w:t xml:space="preserve">Stage 2: </w:t>
+      </w:r>
+      <w:proofErr w:type="spellStart"/>
       <w:r>
         <w:rPr>
           <w:b/>
           <w:bCs/>
           <w:u w:val="single"/>
         </w:rPr>
-        <w:t>3</w:t>
+        <w:t>Salted_</w:t>
       </w:r>
       <w:r>
         <w:rPr>
@@ -5187,54 +5189,1875 @@
           <w:bCs/>
           <w:u w:val="single"/>
         </w:rPr>
-        <w:t xml:space="preserve">: </w:t>
-      </w:r>
+        <w:t>Aggregation</w:t>
+      </w:r>
+      <w:proofErr w:type="spellEnd"/>
       <w:r>
         <w:rPr>
           <w:b/>
           <w:bCs/>
           <w:u w:val="single"/>
         </w:rPr>
-        <w:t>Ranking</w:t>
-      </w:r>
+        <w:t xml:space="preserve"> (</w:t>
+      </w:r>
+      <w:proofErr w:type="spellStart"/>
       <w:r>
         <w:rPr>
           <w:b/>
           <w:bCs/>
           <w:u w:val="single"/>
         </w:rPr>
-        <w:t xml:space="preserve"> (</w:t>
-      </w:r>
-      <w:proofErr w:type="spellStart"/>
+        <w:t>Salted</w:t>
+      </w:r>
       <w:r>
         <w:rPr>
           <w:b/>
           <w:bCs/>
           <w:u w:val="single"/>
         </w:rPr>
-        <w:t>Ranking</w:t>
-      </w:r>
+        <w:t>AggregatorTransform</w:t>
+      </w:r>
+      <w:proofErr w:type="spellEnd"/>
       <w:r>
         <w:rPr>
           <w:b/>
           <w:bCs/>
           <w:u w:val="single"/>
         </w:rPr>
-        <w:t>Transform</w:t>
-      </w:r>
-      <w:proofErr w:type="spellEnd"/>
+        <w:t>)</w:t>
+      </w:r>
       <w:r>
         <w:rPr>
           <w:b/>
           <w:bCs/>
           <w:u w:val="single"/>
         </w:rPr>
+        <w:t xml:space="preserve"> for task2_etl_job</w:t>
+      </w:r>
+    </w:p>
+    <w:p>
+      <w:pPr>
+        <w:jc w:val="both"/>
+      </w:pPr>
+      <w:r>
+        <w:t>The s</w:t>
+      </w:r>
+      <w:proofErr w:type="spellStart"/>
+      <w:r>
+        <w:t>alted_aggregation</w:t>
+      </w:r>
+      <w:proofErr w:type="spellEnd"/>
+      <w:r>
+        <w:t xml:space="preserve"> is placed in the second stage (when </w:t>
+      </w:r>
+      <w:r>
+        <w:t>data</w:t>
+      </w:r>
+      <w:r>
+        <w:t xml:space="preserve"> skew is detected) to perform the same count aggregation, </w:t>
+      </w:r>
+      <w:r>
+        <w:t xml:space="preserve">but with </w:t>
+      </w:r>
+      <w:r>
+        <w:t xml:space="preserve">a random salt is appended to each composite key in phase 1 so </w:t>
+      </w:r>
+      <w:r>
+        <w:t>that the dataset is partitioned</w:t>
+      </w:r>
+      <w:r>
+        <w:t xml:space="preserve"> across multiple reducer slots instead of a single one, and phase 2 strips the salt and merges the partial counts. </w:t>
+      </w:r>
+    </w:p>
+    <w:p>
+      <w:pPr>
+        <w:jc w:val="both"/>
+      </w:pPr>
+      <w:r>
+        <w:t xml:space="preserve">The end result is the same as the aggregation performed and provides the count for the ranking. </w:t>
+      </w:r>
+    </w:p>
+    <w:tbl>
+      <w:tblPr>
+        <w:tblStyle w:val="TableGrid"/>
+        <w:tblW w:w="9625" w:type="dxa"/>
+        <w:tblLook w:val="04A0" w:firstRow="1" w:lastRow="0" w:firstColumn="1" w:lastColumn="0" w:noHBand="0" w:noVBand="1"/>
+      </w:tblPr>
+      <w:tblGrid>
+        <w:gridCol w:w="3955"/>
+        <w:gridCol w:w="2790"/>
+        <w:gridCol w:w="2880"/>
+      </w:tblGrid>
+      <w:tr>
+        <w:tc>
+          <w:tcPr>
+            <w:tcW w:w="3955" w:type="dxa"/>
+            <w:shd w:val="clear" w:color="auto" w:fill="F2F2F2" w:themeFill="background1" w:themeFillShade="F2"/>
+          </w:tcPr>
+          <w:p>
+            <w:pPr>
+              <w:rPr>
+                <w:b/>
+                <w:bCs/>
+              </w:rPr>
+            </w:pPr>
+            <w:r>
+              <w:rPr>
+                <w:b/>
+                <w:bCs/>
+              </w:rPr>
+              <w:t>Algorithm</w:t>
+            </w:r>
+          </w:p>
+        </w:tc>
+        <w:tc>
+          <w:tcPr>
+            <w:tcW w:w="2790" w:type="dxa"/>
+            <w:shd w:val="clear" w:color="auto" w:fill="F2F2F2" w:themeFill="background1" w:themeFillShade="F2"/>
+          </w:tcPr>
+          <w:p>
+            <w:pPr>
+              <w:rPr>
+                <w:b/>
+                <w:bCs/>
+              </w:rPr>
+            </w:pPr>
+            <w:r>
+              <w:rPr>
+                <w:b/>
+                <w:bCs/>
+              </w:rPr>
+              <w:t>Output</w:t>
+            </w:r>
+          </w:p>
+        </w:tc>
+        <w:tc>
+          <w:tcPr>
+            <w:tcW w:w="2880" w:type="dxa"/>
+            <w:shd w:val="clear" w:color="auto" w:fill="F2F2F2" w:themeFill="background1" w:themeFillShade="F2"/>
+          </w:tcPr>
+          <w:p>
+            <w:pPr>
+              <w:rPr>
+                <w:b/>
+                <w:bCs/>
+              </w:rPr>
+            </w:pPr>
+            <w:r>
+              <w:rPr>
+                <w:b/>
+                <w:bCs/>
+              </w:rPr>
+              <w:t>Time Complexity</w:t>
+            </w:r>
+          </w:p>
+        </w:tc>
+      </w:tr>
+      <w:tr>
+        <w:tc>
+          <w:tcPr>
+            <w:tcW w:w="3955" w:type="dxa"/>
+          </w:tcPr>
+          <w:p>
+            <w:pPr>
+              <w:rPr>
+                <w:sz w:val="20"/>
+                <w:szCs w:val="20"/>
+              </w:rPr>
+            </w:pPr>
+            <w:r>
+              <w:rPr>
+                <w:sz w:val="20"/>
+                <w:szCs w:val="20"/>
+              </w:rPr>
+              <w:t>Phase 1:</w:t>
+            </w:r>
+          </w:p>
+          <w:p>
+            <w:pPr>
+              <w:rPr>
+                <w:sz w:val="20"/>
+                <w:szCs w:val="20"/>
+              </w:rPr>
+            </w:pPr>
+            <w:r>
+              <w:rPr>
+                <w:sz w:val="20"/>
+                <w:szCs w:val="20"/>
+              </w:rPr>
+              <w:t xml:space="preserve">  </w:t>
+            </w:r>
+            <w:r>
+              <w:rPr>
+                <w:sz w:val="20"/>
+                <w:szCs w:val="20"/>
+              </w:rPr>
+              <w:t xml:space="preserve">Salted = </w:t>
+            </w:r>
+            <w:proofErr w:type="spellStart"/>
+            <w:proofErr w:type="gramStart"/>
+            <w:r>
+              <w:rPr>
+                <w:sz w:val="20"/>
+                <w:szCs w:val="20"/>
+              </w:rPr>
+              <w:t>rdd.map</w:t>
+            </w:r>
+            <w:proofErr w:type="spellEnd"/>
+            <w:r>
+              <w:rPr>
+                <w:sz w:val="20"/>
+                <w:szCs w:val="20"/>
+              </w:rPr>
+              <w:t>(</w:t>
+            </w:r>
+            <w:proofErr w:type="gramEnd"/>
+            <w:r>
+              <w:rPr>
+                <w:sz w:val="20"/>
+                <w:szCs w:val="20"/>
+              </w:rPr>
+              <w:t>lambda row: (</w:t>
+            </w:r>
+          </w:p>
+          <w:p>
+            <w:pPr>
+              <w:rPr>
+                <w:sz w:val="20"/>
+                <w:szCs w:val="20"/>
+              </w:rPr>
+            </w:pPr>
+            <w:r>
+              <w:rPr>
+                <w:sz w:val="20"/>
+                <w:szCs w:val="20"/>
+              </w:rPr>
+              <w:t>                tuple(row[</w:t>
+            </w:r>
+            <w:proofErr w:type="spellStart"/>
+            <w:r>
+              <w:rPr>
+                <w:sz w:val="20"/>
+                <w:szCs w:val="20"/>
+              </w:rPr>
+              <w:t>i</w:t>
+            </w:r>
+            <w:proofErr w:type="spellEnd"/>
+            <w:r>
+              <w:rPr>
+                <w:sz w:val="20"/>
+                <w:szCs w:val="20"/>
+              </w:rPr>
+              <w:t xml:space="preserve">] for </w:t>
+            </w:r>
+            <w:proofErr w:type="spellStart"/>
+            <w:r>
+              <w:rPr>
+                <w:sz w:val="20"/>
+                <w:szCs w:val="20"/>
+              </w:rPr>
+              <w:t>i</w:t>
+            </w:r>
+            <w:proofErr w:type="spellEnd"/>
+            <w:r>
+              <w:rPr>
+                <w:sz w:val="20"/>
+                <w:szCs w:val="20"/>
+              </w:rPr>
+              <w:t xml:space="preserve"> in indices) + (</w:t>
+            </w:r>
+          </w:p>
+          <w:p>
+            <w:pPr>
+              <w:rPr>
+                <w:sz w:val="20"/>
+                <w:szCs w:val="20"/>
+              </w:rPr>
+            </w:pPr>
+            <w:r>
+              <w:rPr>
+                <w:sz w:val="20"/>
+                <w:szCs w:val="20"/>
+              </w:rPr>
+              <w:t xml:space="preserve">                    </w:t>
+            </w:r>
+            <w:proofErr w:type="spellStart"/>
+            <w:proofErr w:type="gramStart"/>
+            <w:r>
+              <w:rPr>
+                <w:sz w:val="20"/>
+                <w:szCs w:val="20"/>
+              </w:rPr>
+              <w:t>random.randint</w:t>
+            </w:r>
+            <w:proofErr w:type="spellEnd"/>
+            <w:proofErr w:type="gramEnd"/>
+            <w:r>
+              <w:rPr>
+                <w:sz w:val="20"/>
+                <w:szCs w:val="20"/>
+              </w:rPr>
+              <w:t xml:space="preserve">(0, </w:t>
+            </w:r>
+            <w:proofErr w:type="spellStart"/>
+            <w:r>
+              <w:rPr>
+                <w:sz w:val="20"/>
+                <w:szCs w:val="20"/>
+              </w:rPr>
+              <w:t>num_salts</w:t>
+            </w:r>
+            <w:proofErr w:type="spellEnd"/>
+            <w:r>
+              <w:rPr>
+                <w:sz w:val="20"/>
+                <w:szCs w:val="20"/>
+              </w:rPr>
+              <w:t xml:space="preserve"> - 1),</w:t>
+            </w:r>
+          </w:p>
+          <w:p>
+            <w:pPr>
+              <w:rPr>
+                <w:sz w:val="20"/>
+                <w:szCs w:val="20"/>
+              </w:rPr>
+            </w:pPr>
+            <w:r>
+              <w:rPr>
+                <w:sz w:val="20"/>
+                <w:szCs w:val="20"/>
+              </w:rPr>
+              <w:t>                ),</w:t>
+            </w:r>
+          </w:p>
+          <w:p>
+            <w:pPr>
+              <w:rPr>
+                <w:sz w:val="20"/>
+                <w:szCs w:val="20"/>
+              </w:rPr>
+            </w:pPr>
+            <w:r>
+              <w:rPr>
+                <w:sz w:val="20"/>
+                <w:szCs w:val="20"/>
+              </w:rPr>
+              <w:t>                1,</w:t>
+            </w:r>
+          </w:p>
+          <w:p>
+            <w:pPr>
+              <w:rPr>
+                <w:sz w:val="20"/>
+                <w:szCs w:val="20"/>
+              </w:rPr>
+            </w:pPr>
+            <w:r>
+              <w:rPr>
+                <w:sz w:val="20"/>
+                <w:szCs w:val="20"/>
+              </w:rPr>
+              <w:t>            )</w:t>
+            </w:r>
+            <w:proofErr w:type="gramStart"/>
+            <w:r>
+              <w:rPr>
+                <w:sz w:val="20"/>
+                <w:szCs w:val="20"/>
+              </w:rPr>
+              <w:t>).</w:t>
+            </w:r>
+            <w:proofErr w:type="spellStart"/>
+            <w:r>
+              <w:rPr>
+                <w:sz w:val="20"/>
+                <w:szCs w:val="20"/>
+              </w:rPr>
+              <w:t>reduceByKey</w:t>
+            </w:r>
+            <w:proofErr w:type="spellEnd"/>
+            <w:proofErr w:type="gramEnd"/>
+            <w:r>
+              <w:rPr>
+                <w:sz w:val="20"/>
+                <w:szCs w:val="20"/>
+              </w:rPr>
+              <w:t>(add)</w:t>
+            </w:r>
+          </w:p>
+          <w:p>
+            <w:pPr>
+              <w:rPr>
+                <w:sz w:val="20"/>
+                <w:szCs w:val="20"/>
+              </w:rPr>
+            </w:pPr>
+          </w:p>
+          <w:p>
+            <w:pPr>
+              <w:rPr>
+                <w:sz w:val="20"/>
+                <w:szCs w:val="20"/>
+              </w:rPr>
+            </w:pPr>
+            <w:r>
+              <w:rPr>
+                <w:sz w:val="20"/>
+                <w:szCs w:val="20"/>
+              </w:rPr>
+              <w:t>Phase 2:</w:t>
+            </w:r>
+          </w:p>
+          <w:p>
+            <w:pPr>
+              <w:rPr>
+                <w:sz w:val="20"/>
+                <w:szCs w:val="20"/>
+              </w:rPr>
+            </w:pPr>
+            <w:r>
+              <w:rPr>
+                <w:sz w:val="20"/>
+                <w:szCs w:val="20"/>
+              </w:rPr>
+              <w:t xml:space="preserve">    </w:t>
+            </w:r>
+            <w:proofErr w:type="spellStart"/>
+            <w:proofErr w:type="gramStart"/>
+            <w:r>
+              <w:rPr>
+                <w:sz w:val="20"/>
+                <w:szCs w:val="20"/>
+              </w:rPr>
+              <w:t>salte</w:t>
+            </w:r>
+            <w:r>
+              <w:rPr>
+                <w:sz w:val="20"/>
+                <w:szCs w:val="20"/>
+              </w:rPr>
+              <w:t>d</w:t>
+            </w:r>
+            <w:r>
+              <w:rPr>
+                <w:sz w:val="20"/>
+                <w:szCs w:val="20"/>
+              </w:rPr>
+              <w:t>.map</w:t>
+            </w:r>
+            <w:proofErr w:type="spellEnd"/>
+            <w:r>
+              <w:rPr>
+                <w:sz w:val="20"/>
+                <w:szCs w:val="20"/>
+              </w:rPr>
+              <w:t>(</w:t>
+            </w:r>
+            <w:proofErr w:type="gramEnd"/>
+            <w:r>
+              <w:rPr>
+                <w:sz w:val="20"/>
+                <w:szCs w:val="20"/>
+              </w:rPr>
+              <w:t xml:space="preserve">lambda </w:t>
+            </w:r>
+            <w:proofErr w:type="spellStart"/>
+            <w:r>
+              <w:rPr>
+                <w:sz w:val="20"/>
+                <w:szCs w:val="20"/>
+              </w:rPr>
+              <w:t>kv</w:t>
+            </w:r>
+            <w:proofErr w:type="spellEnd"/>
+            <w:r>
+              <w:rPr>
+                <w:sz w:val="20"/>
+                <w:szCs w:val="20"/>
+              </w:rPr>
+              <w:t>: (</w:t>
+            </w:r>
+            <w:proofErr w:type="spellStart"/>
+            <w:proofErr w:type="gramStart"/>
+            <w:r>
+              <w:rPr>
+                <w:sz w:val="20"/>
+                <w:szCs w:val="20"/>
+              </w:rPr>
+              <w:t>kv</w:t>
+            </w:r>
+            <w:proofErr w:type="spellEnd"/>
+            <w:r>
+              <w:rPr>
+                <w:sz w:val="20"/>
+                <w:szCs w:val="20"/>
+              </w:rPr>
+              <w:t>[0][</w:t>
+            </w:r>
+            <w:proofErr w:type="gramEnd"/>
+            <w:r>
+              <w:rPr>
+                <w:sz w:val="20"/>
+                <w:szCs w:val="20"/>
+              </w:rPr>
+              <w:t xml:space="preserve">:-1], </w:t>
+            </w:r>
+            <w:proofErr w:type="spellStart"/>
+            <w:proofErr w:type="gramStart"/>
+            <w:r>
+              <w:rPr>
+                <w:sz w:val="20"/>
+                <w:szCs w:val="20"/>
+              </w:rPr>
+              <w:t>kv</w:t>
+            </w:r>
+            <w:proofErr w:type="spellEnd"/>
+            <w:r>
+              <w:rPr>
+                <w:sz w:val="20"/>
+                <w:szCs w:val="20"/>
+              </w:rPr>
+              <w:t>[</w:t>
+            </w:r>
+            <w:proofErr w:type="gramEnd"/>
+            <w:r>
+              <w:rPr>
+                <w:sz w:val="20"/>
+                <w:szCs w:val="20"/>
+              </w:rPr>
+              <w:t>1]))</w:t>
+            </w:r>
+          </w:p>
+          <w:p>
+            <w:pPr>
+              <w:rPr>
+                <w:sz w:val="20"/>
+                <w:szCs w:val="20"/>
+              </w:rPr>
+            </w:pPr>
+            <w:r>
+              <w:rPr>
+                <w:sz w:val="20"/>
+                <w:szCs w:val="20"/>
+              </w:rPr>
+              <w:t xml:space="preserve">            </w:t>
+            </w:r>
+            <w:proofErr w:type="gramStart"/>
+            <w:r>
+              <w:rPr>
+                <w:sz w:val="20"/>
+                <w:szCs w:val="20"/>
+              </w:rPr>
+              <w:t>.</w:t>
+            </w:r>
+            <w:proofErr w:type="spellStart"/>
+            <w:r>
+              <w:rPr>
+                <w:sz w:val="20"/>
+                <w:szCs w:val="20"/>
+              </w:rPr>
+              <w:t>reduceByKey</w:t>
+            </w:r>
+            <w:proofErr w:type="spellEnd"/>
+            <w:proofErr w:type="gramEnd"/>
+            <w:r>
+              <w:rPr>
+                <w:sz w:val="20"/>
+                <w:szCs w:val="20"/>
+              </w:rPr>
+              <w:t>(add)</w:t>
+            </w:r>
+          </w:p>
+          <w:p>
+            <w:pPr>
+              <w:rPr>
+                <w:sz w:val="20"/>
+                <w:szCs w:val="20"/>
+              </w:rPr>
+            </w:pPr>
+          </w:p>
+        </w:tc>
+        <w:tc>
+          <w:tcPr>
+            <w:tcW w:w="2790" w:type="dxa"/>
+          </w:tcPr>
+          <w:p>
+            <w:pPr>
+              <w:rPr>
+                <w:rFonts w:ascii="Times New Roman" w:hAnsi="Times New Roman" w:cs="Times New Roman"/>
+                <w:sz w:val="20"/>
+                <w:szCs w:val="20"/>
+              </w:rPr>
+            </w:pPr>
+            <w:proofErr w:type="gramStart"/>
+            <w:r>
+              <w:rPr>
+                <w:rFonts w:ascii="Times New Roman" w:hAnsi="Times New Roman" w:cs="Times New Roman"/>
+                <w:sz w:val="20"/>
+                <w:szCs w:val="20"/>
+              </w:rPr>
+              <w:t>(</w:t>
+            </w:r>
+            <w:r>
+              <w:rPr>
+                <w:rFonts w:ascii="Times New Roman" w:hAnsi="Times New Roman" w:cs="Times New Roman"/>
+                <w:sz w:val="20"/>
+                <w:szCs w:val="20"/>
+              </w:rPr>
+              <w:t xml:space="preserve"> </w:t>
+            </w:r>
+            <w:r>
+              <w:rPr>
+                <w:rFonts w:ascii="Times New Roman" w:hAnsi="Times New Roman" w:cs="Times New Roman"/>
+                <w:sz w:val="20"/>
+                <w:szCs w:val="20"/>
+              </w:rPr>
+              <w:t>(</w:t>
+            </w:r>
+            <w:proofErr w:type="spellStart"/>
+            <w:proofErr w:type="gramEnd"/>
+            <w:r>
+              <w:rPr>
+                <w:rFonts w:ascii="Times New Roman" w:hAnsi="Times New Roman" w:cs="Times New Roman"/>
+                <w:sz w:val="20"/>
+                <w:szCs w:val="20"/>
+              </w:rPr>
+              <w:t>geo_oid</w:t>
+            </w:r>
+            <w:proofErr w:type="spellEnd"/>
+            <w:r>
+              <w:rPr>
+                <w:rFonts w:ascii="Times New Roman" w:hAnsi="Times New Roman" w:cs="Times New Roman"/>
+                <w:sz w:val="20"/>
+                <w:szCs w:val="20"/>
+              </w:rPr>
+              <w:t xml:space="preserve">, </w:t>
+            </w:r>
+            <w:proofErr w:type="spellStart"/>
+            <w:r>
+              <w:rPr>
+                <w:rFonts w:ascii="Times New Roman" w:hAnsi="Times New Roman" w:cs="Times New Roman"/>
+                <w:sz w:val="20"/>
+                <w:szCs w:val="20"/>
+              </w:rPr>
+              <w:t>item_name</w:t>
+            </w:r>
+            <w:proofErr w:type="spellEnd"/>
+            <w:r>
+              <w:rPr>
+                <w:rFonts w:ascii="Times New Roman" w:hAnsi="Times New Roman" w:cs="Times New Roman"/>
+                <w:sz w:val="20"/>
+                <w:szCs w:val="20"/>
+              </w:rPr>
+              <w:t>), count)</w:t>
+            </w:r>
+          </w:p>
+          <w:p>
+            <w:pPr>
+              <w:rPr>
+                <w:b/>
+                <w:bCs/>
+                <w:sz w:val="20"/>
+                <w:szCs w:val="20"/>
+              </w:rPr>
+            </w:pPr>
+          </w:p>
+        </w:tc>
+        <w:tc>
+          <w:tcPr>
+            <w:tcW w:w="2880" w:type="dxa"/>
+          </w:tcPr>
+          <w:p>
+            <w:pPr>
+              <w:rPr>
+                <w:sz w:val="20"/>
+                <w:szCs w:val="20"/>
+              </w:rPr>
+            </w:pPr>
+            <w:r>
+              <w:rPr>
+                <w:sz w:val="20"/>
+                <w:szCs w:val="20"/>
+              </w:rPr>
+              <w:t xml:space="preserve">O(n) time, 2 shuffle stages, </w:t>
+            </w:r>
+          </w:p>
+          <w:p>
+            <w:pPr>
+              <w:rPr>
+                <w:sz w:val="20"/>
+                <w:szCs w:val="20"/>
+              </w:rPr>
+            </w:pPr>
+          </w:p>
+          <w:p>
+            <w:pPr>
+              <w:rPr>
+                <w:sz w:val="20"/>
+                <w:szCs w:val="20"/>
+              </w:rPr>
+            </w:pPr>
+            <w:r>
+              <w:rPr>
+                <w:sz w:val="20"/>
+                <w:szCs w:val="20"/>
+              </w:rPr>
+              <w:t>P</w:t>
+            </w:r>
+            <w:r>
+              <w:rPr>
+                <w:sz w:val="20"/>
+                <w:szCs w:val="20"/>
+              </w:rPr>
+              <w:t>hase</w:t>
+            </w:r>
+            <w:r>
+              <w:rPr>
+                <w:sz w:val="20"/>
+                <w:szCs w:val="20"/>
+              </w:rPr>
+              <w:t xml:space="preserve"> </w:t>
+            </w:r>
+            <w:r>
+              <w:rPr>
+                <w:sz w:val="20"/>
+                <w:szCs w:val="20"/>
+              </w:rPr>
+              <w:t>2</w:t>
+            </w:r>
+            <w:r>
+              <w:rPr>
+                <w:sz w:val="20"/>
+                <w:szCs w:val="20"/>
+              </w:rPr>
+              <w:t>:</w:t>
+            </w:r>
+            <w:r>
+              <w:rPr>
+                <w:sz w:val="20"/>
+                <w:szCs w:val="20"/>
+              </w:rPr>
+              <w:t xml:space="preserve"> input size </w:t>
+            </w:r>
+            <w:proofErr w:type="gramStart"/>
+            <w:r>
+              <w:rPr>
+                <w:sz w:val="20"/>
+                <w:szCs w:val="20"/>
+              </w:rPr>
+              <w:t>O(</w:t>
+            </w:r>
+            <w:proofErr w:type="gramEnd"/>
+            <w:r>
+              <w:rPr>
+                <w:sz w:val="20"/>
+                <w:szCs w:val="20"/>
+              </w:rPr>
+              <w:t xml:space="preserve">|K| * </w:t>
+            </w:r>
+            <w:proofErr w:type="spellStart"/>
+            <w:r>
+              <w:rPr>
+                <w:sz w:val="20"/>
+                <w:szCs w:val="20"/>
+              </w:rPr>
+              <w:t>num_salts</w:t>
+            </w:r>
+            <w:proofErr w:type="spellEnd"/>
+            <w:r>
+              <w:rPr>
+                <w:sz w:val="20"/>
+                <w:szCs w:val="20"/>
+              </w:rPr>
+              <w:t>)</w:t>
+            </w:r>
+          </w:p>
+          <w:p>
+            <w:pPr>
+              <w:rPr>
+                <w:sz w:val="20"/>
+                <w:szCs w:val="20"/>
+              </w:rPr>
+            </w:pPr>
+            <w:r>
+              <w:rPr>
+                <w:sz w:val="20"/>
+                <w:szCs w:val="20"/>
+              </w:rPr>
+              <w:t>w</w:t>
+            </w:r>
+            <w:r>
+              <w:rPr>
+                <w:sz w:val="20"/>
+                <w:szCs w:val="20"/>
+              </w:rPr>
+              <w:t>here:</w:t>
+            </w:r>
+          </w:p>
+          <w:p>
+            <w:pPr>
+              <w:numPr>
+                <w:ilvl w:val="0"/>
+                <w:numId w:val="26"/>
+              </w:numPr>
+              <w:tabs>
+                <w:tab w:val="clear" w:pos="360"/>
+                <w:tab w:val="num" w:pos="720"/>
+              </w:tabs>
+              <w:spacing w:after="160" w:line="278" w:lineRule="auto"/>
+              <w:rPr>
+                <w:sz w:val="20"/>
+                <w:szCs w:val="20"/>
+              </w:rPr>
+            </w:pPr>
+            <w:r>
+              <w:rPr>
+                <w:sz w:val="20"/>
+                <w:szCs w:val="20"/>
+              </w:rPr>
+              <w:t>|K| = the cardinality (size) of that set — the number of distinct keys.</w:t>
+            </w:r>
+          </w:p>
+          <w:p>
+            <w:pPr>
+              <w:numPr>
+                <w:ilvl w:val="0"/>
+                <w:numId w:val="26"/>
+              </w:numPr>
+              <w:tabs>
+                <w:tab w:val="clear" w:pos="360"/>
+                <w:tab w:val="num" w:pos="720"/>
+              </w:tabs>
+              <w:spacing w:after="160" w:line="278" w:lineRule="auto"/>
+              <w:rPr>
+                <w:sz w:val="20"/>
+                <w:szCs w:val="20"/>
+              </w:rPr>
+            </w:pPr>
+            <w:proofErr w:type="spellStart"/>
+            <w:r>
+              <w:rPr>
+                <w:sz w:val="20"/>
+                <w:szCs w:val="20"/>
+              </w:rPr>
+              <w:t>num_salts</w:t>
+            </w:r>
+            <w:proofErr w:type="spellEnd"/>
+            <w:r>
+              <w:rPr>
+                <w:sz w:val="20"/>
+                <w:szCs w:val="20"/>
+              </w:rPr>
+              <w:t> = how many salt buckets each key is split into during phase 1.</w:t>
+            </w:r>
+          </w:p>
+        </w:tc>
+      </w:tr>
+    </w:tbl>
+    <w:p>
+      <w:pPr>
+        <w:rPr>
+          <w:b/>
+          <w:bCs/>
+          <w:u w:val="single"/>
+        </w:rPr>
+      </w:pPr>
+    </w:p>
+    <w:p>
+      <w:r>
+        <w:rPr>
+          <w:b/>
+          <w:bCs/>
+        </w:rPr>
+        <w:t>Rationale to use</w:t>
+      </w:r>
+      <w:r>
+        <w:rPr>
+          <w:b/>
+          <w:bCs/>
+        </w:rPr>
+        <w:t xml:space="preserve"> </w:t>
+      </w:r>
+      <w:r>
+        <w:rPr>
+          <w:b/>
+          <w:bCs/>
+        </w:rPr>
+        <w:t>two-phases approach:</w:t>
+      </w:r>
+    </w:p>
+    <w:p>
+      <w:pPr>
+        <w:pStyle w:val="ListParagraph"/>
+        <w:numPr>
+          <w:ilvl w:val="0"/>
+          <w:numId w:val="8"/>
+        </w:numPr>
+      </w:pPr>
+      <w:r>
+        <w:t>Without performing salting first, all of the dataset may send to the same reducer, becomes bottleneck and slow down the entire operation.</w:t>
+      </w:r>
+    </w:p>
+    <w:p>
+      <w:pPr>
+        <w:pStyle w:val="ListParagraph"/>
+        <w:numPr>
+          <w:ilvl w:val="0"/>
+          <w:numId w:val="8"/>
+        </w:numPr>
+      </w:pPr>
+      <w:r>
+        <w:t xml:space="preserve">Operator(add) in phase 1 adds up the count locally on each partition, </w:t>
+      </w:r>
+      <w:r>
+        <w:t>thus reduce network I/O</w:t>
+      </w:r>
+      <w:r>
+        <w:t xml:space="preserve"> before shuffling. The number of rows send are distinct keys * </w:t>
+      </w:r>
+      <w:proofErr w:type="spellStart"/>
+      <w:r>
+        <w:t>num_salts</w:t>
+      </w:r>
+      <w:proofErr w:type="spellEnd"/>
+      <w:r>
+        <w:t xml:space="preserve"> after salting.</w:t>
+      </w:r>
+    </w:p>
+    <w:p>
+      <w:pPr>
+        <w:pStyle w:val="ListParagraph"/>
+        <w:numPr>
+          <w:ilvl w:val="0"/>
+          <w:numId w:val="8"/>
+        </w:numPr>
+      </w:pPr>
+      <w:r>
+        <w:t xml:space="preserve">Phase 2 is identical to the aggregation performed in task1_etl_job by adding the remaining counts (after phase 1 summation) after removing the salt. </w:t>
+      </w:r>
+    </w:p>
+    <w:p>
+      <w:pPr>
+        <w:rPr>
+          <w:b/>
+          <w:bCs/>
+          <w:u w:val="single"/>
+        </w:rPr>
+      </w:pPr>
+    </w:p>
+    <w:p>
+      <w:pPr>
+        <w:rPr>
+          <w:b/>
+          <w:bCs/>
+          <w:u w:val="single"/>
+        </w:rPr>
+      </w:pPr>
+    </w:p>
+    <w:p>
+      <w:pPr>
+        <w:rPr>
+          <w:b/>
+          <w:bCs/>
+          <w:u w:val="single"/>
+        </w:rPr>
+      </w:pPr>
+      <w:r>
+        <w:rPr>
+          <w:b/>
+          <w:bCs/>
+          <w:u w:val="single"/>
+        </w:rPr>
+        <w:lastRenderedPageBreak/>
+        <w:t xml:space="preserve">Stage </w:t>
+      </w:r>
+      <w:r>
+        <w:rPr>
+          <w:b/>
+          <w:bCs/>
+          <w:u w:val="single"/>
+        </w:rPr>
+        <w:t>3</w:t>
+      </w:r>
+      <w:r>
+        <w:rPr>
+          <w:b/>
+          <w:bCs/>
+          <w:u w:val="single"/>
+        </w:rPr>
+        <w:t xml:space="preserve">: </w:t>
+      </w:r>
+      <w:r>
+        <w:rPr>
+          <w:b/>
+          <w:bCs/>
+          <w:u w:val="single"/>
+        </w:rPr>
+        <w:t>Ranking</w:t>
+      </w:r>
+      <w:r>
+        <w:rPr>
+          <w:b/>
+          <w:bCs/>
+          <w:u w:val="single"/>
+        </w:rPr>
+        <w:t xml:space="preserve"> (</w:t>
+      </w:r>
+      <w:proofErr w:type="spellStart"/>
+      <w:r>
+        <w:rPr>
+          <w:b/>
+          <w:bCs/>
+          <w:u w:val="single"/>
+        </w:rPr>
+        <w:t>Ranking</w:t>
+      </w:r>
+      <w:r>
+        <w:rPr>
+          <w:b/>
+          <w:bCs/>
+          <w:u w:val="single"/>
+        </w:rPr>
+        <w:t>Transform</w:t>
+      </w:r>
+      <w:proofErr w:type="spellEnd"/>
+      <w:r>
+        <w:rPr>
+          <w:b/>
+          <w:bCs/>
+          <w:u w:val="single"/>
+        </w:rPr>
         <w:t>)</w:t>
       </w:r>
     </w:p>
     <w:p>
       <w:r>
         <w:t>This Ranking is placed in the third stage to sort the count across the entire dataset as per required for the output.</w:t>
+      </w:r>
+    </w:p>
+    <w:tbl>
+      <w:tblPr>
+        <w:tblStyle w:val="TableGrid"/>
+        <w:tblW w:w="9625" w:type="dxa"/>
+        <w:tblLook w:val="04A0" w:firstRow="1" w:lastRow="0" w:firstColumn="1" w:lastColumn="0" w:noHBand="0" w:noVBand="1"/>
+      </w:tblPr>
+      <w:tblGrid>
+        <w:gridCol w:w="4045"/>
+        <w:gridCol w:w="2700"/>
+        <w:gridCol w:w="2880"/>
+      </w:tblGrid>
+      <w:tr>
+        <w:tc>
+          <w:tcPr>
+            <w:tcW w:w="4045" w:type="dxa"/>
+            <w:shd w:val="clear" w:color="auto" w:fill="F2F2F2" w:themeFill="background1" w:themeFillShade="F2"/>
+          </w:tcPr>
+          <w:p>
+            <w:pPr>
+              <w:rPr>
+                <w:b/>
+                <w:bCs/>
+              </w:rPr>
+            </w:pPr>
+            <w:r>
+              <w:rPr>
+                <w:b/>
+                <w:bCs/>
+              </w:rPr>
+              <w:t>Algorithm</w:t>
+            </w:r>
+          </w:p>
+        </w:tc>
+        <w:tc>
+          <w:tcPr>
+            <w:tcW w:w="2700" w:type="dxa"/>
+            <w:shd w:val="clear" w:color="auto" w:fill="F2F2F2" w:themeFill="background1" w:themeFillShade="F2"/>
+          </w:tcPr>
+          <w:p>
+            <w:pPr>
+              <w:rPr>
+                <w:b/>
+                <w:bCs/>
+              </w:rPr>
+            </w:pPr>
+            <w:r>
+              <w:rPr>
+                <w:b/>
+                <w:bCs/>
+              </w:rPr>
+              <w:t>Output</w:t>
+            </w:r>
+          </w:p>
+        </w:tc>
+        <w:tc>
+          <w:tcPr>
+            <w:tcW w:w="2880" w:type="dxa"/>
+            <w:shd w:val="clear" w:color="auto" w:fill="F2F2F2" w:themeFill="background1" w:themeFillShade="F2"/>
+          </w:tcPr>
+          <w:p>
+            <w:pPr>
+              <w:rPr>
+                <w:b/>
+                <w:bCs/>
+              </w:rPr>
+            </w:pPr>
+            <w:r>
+              <w:rPr>
+                <w:b/>
+                <w:bCs/>
+              </w:rPr>
+              <w:t xml:space="preserve">Time </w:t>
+            </w:r>
+            <w:r>
+              <w:rPr>
+                <w:b/>
+                <w:bCs/>
+              </w:rPr>
+              <w:t>Complexity</w:t>
+            </w:r>
+          </w:p>
+        </w:tc>
+      </w:tr>
+      <w:tr>
+        <w:tc>
+          <w:tcPr>
+            <w:tcW w:w="4045" w:type="dxa"/>
+          </w:tcPr>
+          <w:p>
+            <w:pPr>
+              <w:rPr>
+                <w:sz w:val="20"/>
+                <w:szCs w:val="20"/>
+              </w:rPr>
+            </w:pPr>
+            <w:proofErr w:type="spellStart"/>
+            <w:proofErr w:type="gramStart"/>
+            <w:r>
+              <w:rPr>
+                <w:sz w:val="20"/>
+                <w:szCs w:val="20"/>
+              </w:rPr>
+              <w:t>rdd.map</w:t>
+            </w:r>
+            <w:proofErr w:type="spellEnd"/>
+            <w:r>
+              <w:rPr>
+                <w:sz w:val="20"/>
+                <w:szCs w:val="20"/>
+              </w:rPr>
+              <w:t>(</w:t>
+            </w:r>
+            <w:proofErr w:type="spellStart"/>
+            <w:proofErr w:type="gramEnd"/>
+            <w:r>
+              <w:rPr>
+                <w:sz w:val="20"/>
+                <w:szCs w:val="20"/>
+              </w:rPr>
+              <w:t>kv</w:t>
+            </w:r>
+            <w:proofErr w:type="spellEnd"/>
+            <w:r>
+              <w:rPr>
+                <w:sz w:val="20"/>
+                <w:szCs w:val="20"/>
+              </w:rPr>
+              <w:t xml:space="preserve"> -&gt; </w:t>
+            </w:r>
+          </w:p>
+          <w:p>
+            <w:pPr>
+              <w:rPr>
+                <w:sz w:val="20"/>
+                <w:szCs w:val="20"/>
+              </w:rPr>
+            </w:pPr>
+            <w:r>
+              <w:rPr>
+                <w:sz w:val="20"/>
+                <w:szCs w:val="20"/>
+              </w:rPr>
+              <w:t xml:space="preserve">  </w:t>
+            </w:r>
+            <w:r>
+              <w:rPr>
+                <w:sz w:val="20"/>
+                <w:szCs w:val="20"/>
+              </w:rPr>
+              <w:t>(</w:t>
+            </w:r>
+            <w:proofErr w:type="spellStart"/>
+            <w:r>
+              <w:rPr>
+                <w:sz w:val="20"/>
+                <w:szCs w:val="20"/>
+              </w:rPr>
+              <w:t>geo_oid</w:t>
+            </w:r>
+            <w:proofErr w:type="spellEnd"/>
+            <w:r>
+              <w:rPr>
+                <w:sz w:val="20"/>
+                <w:szCs w:val="20"/>
+              </w:rPr>
+              <w:t>, (</w:t>
+            </w:r>
+            <w:proofErr w:type="spellStart"/>
+            <w:r>
+              <w:rPr>
+                <w:sz w:val="20"/>
+                <w:szCs w:val="20"/>
+              </w:rPr>
+              <w:t>item_name</w:t>
+            </w:r>
+            <w:proofErr w:type="spellEnd"/>
+            <w:r>
+              <w:rPr>
+                <w:sz w:val="20"/>
+                <w:szCs w:val="20"/>
+              </w:rPr>
+              <w:t>, count)))</w:t>
+            </w:r>
+          </w:p>
+          <w:p>
+            <w:pPr>
+              <w:rPr>
+                <w:sz w:val="20"/>
+                <w:szCs w:val="20"/>
+              </w:rPr>
+            </w:pPr>
+            <w:r>
+              <w:rPr>
+                <w:sz w:val="20"/>
+                <w:szCs w:val="20"/>
+              </w:rPr>
+              <w:t>   </w:t>
+            </w:r>
+            <w:proofErr w:type="gramStart"/>
+            <w:r>
+              <w:rPr>
+                <w:sz w:val="20"/>
+                <w:szCs w:val="20"/>
+              </w:rPr>
+              <w:t>.</w:t>
+            </w:r>
+            <w:proofErr w:type="spellStart"/>
+            <w:r>
+              <w:rPr>
+                <w:sz w:val="20"/>
+                <w:szCs w:val="20"/>
+              </w:rPr>
+              <w:t>groupByKey</w:t>
+            </w:r>
+            <w:proofErr w:type="spellEnd"/>
+            <w:proofErr w:type="gramEnd"/>
+            <w:r>
+              <w:rPr>
+                <w:sz w:val="20"/>
+                <w:szCs w:val="20"/>
+              </w:rPr>
+              <w:t>()</w:t>
+            </w:r>
+          </w:p>
+          <w:p>
+            <w:pPr>
+              <w:rPr>
+                <w:sz w:val="20"/>
+                <w:szCs w:val="20"/>
+              </w:rPr>
+            </w:pPr>
+            <w:r>
+              <w:rPr>
+                <w:sz w:val="20"/>
+                <w:szCs w:val="20"/>
+              </w:rPr>
+              <w:t>   </w:t>
+            </w:r>
+            <w:proofErr w:type="gramStart"/>
+            <w:r>
+              <w:rPr>
+                <w:sz w:val="20"/>
+                <w:szCs w:val="20"/>
+              </w:rPr>
+              <w:t>.</w:t>
+            </w:r>
+            <w:proofErr w:type="spellStart"/>
+            <w:r>
+              <w:rPr>
+                <w:sz w:val="20"/>
+                <w:szCs w:val="20"/>
+              </w:rPr>
+              <w:t>flatMap</w:t>
+            </w:r>
+            <w:proofErr w:type="spellEnd"/>
+            <w:proofErr w:type="gramEnd"/>
+            <w:r>
+              <w:rPr>
+                <w:sz w:val="20"/>
+                <w:szCs w:val="20"/>
+              </w:rPr>
+              <w:t>(_</w:t>
+            </w:r>
+            <w:proofErr w:type="spellStart"/>
+            <w:r>
+              <w:rPr>
+                <w:sz w:val="20"/>
+                <w:szCs w:val="20"/>
+              </w:rPr>
+              <w:t>rank_items</w:t>
+            </w:r>
+            <w:proofErr w:type="spellEnd"/>
+            <w:r>
+              <w:rPr>
+                <w:sz w:val="20"/>
+                <w:szCs w:val="20"/>
+              </w:rPr>
+              <w:t>: sort desc by count</w:t>
+            </w:r>
+            <w:r>
+              <w:rPr>
+                <w:sz w:val="20"/>
+                <w:szCs w:val="20"/>
+              </w:rPr>
+              <w:t xml:space="preserve"> </w:t>
+            </w:r>
+          </w:p>
+          <w:p>
+            <w:pPr>
+              <w:rPr>
+                <w:sz w:val="20"/>
+                <w:szCs w:val="20"/>
+              </w:rPr>
+            </w:pPr>
+            <w:r>
+              <w:rPr>
+                <w:sz w:val="20"/>
+                <w:szCs w:val="20"/>
+              </w:rPr>
+              <w:t xml:space="preserve">   </w:t>
+            </w:r>
+            <w:r>
+              <w:rPr>
+                <w:sz w:val="20"/>
+                <w:szCs w:val="20"/>
+              </w:rPr>
+              <w:t>desc</w:t>
+            </w:r>
+            <w:r>
+              <w:rPr>
+                <w:sz w:val="20"/>
+                <w:szCs w:val="20"/>
+              </w:rPr>
+              <w:t>,</w:t>
+            </w:r>
+            <w:r>
+              <w:rPr>
+                <w:sz w:val="20"/>
+                <w:szCs w:val="20"/>
+              </w:rPr>
+              <w:t xml:space="preserve"> </w:t>
+            </w:r>
+            <w:r>
+              <w:rPr>
+                <w:sz w:val="20"/>
+                <w:szCs w:val="20"/>
+              </w:rPr>
+              <w:t xml:space="preserve">Item name </w:t>
+            </w:r>
+            <w:proofErr w:type="spellStart"/>
+            <w:r>
+              <w:rPr>
+                <w:sz w:val="20"/>
+                <w:szCs w:val="20"/>
+              </w:rPr>
+              <w:t>asc</w:t>
+            </w:r>
+            <w:proofErr w:type="spellEnd"/>
+            <w:r>
+              <w:rPr>
+                <w:sz w:val="20"/>
+                <w:szCs w:val="20"/>
+              </w:rPr>
+              <w:t>,</w:t>
+            </w:r>
+            <w:r>
+              <w:rPr>
+                <w:sz w:val="20"/>
+                <w:szCs w:val="20"/>
+              </w:rPr>
+              <w:t xml:space="preserve"> </w:t>
+            </w:r>
+            <w:r>
+              <w:rPr>
+                <w:sz w:val="20"/>
+                <w:szCs w:val="20"/>
+              </w:rPr>
+              <w:t xml:space="preserve">and </w:t>
+            </w:r>
+            <w:r>
+              <w:rPr>
+                <w:sz w:val="20"/>
+                <w:szCs w:val="20"/>
+              </w:rPr>
+              <w:t xml:space="preserve">take </w:t>
+            </w:r>
+            <w:proofErr w:type="spellStart"/>
+            <w:r>
+              <w:rPr>
+                <w:sz w:val="20"/>
+                <w:szCs w:val="20"/>
+              </w:rPr>
+              <w:t>top_x</w:t>
+            </w:r>
+            <w:proofErr w:type="spellEnd"/>
+            <w:r>
+              <w:rPr>
+                <w:sz w:val="20"/>
+                <w:szCs w:val="20"/>
+              </w:rPr>
+              <w:t>)</w:t>
+            </w:r>
+          </w:p>
+          <w:p>
+            <w:pPr>
+              <w:rPr>
+                <w:sz w:val="20"/>
+                <w:szCs w:val="20"/>
+              </w:rPr>
+            </w:pPr>
+          </w:p>
+        </w:tc>
+        <w:tc>
+          <w:tcPr>
+            <w:tcW w:w="2700" w:type="dxa"/>
+          </w:tcPr>
+          <w:p>
+            <w:pPr>
+              <w:rPr>
+                <w:rFonts w:ascii="Times New Roman" w:hAnsi="Times New Roman" w:cs="Times New Roman"/>
+                <w:sz w:val="20"/>
+                <w:szCs w:val="20"/>
+              </w:rPr>
+            </w:pPr>
+            <w:r>
+              <w:rPr>
+                <w:rFonts w:ascii="Times New Roman" w:hAnsi="Times New Roman" w:cs="Times New Roman"/>
+                <w:sz w:val="20"/>
+                <w:szCs w:val="20"/>
+              </w:rPr>
+              <w:t>(</w:t>
+            </w:r>
+            <w:proofErr w:type="spellStart"/>
+            <w:r>
+              <w:rPr>
+                <w:rFonts w:ascii="Times New Roman" w:hAnsi="Times New Roman" w:cs="Times New Roman"/>
+                <w:sz w:val="20"/>
+                <w:szCs w:val="20"/>
+              </w:rPr>
+              <w:t>geo_oid</w:t>
+            </w:r>
+            <w:proofErr w:type="spellEnd"/>
+            <w:r>
+              <w:rPr>
+                <w:rFonts w:ascii="Times New Roman" w:hAnsi="Times New Roman" w:cs="Times New Roman"/>
+                <w:sz w:val="20"/>
+                <w:szCs w:val="20"/>
+              </w:rPr>
+              <w:t xml:space="preserve">, rank, </w:t>
+            </w:r>
+            <w:proofErr w:type="spellStart"/>
+            <w:r>
+              <w:rPr>
+                <w:rFonts w:ascii="Times New Roman" w:hAnsi="Times New Roman" w:cs="Times New Roman"/>
+                <w:sz w:val="20"/>
+                <w:szCs w:val="20"/>
+              </w:rPr>
+              <w:t>item_name</w:t>
+            </w:r>
+            <w:proofErr w:type="spellEnd"/>
+            <w:r>
+              <w:rPr>
+                <w:rFonts w:ascii="Times New Roman" w:hAnsi="Times New Roman" w:cs="Times New Roman"/>
+                <w:sz w:val="20"/>
+                <w:szCs w:val="20"/>
+              </w:rPr>
+              <w:t>)</w:t>
+            </w:r>
+          </w:p>
+          <w:p>
+            <w:pPr>
+              <w:rPr>
+                <w:b/>
+                <w:bCs/>
+                <w:sz w:val="20"/>
+                <w:szCs w:val="20"/>
+              </w:rPr>
+            </w:pPr>
+          </w:p>
+        </w:tc>
+        <w:tc>
+          <w:tcPr>
+            <w:tcW w:w="2880" w:type="dxa"/>
+          </w:tcPr>
+          <w:p>
+            <w:pPr>
+              <w:rPr>
+                <w:sz w:val="20"/>
+                <w:szCs w:val="20"/>
+              </w:rPr>
+            </w:pPr>
+            <w:r>
+              <w:rPr>
+                <w:sz w:val="20"/>
+                <w:szCs w:val="20"/>
+              </w:rPr>
+              <w:t xml:space="preserve">O(m) time </w:t>
+            </w:r>
+            <w:r>
+              <w:rPr>
+                <w:sz w:val="20"/>
+                <w:szCs w:val="20"/>
+              </w:rPr>
+              <w:t>w</w:t>
+            </w:r>
+            <w:r>
+              <w:rPr>
+                <w:sz w:val="20"/>
+                <w:szCs w:val="20"/>
+              </w:rPr>
+              <w:t>here m is the aggregated item count, 1 shuffle</w:t>
+            </w:r>
+            <w:r>
+              <w:rPr>
+                <w:sz w:val="20"/>
+                <w:szCs w:val="20"/>
+              </w:rPr>
+              <w:t xml:space="preserve"> </w:t>
+            </w:r>
+            <w:r>
+              <w:rPr>
+                <w:sz w:val="20"/>
+                <w:szCs w:val="20"/>
+              </w:rPr>
+              <w:t xml:space="preserve">stage. </w:t>
+            </w:r>
+          </w:p>
+          <w:p>
+            <w:pPr>
+              <w:rPr>
+                <w:sz w:val="20"/>
+                <w:szCs w:val="20"/>
+              </w:rPr>
+            </w:pPr>
+          </w:p>
+          <w:p>
+            <w:pPr>
+              <w:rPr>
+                <w:sz w:val="20"/>
+                <w:szCs w:val="20"/>
+              </w:rPr>
+            </w:pPr>
+            <w:r>
+              <w:rPr>
+                <w:sz w:val="20"/>
+                <w:szCs w:val="20"/>
+              </w:rPr>
+              <w:t xml:space="preserve">Per-group sorting is </w:t>
+            </w:r>
+            <w:proofErr w:type="gramStart"/>
+            <w:r>
+              <w:rPr>
+                <w:sz w:val="20"/>
+                <w:szCs w:val="20"/>
+              </w:rPr>
+              <w:t>O(</w:t>
+            </w:r>
+            <w:proofErr w:type="gramEnd"/>
+            <w:r>
+              <w:rPr>
+                <w:sz w:val="20"/>
+                <w:szCs w:val="20"/>
+              </w:rPr>
+              <w:t>k log k) per location</w:t>
+            </w:r>
+            <w:r>
+              <w:rPr>
+                <w:sz w:val="20"/>
+                <w:szCs w:val="20"/>
+              </w:rPr>
+              <w:t xml:space="preserve"> w</w:t>
+            </w:r>
+            <w:r>
+              <w:rPr>
+                <w:sz w:val="20"/>
+                <w:szCs w:val="20"/>
+              </w:rPr>
+              <w:t>here:</w:t>
+            </w:r>
+          </w:p>
+          <w:p>
+            <w:pPr>
+              <w:numPr>
+                <w:ilvl w:val="0"/>
+                <w:numId w:val="26"/>
+              </w:numPr>
+              <w:tabs>
+                <w:tab w:val="clear" w:pos="360"/>
+                <w:tab w:val="num" w:pos="720"/>
+              </w:tabs>
+              <w:spacing w:after="160" w:line="278" w:lineRule="auto"/>
+              <w:rPr>
+                <w:sz w:val="20"/>
+                <w:szCs w:val="20"/>
+              </w:rPr>
+            </w:pPr>
+            <w:r>
+              <w:rPr>
+                <w:sz w:val="20"/>
+                <w:szCs w:val="20"/>
+              </w:rPr>
+              <w:t>K</w:t>
+            </w:r>
+            <w:r>
+              <w:rPr>
+                <w:sz w:val="20"/>
+                <w:szCs w:val="20"/>
+              </w:rPr>
+              <w:t xml:space="preserve"> = </w:t>
+            </w:r>
+            <w:r>
+              <w:rPr>
+                <w:sz w:val="20"/>
+                <w:szCs w:val="20"/>
+              </w:rPr>
+              <w:t xml:space="preserve">the number of unique </w:t>
+            </w:r>
+            <w:proofErr w:type="spellStart"/>
+            <w:proofErr w:type="gramStart"/>
+            <w:r>
+              <w:rPr>
+                <w:sz w:val="20"/>
+                <w:szCs w:val="20"/>
+              </w:rPr>
+              <w:t>item</w:t>
+            </w:r>
+            <w:proofErr w:type="gramEnd"/>
+            <w:r>
+              <w:rPr>
+                <w:sz w:val="20"/>
+                <w:szCs w:val="20"/>
+              </w:rPr>
+              <w:t>_name</w:t>
+            </w:r>
+            <w:proofErr w:type="spellEnd"/>
+            <w:r>
+              <w:rPr>
+                <w:sz w:val="20"/>
+                <w:szCs w:val="20"/>
+              </w:rPr>
+              <w:t xml:space="preserve"> values within one </w:t>
+            </w:r>
+            <w:proofErr w:type="spellStart"/>
+            <w:r>
+              <w:rPr>
+                <w:sz w:val="20"/>
+                <w:szCs w:val="20"/>
+              </w:rPr>
+              <w:t>geographical_location</w:t>
+            </w:r>
+            <w:proofErr w:type="spellEnd"/>
+            <w:r>
+              <w:rPr>
+                <w:sz w:val="20"/>
+                <w:szCs w:val="20"/>
+              </w:rPr>
+              <w:t>.</w:t>
+            </w:r>
+          </w:p>
+          <w:p>
+            <w:pPr>
+              <w:rPr>
+                <w:b/>
+                <w:bCs/>
+                <w:sz w:val="20"/>
+                <w:szCs w:val="20"/>
+              </w:rPr>
+            </w:pPr>
+          </w:p>
+        </w:tc>
+      </w:tr>
+    </w:tbl>
+    <w:p/>
+    <w:p>
+      <w:r>
+        <w:t xml:space="preserve"> </w:t>
+      </w:r>
+      <w:r>
+        <w:rPr>
+          <w:b/>
+          <w:bCs/>
+        </w:rPr>
+        <w:t>Rationale to use</w:t>
+      </w:r>
+      <w:r>
+        <w:rPr>
+          <w:b/>
+          <w:bCs/>
+        </w:rPr>
+        <w:t xml:space="preserve"> </w:t>
+      </w:r>
+      <w:proofErr w:type="spellStart"/>
+      <w:r>
+        <w:rPr>
+          <w:b/>
+          <w:bCs/>
+        </w:rPr>
+        <w:t>group</w:t>
+      </w:r>
+      <w:r>
+        <w:rPr>
+          <w:b/>
+          <w:bCs/>
+        </w:rPr>
+        <w:t>ByKey</w:t>
+      </w:r>
+      <w:proofErr w:type="spellEnd"/>
+    </w:p>
+    <w:p>
+      <w:pPr>
+        <w:pStyle w:val="ListParagraph"/>
+        <w:numPr>
+          <w:ilvl w:val="0"/>
+          <w:numId w:val="8"/>
+        </w:numPr>
+      </w:pPr>
+      <w:r>
+        <w:t>After aggregation, the dataset is reduce</w:t>
+      </w:r>
+      <w:r>
+        <w:t>d</w:t>
+      </w:r>
+      <w:r>
+        <w:t xml:space="preserve"> at most ~10K * unique item entries.</w:t>
+      </w:r>
+    </w:p>
+    <w:p>
+      <w:pPr>
+        <w:pStyle w:val="ListParagraph"/>
+        <w:numPr>
+          <w:ilvl w:val="0"/>
+          <w:numId w:val="8"/>
+        </w:numPr>
+      </w:pPr>
+      <w:r>
+        <w:t>Sorting need</w:t>
+      </w:r>
+      <w:r>
+        <w:t>s</w:t>
+      </w:r>
+      <w:r>
+        <w:t xml:space="preserve"> to occur over complete set of items to assign the ranking, thus </w:t>
+      </w:r>
+      <w:proofErr w:type="spellStart"/>
+      <w:r>
+        <w:t>groupByKey</w:t>
+      </w:r>
+      <w:proofErr w:type="spellEnd"/>
+      <w:r>
+        <w:t xml:space="preserve"> is necessary here.</w:t>
+      </w:r>
+    </w:p>
+    <w:p>
+      <w:pPr>
+        <w:pStyle w:val="ListParagraph"/>
+        <w:numPr>
+          <w:ilvl w:val="0"/>
+          <w:numId w:val="8"/>
+        </w:numPr>
+      </w:pPr>
+      <w:r>
+        <w:t>Per-group sorting is 0(K log K) where ki is the number of unique items per location.</w:t>
+      </w:r>
+    </w:p>
+    <w:p>
+      <w:pPr>
+        <w:rPr>
+          <w:b/>
+          <w:bCs/>
+          <w:u w:val="single"/>
+        </w:rPr>
+      </w:pPr>
+      <w:r>
+        <w:rPr>
+          <w:b/>
+          <w:bCs/>
+          <w:u w:val="single"/>
+        </w:rPr>
+        <w:t xml:space="preserve">Stage </w:t>
+      </w:r>
+      <w:r>
+        <w:rPr>
+          <w:b/>
+          <w:bCs/>
+          <w:u w:val="single"/>
+        </w:rPr>
+        <w:t>4</w:t>
+      </w:r>
+      <w:r>
+        <w:rPr>
+          <w:b/>
+          <w:bCs/>
+          <w:u w:val="single"/>
+        </w:rPr>
+        <w:t xml:space="preserve">: </w:t>
+      </w:r>
+      <w:r>
+        <w:rPr>
+          <w:b/>
+          <w:bCs/>
+          <w:u w:val="single"/>
+        </w:rPr>
+        <w:t>Enrichment</w:t>
+      </w:r>
+      <w:r>
+        <w:rPr>
+          <w:b/>
+          <w:bCs/>
+          <w:u w:val="single"/>
+        </w:rPr>
+        <w:t xml:space="preserve"> (</w:t>
+      </w:r>
+      <w:proofErr w:type="spellStart"/>
+      <w:r>
+        <w:rPr>
+          <w:b/>
+          <w:bCs/>
+          <w:u w:val="single"/>
+        </w:rPr>
+        <w:t>Enricher</w:t>
+      </w:r>
+      <w:r>
+        <w:rPr>
+          <w:b/>
+          <w:bCs/>
+          <w:u w:val="single"/>
+        </w:rPr>
+        <w:t>Transform</w:t>
+      </w:r>
+      <w:proofErr w:type="spellEnd"/>
+      <w:r>
+        <w:rPr>
+          <w:b/>
+          <w:bCs/>
+          <w:u w:val="single"/>
+        </w:rPr>
+        <w:t>)</w:t>
+      </w:r>
+    </w:p>
+    <w:p>
+      <w:r>
+        <w:t>Enrichment is placed at the last stage since the dataset A is reduced significantly. Thereby, there is fewer rows to enrich, which enable faster compute.</w:t>
       </w:r>
     </w:p>
     <w:tbl>
@@ -5333,15 +7156,32 @@
               </w:rPr>
             </w:pPr>
             <w:proofErr w:type="spellStart"/>
+            <w:r>
+              <w:rPr>
+                <w:sz w:val="20"/>
+                <w:szCs w:val="20"/>
+              </w:rPr>
+              <w:t>broadcast_dict</w:t>
+            </w:r>
+            <w:proofErr w:type="spellEnd"/>
+            <w:r>
+              <w:rPr>
+                <w:sz w:val="20"/>
+                <w:szCs w:val="20"/>
+              </w:rPr>
+              <w:t xml:space="preserve"> = </w:t>
+            </w:r>
+            <w:proofErr w:type="spellStart"/>
             <w:proofErr w:type="gramStart"/>
             <w:r>
               <w:rPr>
                 <w:sz w:val="20"/>
                 <w:szCs w:val="20"/>
               </w:rPr>
-              <w:t>rdd.map</w:t>
+              <w:t>sc.broadcast</w:t>
             </w:r>
             <w:proofErr w:type="spellEnd"/>
+            <w:proofErr w:type="gramEnd"/>
             <w:r>
               <w:rPr>
                 <w:sz w:val="20"/>
@@ -5350,13 +7190,12 @@
               <w:t>(</w:t>
             </w:r>
             <w:proofErr w:type="spellStart"/>
-            <w:proofErr w:type="gramEnd"/>
-            <w:r>
-              <w:rPr>
-                <w:sz w:val="20"/>
-                <w:szCs w:val="20"/>
-              </w:rPr>
-              <w:t>kv</w:t>
+            <w:r>
+              <w:rPr>
+                <w:sz w:val="20"/>
+                <w:szCs w:val="20"/>
+              </w:rPr>
+              <w:t>locations_dict</w:t>
             </w:r>
             <w:proofErr w:type="spellEnd"/>
             <w:r>
@@ -5364,7 +7203,7 @@
                 <w:sz w:val="20"/>
                 <w:szCs w:val="20"/>
               </w:rPr>
-              <w:t xml:space="preserve"> -&gt; </w:t>
+              <w:t>)</w:t>
             </w:r>
           </w:p>
           <w:p>
@@ -5379,46 +7218,7 @@
                 <w:sz w:val="20"/>
                 <w:szCs w:val="20"/>
               </w:rPr>
-              <w:t xml:space="preserve">  </w:t>
-            </w:r>
-            <w:r>
-              <w:rPr>
-                <w:sz w:val="20"/>
-                <w:szCs w:val="20"/>
-              </w:rPr>
-              <w:t>(</w:t>
-            </w:r>
-            <w:proofErr w:type="spellStart"/>
-            <w:r>
-              <w:rPr>
-                <w:sz w:val="20"/>
-                <w:szCs w:val="20"/>
-              </w:rPr>
-              <w:t>geo_oid</w:t>
-            </w:r>
-            <w:proofErr w:type="spellEnd"/>
-            <w:r>
-              <w:rPr>
-                <w:sz w:val="20"/>
-                <w:szCs w:val="20"/>
-              </w:rPr>
-              <w:t>, (</w:t>
-            </w:r>
-            <w:proofErr w:type="spellStart"/>
-            <w:r>
-              <w:rPr>
-                <w:sz w:val="20"/>
-                <w:szCs w:val="20"/>
-              </w:rPr>
-              <w:t>item_name</w:t>
-            </w:r>
-            <w:proofErr w:type="spellEnd"/>
-            <w:r>
-              <w:rPr>
-                <w:sz w:val="20"/>
-                <w:szCs w:val="20"/>
-              </w:rPr>
-              <w:t>, count)))</w:t>
+              <w:t> </w:t>
             </w:r>
           </w:p>
           <w:p>
@@ -5428,20 +7228,30 @@
                 <w:szCs w:val="20"/>
               </w:rPr>
             </w:pPr>
-            <w:r>
-              <w:rPr>
-                <w:sz w:val="20"/>
-                <w:szCs w:val="20"/>
-              </w:rPr>
-              <w:t>   </w:t>
-            </w:r>
+            <w:proofErr w:type="spellStart"/>
             <w:proofErr w:type="gramStart"/>
             <w:r>
               <w:rPr>
                 <w:sz w:val="20"/>
                 <w:szCs w:val="20"/>
               </w:rPr>
-              <w:t>.</w:t>
+              <w:t>rdd.map</w:t>
+            </w:r>
+            <w:proofErr w:type="spellEnd"/>
+            <w:r>
+              <w:rPr>
+                <w:sz w:val="20"/>
+                <w:szCs w:val="20"/>
+              </w:rPr>
+              <w:t>(</w:t>
+            </w:r>
+            <w:proofErr w:type="gramEnd"/>
+            <w:r>
+              <w:rPr>
+                <w:sz w:val="20"/>
+                <w:szCs w:val="20"/>
+              </w:rPr>
+              <w:t xml:space="preserve">row -&gt; insert </w:t>
             </w:r>
             <w:proofErr w:type="spellStart"/>
             <w:r>
@@ -5449,16 +7259,31 @@
                 <w:sz w:val="20"/>
                 <w:szCs w:val="20"/>
               </w:rPr>
-              <w:t>groupByKey</w:t>
+              <w:t>location_name</w:t>
             </w:r>
             <w:proofErr w:type="spellEnd"/>
-            <w:proofErr w:type="gramEnd"/>
-            <w:r>
-              <w:rPr>
-                <w:sz w:val="20"/>
-                <w:szCs w:val="20"/>
-              </w:rPr>
-              <w:t>()</w:t>
+            <w:r>
+              <w:rPr>
+                <w:sz w:val="20"/>
+                <w:szCs w:val="20"/>
+              </w:rPr>
+              <w:t xml:space="preserve"> at </w:t>
+            </w:r>
+            <w:proofErr w:type="spellStart"/>
+            <w:r>
+              <w:rPr>
+                <w:sz w:val="20"/>
+                <w:szCs w:val="20"/>
+              </w:rPr>
+              <w:t>insert_pos</w:t>
+            </w:r>
+            <w:proofErr w:type="spellEnd"/>
+            <w:r>
+              <w:rPr>
+                <w:sz w:val="20"/>
+                <w:szCs w:val="20"/>
+              </w:rPr>
+              <w:t xml:space="preserve"> </w:t>
             </w:r>
           </w:p>
           <w:p>
@@ -5473,161 +7298,14 @@
                 <w:sz w:val="20"/>
                 <w:szCs w:val="20"/>
               </w:rPr>
-              <w:t>   </w:t>
-            </w:r>
-            <w:proofErr w:type="gramStart"/>
-            <w:r>
-              <w:rPr>
-                <w:sz w:val="20"/>
-                <w:szCs w:val="20"/>
-              </w:rPr>
-              <w:t>.</w:t>
-            </w:r>
-            <w:proofErr w:type="spellStart"/>
-            <w:r>
-              <w:rPr>
-                <w:sz w:val="20"/>
-                <w:szCs w:val="20"/>
-              </w:rPr>
-              <w:t>flatMap</w:t>
-            </w:r>
-            <w:proofErr w:type="spellEnd"/>
-            <w:proofErr w:type="gramEnd"/>
-            <w:r>
-              <w:rPr>
-                <w:sz w:val="20"/>
-                <w:szCs w:val="20"/>
-              </w:rPr>
-              <w:t>(_</w:t>
-            </w:r>
-            <w:proofErr w:type="spellStart"/>
-            <w:r>
-              <w:rPr>
-                <w:sz w:val="20"/>
-                <w:szCs w:val="20"/>
-              </w:rPr>
-              <w:t>rank_items</w:t>
-            </w:r>
-            <w:proofErr w:type="spellEnd"/>
-            <w:r>
-              <w:rPr>
-                <w:sz w:val="20"/>
-                <w:szCs w:val="20"/>
-              </w:rPr>
-              <w:t>: sort desc by count</w:t>
-            </w:r>
-            <w:r>
-              <w:rPr>
-                <w:sz w:val="20"/>
-                <w:szCs w:val="20"/>
-              </w:rPr>
-              <w:t xml:space="preserve"> desc</w:t>
-            </w:r>
-            <w:r>
-              <w:rPr>
-                <w:sz w:val="20"/>
-                <w:szCs w:val="20"/>
-              </w:rPr>
-              <w:t xml:space="preserve">, </w:t>
-            </w:r>
-          </w:p>
-          <w:p>
-            <w:pPr>
-              <w:rPr>
-                <w:sz w:val="20"/>
-                <w:szCs w:val="20"/>
-              </w:rPr>
-            </w:pPr>
-            <w:r>
-              <w:rPr>
-                <w:sz w:val="20"/>
-                <w:szCs w:val="20"/>
-              </w:rPr>
-              <w:t xml:space="preserve">                      Item name </w:t>
-            </w:r>
-            <w:proofErr w:type="spellStart"/>
-            <w:r>
-              <w:rPr>
-                <w:sz w:val="20"/>
-                <w:szCs w:val="20"/>
-              </w:rPr>
-              <w:t>asc</w:t>
-            </w:r>
-            <w:proofErr w:type="spellEnd"/>
-            <w:r>
-              <w:rPr>
-                <w:sz w:val="20"/>
-                <w:szCs w:val="20"/>
-              </w:rPr>
-              <w:t>,</w:t>
-            </w:r>
-            <w:r>
-              <w:rPr>
-                <w:sz w:val="20"/>
-                <w:szCs w:val="20"/>
-              </w:rPr>
-              <w:t xml:space="preserve"> </w:t>
-            </w:r>
-            <w:r>
-              <w:rPr>
-                <w:sz w:val="20"/>
-                <w:szCs w:val="20"/>
-              </w:rPr>
-              <w:t xml:space="preserve">take </w:t>
-            </w:r>
-            <w:proofErr w:type="spellStart"/>
-            <w:r>
-              <w:rPr>
-                <w:sz w:val="20"/>
-                <w:szCs w:val="20"/>
-              </w:rPr>
-              <w:t>top_x</w:t>
-            </w:r>
-            <w:proofErr w:type="spellEnd"/>
-            <w:r>
-              <w:rPr>
-                <w:sz w:val="20"/>
-                <w:szCs w:val="20"/>
-              </w:rPr>
-              <w:t xml:space="preserve">, assign </w:t>
-            </w:r>
-          </w:p>
-          <w:p>
-            <w:pPr>
-              <w:rPr>
-                <w:sz w:val="20"/>
-                <w:szCs w:val="20"/>
-              </w:rPr>
-            </w:pPr>
-            <w:r>
-              <w:rPr>
-                <w:sz w:val="20"/>
-                <w:szCs w:val="20"/>
-              </w:rPr>
-              <w:t xml:space="preserve">                      </w:t>
-            </w:r>
-            <w:r>
-              <w:rPr>
-                <w:sz w:val="20"/>
-                <w:szCs w:val="20"/>
-              </w:rPr>
-              <w:t xml:space="preserve">rank </w:t>
-            </w:r>
-            <w:proofErr w:type="gramStart"/>
-            <w:r>
-              <w:rPr>
-                <w:sz w:val="20"/>
-                <w:szCs w:val="20"/>
-              </w:rPr>
-              <w:t>1..</w:t>
-            </w:r>
-            <w:proofErr w:type="gramEnd"/>
-            <w:r>
-              <w:rPr>
-                <w:sz w:val="20"/>
-                <w:szCs w:val="20"/>
-              </w:rPr>
-              <w:t>top_x via enumerate)</w:t>
+              <w:t xml:space="preserve">                             </w:t>
+            </w:r>
+            <w:r>
+              <w:rPr>
+                <w:sz w:val="20"/>
+                <w:szCs w:val="20"/>
+              </w:rPr>
+              <w:t>from broadcast lookup)</w:t>
             </w:r>
           </w:p>
           <w:p>
@@ -5657,7 +7335,7 @@
                 <w:sz w:val="20"/>
                 <w:szCs w:val="20"/>
               </w:rPr>
-              <w:t>(</w:t>
+              <w:t> (</w:t>
             </w:r>
             <w:proofErr w:type="spellStart"/>
             <w:r>
@@ -5667,6 +7345,24 @@
                 <w:szCs w:val="20"/>
               </w:rPr>
               <w:t>geo_oid</w:t>
+            </w:r>
+            <w:proofErr w:type="spellEnd"/>
+            <w:r>
+              <w:rPr>
+                <w:rFonts w:ascii="Times New Roman" w:hAnsi="Times New Roman" w:cs="Times New Roman"/>
+                <w:sz w:val="20"/>
+                <w:szCs w:val="20"/>
+              </w:rPr>
+              <w:t xml:space="preserve">, </w:t>
+            </w:r>
+            <w:proofErr w:type="spellStart"/>
+            <w:r>
+              <w:rPr>
+                <w:rFonts w:ascii="Times New Roman" w:hAnsi="Times New Roman" w:cs="Times New Roman"/>
+                <w:sz w:val="20"/>
+                <w:szCs w:val="20"/>
+              </w:rPr>
+              <w:t>geo_location</w:t>
             </w:r>
             <w:proofErr w:type="spellEnd"/>
             <w:r>
@@ -5723,7 +7419,30 @@
                 <w:sz w:val="20"/>
                 <w:szCs w:val="20"/>
               </w:rPr>
-              <w:t>O(m) time where m is the aggregated item count, 1 shuffle</w:t>
+              <w:t xml:space="preserve">O(n) time, 0 shuffle stages. </w:t>
+            </w:r>
+          </w:p>
+          <w:p>
+            <w:pPr>
+              <w:rPr>
+                <w:sz w:val="20"/>
+                <w:szCs w:val="20"/>
+              </w:rPr>
+            </w:pPr>
+          </w:p>
+          <w:p>
+            <w:pPr>
+              <w:rPr>
+                <w:sz w:val="20"/>
+                <w:szCs w:val="20"/>
+              </w:rPr>
+            </w:pPr>
+            <w:r>
+              <w:rPr>
+                <w:sz w:val="20"/>
+                <w:szCs w:val="20"/>
+              </w:rPr>
+              <w:t>Broadcast cost: one-time</w:t>
             </w:r>
             <w:r>
               <w:rPr>
@@ -5737,23 +7456,7 @@
                 <w:sz w:val="20"/>
                 <w:szCs w:val="20"/>
               </w:rPr>
-              <w:t xml:space="preserve">stage. Per-group sorting is </w:t>
-            </w:r>
-            <w:proofErr w:type="gramStart"/>
-            <w:r>
-              <w:rPr>
-                <w:sz w:val="20"/>
-                <w:szCs w:val="20"/>
-              </w:rPr>
-              <w:t>O(</w:t>
-            </w:r>
-            <w:proofErr w:type="gramEnd"/>
-            <w:r>
-              <w:rPr>
-                <w:sz w:val="20"/>
-                <w:szCs w:val="20"/>
-              </w:rPr>
-              <w:t>k log k) per location.</w:t>
+              <w:t>O(10K) network transfer to each executor</w:t>
             </w:r>
           </w:p>
           <w:p>
@@ -5771,37 +7474,43 @@
     </w:tbl>
     <w:p/>
     <w:p>
-      <w:r>
-        <w:t xml:space="preserve"> </w:t>
-      </w:r>
-      <w:r>
+      <w:pPr>
         <w:rPr>
           <w:b/>
           <w:bCs/>
         </w:rPr>
-        <w:t>Rationale to use</w:t>
+      </w:pPr>
+      <w:r>
+        <w:t xml:space="preserve"> </w:t>
       </w:r>
       <w:r>
         <w:rPr>
           <w:b/>
           <w:bCs/>
         </w:rPr>
-        <w:t xml:space="preserve"> </w:t>
-      </w:r>
-      <w:proofErr w:type="spellStart"/>
+        <w:t>Rationale to use</w:t>
+      </w:r>
       <w:r>
         <w:rPr>
           <w:b/>
           <w:bCs/>
         </w:rPr>
-        <w:t>group</w:t>
+        <w:t xml:space="preserve"> </w:t>
       </w:r>
       <w:r>
         <w:rPr>
           <w:b/>
           <w:bCs/>
         </w:rPr>
-        <w:t>ByKey</w:t>
+        <w:t xml:space="preserve">Broadcast join instead of </w:t>
+      </w:r>
+      <w:proofErr w:type="spellStart"/>
+      <w:r>
+        <w:rPr>
+          <w:b/>
+          <w:bCs/>
+        </w:rPr>
+        <w:t>RDD.join</w:t>
       </w:r>
       <w:proofErr w:type="spellEnd"/>
     </w:p>
@@ -5814,13 +7523,7 @@
         </w:numPr>
       </w:pPr>
       <w:r>
-        <w:t>After aggregation, the dataset is reduce</w:t>
-      </w:r>
-      <w:r>
-        <w:t>d</w:t>
-      </w:r>
-      <w:r>
-        <w:t xml:space="preserve"> at most ~10K * unique item entries.</w:t>
+        <w:t>Dataset B (~10k rows) can easily fit into executor memory</w:t>
       </w:r>
     </w:p>
     <w:p>
@@ -5832,23 +7535,7 @@
         </w:numPr>
       </w:pPr>
       <w:r>
-        <w:t xml:space="preserve">Sorting </w:t>
-      </w:r>
-      <w:proofErr w:type="gramStart"/>
-      <w:r>
-        <w:t>need</w:t>
-      </w:r>
-      <w:proofErr w:type="gramEnd"/>
-      <w:r>
-        <w:t xml:space="preserve"> to occur over complete set of items to assign the ranking, thus </w:t>
-      </w:r>
-      <w:proofErr w:type="spellStart"/>
-      <w:r>
-        <w:t>groupByKey</w:t>
-      </w:r>
-      <w:proofErr w:type="spellEnd"/>
-      <w:r>
-        <w:t xml:space="preserve"> is necessary here.</w:t>
+        <w:t>Map side lookup adds zero shuffle stage</w:t>
       </w:r>
     </w:p>
     <w:p>
@@ -5860,554 +7547,6 @@
         </w:numPr>
       </w:pPr>
       <w:r>
-        <w:t>Per-group sorting is 0(K log K) where ki is the number of unique items per location.</w:t>
-      </w:r>
-    </w:p>
-    <w:p>
-      <w:pPr>
-        <w:rPr>
-          <w:b/>
-          <w:bCs/>
-          <w:u w:val="single"/>
-        </w:rPr>
-      </w:pPr>
-      <w:r>
-        <w:rPr>
-          <w:b/>
-          <w:bCs/>
-          <w:u w:val="single"/>
-        </w:rPr>
-        <w:t xml:space="preserve">Stage </w:t>
-      </w:r>
-      <w:r>
-        <w:rPr>
-          <w:b/>
-          <w:bCs/>
-          <w:u w:val="single"/>
-        </w:rPr>
-        <w:t>4</w:t>
-      </w:r>
-      <w:r>
-        <w:rPr>
-          <w:b/>
-          <w:bCs/>
-          <w:u w:val="single"/>
-        </w:rPr>
-        <w:t xml:space="preserve">: </w:t>
-      </w:r>
-      <w:r>
-        <w:rPr>
-          <w:b/>
-          <w:bCs/>
-          <w:u w:val="single"/>
-        </w:rPr>
-        <w:t>Enrichment</w:t>
-      </w:r>
-      <w:r>
-        <w:rPr>
-          <w:b/>
-          <w:bCs/>
-          <w:u w:val="single"/>
-        </w:rPr>
-        <w:t xml:space="preserve"> (</w:t>
-      </w:r>
-      <w:proofErr w:type="spellStart"/>
-      <w:r>
-        <w:rPr>
-          <w:b/>
-          <w:bCs/>
-          <w:u w:val="single"/>
-        </w:rPr>
-        <w:t>Enricher</w:t>
-      </w:r>
-      <w:r>
-        <w:rPr>
-          <w:b/>
-          <w:bCs/>
-          <w:u w:val="single"/>
-        </w:rPr>
-        <w:t>Transform</w:t>
-      </w:r>
-      <w:proofErr w:type="spellEnd"/>
-      <w:r>
-        <w:rPr>
-          <w:b/>
-          <w:bCs/>
-          <w:u w:val="single"/>
-        </w:rPr>
-        <w:t>)</w:t>
-      </w:r>
-    </w:p>
-    <w:p>
-      <w:r>
-        <w:t>Enrichment is placed at the last stage since the dataset A is reduced significantly. Thereby, there is fewer rows to enrich, which enable faster compute.</w:t>
-      </w:r>
-    </w:p>
-    <w:tbl>
-      <w:tblPr>
-        <w:tblStyle w:val="TableGrid"/>
-        <w:tblW w:w="9625" w:type="dxa"/>
-        <w:tblLook w:val="04A0" w:firstRow="1" w:lastRow="0" w:firstColumn="1" w:lastColumn="0" w:noHBand="0" w:noVBand="1"/>
-      </w:tblPr>
-      <w:tblGrid>
-        <w:gridCol w:w="4495"/>
-        <w:gridCol w:w="2790"/>
-        <w:gridCol w:w="2340"/>
-      </w:tblGrid>
-      <w:tr>
-        <w:tc>
-          <w:tcPr>
-            <w:tcW w:w="4495" w:type="dxa"/>
-            <w:shd w:val="clear" w:color="auto" w:fill="F2F2F2" w:themeFill="background1" w:themeFillShade="F2"/>
-          </w:tcPr>
-          <w:p>
-            <w:pPr>
-              <w:rPr>
-                <w:b/>
-                <w:bCs/>
-              </w:rPr>
-            </w:pPr>
-            <w:r>
-              <w:rPr>
-                <w:b/>
-                <w:bCs/>
-              </w:rPr>
-              <w:t>Algorithm</w:t>
-            </w:r>
-          </w:p>
-        </w:tc>
-        <w:tc>
-          <w:tcPr>
-            <w:tcW w:w="2790" w:type="dxa"/>
-            <w:shd w:val="clear" w:color="auto" w:fill="F2F2F2" w:themeFill="background1" w:themeFillShade="F2"/>
-          </w:tcPr>
-          <w:p>
-            <w:pPr>
-              <w:rPr>
-                <w:b/>
-                <w:bCs/>
-              </w:rPr>
-            </w:pPr>
-            <w:r>
-              <w:rPr>
-                <w:b/>
-                <w:bCs/>
-              </w:rPr>
-              <w:t>Output</w:t>
-            </w:r>
-          </w:p>
-        </w:tc>
-        <w:tc>
-          <w:tcPr>
-            <w:tcW w:w="2340" w:type="dxa"/>
-            <w:shd w:val="clear" w:color="auto" w:fill="F2F2F2" w:themeFill="background1" w:themeFillShade="F2"/>
-          </w:tcPr>
-          <w:p>
-            <w:pPr>
-              <w:rPr>
-                <w:b/>
-                <w:bCs/>
-              </w:rPr>
-            </w:pPr>
-            <w:r>
-              <w:rPr>
-                <w:b/>
-                <w:bCs/>
-              </w:rPr>
-              <w:t xml:space="preserve">Time </w:t>
-            </w:r>
-            <w:r>
-              <w:rPr>
-                <w:b/>
-                <w:bCs/>
-              </w:rPr>
-              <w:t>Complexity</w:t>
-            </w:r>
-          </w:p>
-        </w:tc>
-      </w:tr>
-      <w:tr>
-        <w:tc>
-          <w:tcPr>
-            <w:tcW w:w="4495" w:type="dxa"/>
-          </w:tcPr>
-          <w:p>
-            <w:pPr>
-              <w:rPr>
-                <w:sz w:val="20"/>
-                <w:szCs w:val="20"/>
-              </w:rPr>
-            </w:pPr>
-            <w:proofErr w:type="spellStart"/>
-            <w:r>
-              <w:rPr>
-                <w:sz w:val="20"/>
-                <w:szCs w:val="20"/>
-              </w:rPr>
-              <w:t>broadcast_dict</w:t>
-            </w:r>
-            <w:proofErr w:type="spellEnd"/>
-            <w:r>
-              <w:rPr>
-                <w:sz w:val="20"/>
-                <w:szCs w:val="20"/>
-              </w:rPr>
-              <w:t xml:space="preserve"> = </w:t>
-            </w:r>
-            <w:proofErr w:type="spellStart"/>
-            <w:proofErr w:type="gramStart"/>
-            <w:r>
-              <w:rPr>
-                <w:sz w:val="20"/>
-                <w:szCs w:val="20"/>
-              </w:rPr>
-              <w:t>sc.broadcast</w:t>
-            </w:r>
-            <w:proofErr w:type="spellEnd"/>
-            <w:proofErr w:type="gramEnd"/>
-            <w:r>
-              <w:rPr>
-                <w:sz w:val="20"/>
-                <w:szCs w:val="20"/>
-              </w:rPr>
-              <w:t>(</w:t>
-            </w:r>
-            <w:proofErr w:type="spellStart"/>
-            <w:r>
-              <w:rPr>
-                <w:sz w:val="20"/>
-                <w:szCs w:val="20"/>
-              </w:rPr>
-              <w:t>locations_dict</w:t>
-            </w:r>
-            <w:proofErr w:type="spellEnd"/>
-            <w:r>
-              <w:rPr>
-                <w:sz w:val="20"/>
-                <w:szCs w:val="20"/>
-              </w:rPr>
-              <w:t>)</w:t>
-            </w:r>
-          </w:p>
-          <w:p>
-            <w:pPr>
-              <w:rPr>
-                <w:sz w:val="20"/>
-                <w:szCs w:val="20"/>
-              </w:rPr>
-            </w:pPr>
-            <w:r>
-              <w:rPr>
-                <w:sz w:val="20"/>
-                <w:szCs w:val="20"/>
-              </w:rPr>
-              <w:t> </w:t>
-            </w:r>
-          </w:p>
-          <w:p>
-            <w:pPr>
-              <w:rPr>
-                <w:sz w:val="20"/>
-                <w:szCs w:val="20"/>
-              </w:rPr>
-            </w:pPr>
-            <w:proofErr w:type="spellStart"/>
-            <w:proofErr w:type="gramStart"/>
-            <w:r>
-              <w:rPr>
-                <w:sz w:val="20"/>
-                <w:szCs w:val="20"/>
-              </w:rPr>
-              <w:t>rdd.map</w:t>
-            </w:r>
-            <w:proofErr w:type="spellEnd"/>
-            <w:r>
-              <w:rPr>
-                <w:sz w:val="20"/>
-                <w:szCs w:val="20"/>
-              </w:rPr>
-              <w:t>(</w:t>
-            </w:r>
-            <w:proofErr w:type="gramEnd"/>
-            <w:r>
-              <w:rPr>
-                <w:sz w:val="20"/>
-                <w:szCs w:val="20"/>
-              </w:rPr>
-              <w:t xml:space="preserve">row -&gt; insert </w:t>
-            </w:r>
-            <w:proofErr w:type="spellStart"/>
-            <w:r>
-              <w:rPr>
-                <w:sz w:val="20"/>
-                <w:szCs w:val="20"/>
-              </w:rPr>
-              <w:t>location_name</w:t>
-            </w:r>
-            <w:proofErr w:type="spellEnd"/>
-            <w:r>
-              <w:rPr>
-                <w:sz w:val="20"/>
-                <w:szCs w:val="20"/>
-              </w:rPr>
-              <w:t xml:space="preserve"> at </w:t>
-            </w:r>
-            <w:proofErr w:type="spellStart"/>
-            <w:r>
-              <w:rPr>
-                <w:sz w:val="20"/>
-                <w:szCs w:val="20"/>
-              </w:rPr>
-              <w:t>insert_pos</w:t>
-            </w:r>
-            <w:proofErr w:type="spellEnd"/>
-            <w:r>
-              <w:rPr>
-                <w:sz w:val="20"/>
-                <w:szCs w:val="20"/>
-              </w:rPr>
-              <w:t xml:space="preserve"> </w:t>
-            </w:r>
-          </w:p>
-          <w:p>
-            <w:pPr>
-              <w:rPr>
-                <w:sz w:val="20"/>
-                <w:szCs w:val="20"/>
-              </w:rPr>
-            </w:pPr>
-            <w:r>
-              <w:rPr>
-                <w:sz w:val="20"/>
-                <w:szCs w:val="20"/>
-              </w:rPr>
-              <w:t xml:space="preserve">                             </w:t>
-            </w:r>
-            <w:r>
-              <w:rPr>
-                <w:sz w:val="20"/>
-                <w:szCs w:val="20"/>
-              </w:rPr>
-              <w:t>from broadcast lookup)</w:t>
-            </w:r>
-          </w:p>
-          <w:p>
-            <w:pPr>
-              <w:rPr>
-                <w:sz w:val="20"/>
-                <w:szCs w:val="20"/>
-              </w:rPr>
-            </w:pPr>
-          </w:p>
-        </w:tc>
-        <w:tc>
-          <w:tcPr>
-            <w:tcW w:w="2790" w:type="dxa"/>
-          </w:tcPr>
-          <w:p>
-            <w:pPr>
-              <w:rPr>
-                <w:rFonts w:ascii="Times New Roman" w:hAnsi="Times New Roman" w:cs="Times New Roman"/>
-                <w:sz w:val="20"/>
-                <w:szCs w:val="20"/>
-              </w:rPr>
-            </w:pPr>
-            <w:r>
-              <w:rPr>
-                <w:rFonts w:ascii="Times New Roman" w:hAnsi="Times New Roman" w:cs="Times New Roman"/>
-                <w:sz w:val="20"/>
-                <w:szCs w:val="20"/>
-              </w:rPr>
-              <w:t> (</w:t>
-            </w:r>
-            <w:proofErr w:type="spellStart"/>
-            <w:r>
-              <w:rPr>
-                <w:rFonts w:ascii="Times New Roman" w:hAnsi="Times New Roman" w:cs="Times New Roman"/>
-                <w:sz w:val="20"/>
-                <w:szCs w:val="20"/>
-              </w:rPr>
-              <w:t>geo_oid</w:t>
-            </w:r>
-            <w:proofErr w:type="spellEnd"/>
-            <w:r>
-              <w:rPr>
-                <w:rFonts w:ascii="Times New Roman" w:hAnsi="Times New Roman" w:cs="Times New Roman"/>
-                <w:sz w:val="20"/>
-                <w:szCs w:val="20"/>
-              </w:rPr>
-              <w:t xml:space="preserve">, </w:t>
-            </w:r>
-            <w:proofErr w:type="spellStart"/>
-            <w:r>
-              <w:rPr>
-                <w:rFonts w:ascii="Times New Roman" w:hAnsi="Times New Roman" w:cs="Times New Roman"/>
-                <w:sz w:val="20"/>
-                <w:szCs w:val="20"/>
-              </w:rPr>
-              <w:t>geo_location</w:t>
-            </w:r>
-            <w:proofErr w:type="spellEnd"/>
-            <w:r>
-              <w:rPr>
-                <w:rFonts w:ascii="Times New Roman" w:hAnsi="Times New Roman" w:cs="Times New Roman"/>
-                <w:sz w:val="20"/>
-                <w:szCs w:val="20"/>
-              </w:rPr>
-              <w:t xml:space="preserve">, rank, </w:t>
-            </w:r>
-            <w:proofErr w:type="spellStart"/>
-            <w:r>
-              <w:rPr>
-                <w:rFonts w:ascii="Times New Roman" w:hAnsi="Times New Roman" w:cs="Times New Roman"/>
-                <w:sz w:val="20"/>
-                <w:szCs w:val="20"/>
-              </w:rPr>
-              <w:t>item_name</w:t>
-            </w:r>
-            <w:proofErr w:type="spellEnd"/>
-            <w:r>
-              <w:rPr>
-                <w:rFonts w:ascii="Times New Roman" w:hAnsi="Times New Roman" w:cs="Times New Roman"/>
-                <w:sz w:val="20"/>
-                <w:szCs w:val="20"/>
-              </w:rPr>
-              <w:t>)</w:t>
-            </w:r>
-          </w:p>
-          <w:p>
-            <w:pPr>
-              <w:rPr>
-                <w:b/>
-                <w:bCs/>
-                <w:sz w:val="20"/>
-                <w:szCs w:val="20"/>
-              </w:rPr>
-            </w:pPr>
-          </w:p>
-        </w:tc>
-        <w:tc>
-          <w:tcPr>
-            <w:tcW w:w="2340" w:type="dxa"/>
-          </w:tcPr>
-          <w:p>
-            <w:pPr>
-              <w:rPr>
-                <w:sz w:val="20"/>
-                <w:szCs w:val="20"/>
-              </w:rPr>
-            </w:pPr>
-            <w:r>
-              <w:rPr>
-                <w:sz w:val="20"/>
-                <w:szCs w:val="20"/>
-              </w:rPr>
-              <w:t>O(n) time, 0 shuffle stages. Broadcast cost: one-time</w:t>
-            </w:r>
-            <w:r>
-              <w:rPr>
-                <w:sz w:val="20"/>
-                <w:szCs w:val="20"/>
-              </w:rPr>
-              <w:t xml:space="preserve"> </w:t>
-            </w:r>
-            <w:r>
-              <w:rPr>
-                <w:sz w:val="20"/>
-                <w:szCs w:val="20"/>
-              </w:rPr>
-              <w:t>O(10K) network transfer to each executor</w:t>
-            </w:r>
-          </w:p>
-          <w:p>
-            <w:pPr>
-              <w:rPr>
-                <w:b/>
-                <w:bCs/>
-                <w:sz w:val="20"/>
-                <w:szCs w:val="20"/>
-              </w:rPr>
-            </w:pPr>
-          </w:p>
-        </w:tc>
-      </w:tr>
-    </w:tbl>
-    <w:p/>
-    <w:p>
-      <w:pPr>
-        <w:rPr>
-          <w:b/>
-          <w:bCs/>
-        </w:rPr>
-      </w:pPr>
-      <w:r>
-        <w:t xml:space="preserve"> </w:t>
-      </w:r>
-      <w:r>
-        <w:rPr>
-          <w:b/>
-          <w:bCs/>
-        </w:rPr>
-        <w:t>Rationale to use</w:t>
-      </w:r>
-      <w:r>
-        <w:rPr>
-          <w:b/>
-          <w:bCs/>
-        </w:rPr>
-        <w:t xml:space="preserve"> </w:t>
-      </w:r>
-      <w:r>
-        <w:rPr>
-          <w:b/>
-          <w:bCs/>
-        </w:rPr>
-        <w:t xml:space="preserve">Broadcast join instead of </w:t>
-      </w:r>
-      <w:proofErr w:type="spellStart"/>
-      <w:r>
-        <w:rPr>
-          <w:b/>
-          <w:bCs/>
-        </w:rPr>
-        <w:t>RDD.join</w:t>
-      </w:r>
-      <w:proofErr w:type="spellEnd"/>
-    </w:p>
-    <w:p>
-      <w:pPr>
-        <w:pStyle w:val="ListParagraph"/>
-        <w:numPr>
-          <w:ilvl w:val="0"/>
-          <w:numId w:val="8"/>
-        </w:numPr>
-      </w:pPr>
-      <w:r>
-        <w:lastRenderedPageBreak/>
-        <w:t>Dataset B (~10k rows) can easily fit into executor memory</w:t>
-      </w:r>
-    </w:p>
-    <w:p>
-      <w:pPr>
-        <w:pStyle w:val="ListParagraph"/>
-        <w:numPr>
-          <w:ilvl w:val="0"/>
-          <w:numId w:val="8"/>
-        </w:numPr>
-      </w:pPr>
-      <w:r>
-        <w:t>Map side lookup adds zero shuffle stage</w:t>
-      </w:r>
-    </w:p>
-    <w:p>
-      <w:pPr>
-        <w:pStyle w:val="ListParagraph"/>
-        <w:numPr>
-          <w:ilvl w:val="0"/>
-          <w:numId w:val="8"/>
-        </w:numPr>
-      </w:pPr>
-      <w:r>
         <w:t>Reduce the overhead of shuffling and partitioning both RDDs if using standard join</w:t>
       </w:r>
     </w:p>
@@ -6419,8 +7558,9 @@
           <w:numId w:val="15"/>
         </w:numPr>
       </w:pPr>
-      <w:bookmarkStart w:id="7" w:name="_Toc227907259"/>
-      <w:r>
+      <w:bookmarkStart w:id="7" w:name="_Toc227913244"/>
+      <w:r>
+        <w:lastRenderedPageBreak/>
         <w:t xml:space="preserve">Usage of </w:t>
       </w:r>
       <w:r>
@@ -6432,7 +7572,7 @@
       <w:pPr>
         <w:pStyle w:val="Heading3"/>
       </w:pPr>
-      <w:bookmarkStart w:id="8" w:name="_Toc227907260"/>
+      <w:bookmarkStart w:id="8" w:name="_Toc227913245"/>
       <w:r>
         <w:t xml:space="preserve">2.3.1 </w:t>
       </w:r>
@@ -7928,7 +9068,7 @@
       <w:pPr>
         <w:pStyle w:val="Heading3"/>
       </w:pPr>
-      <w:bookmarkStart w:id="9" w:name="_Toc227907261"/>
+      <w:bookmarkStart w:id="9" w:name="_Toc227913246"/>
       <w:r>
         <w:t xml:space="preserve">2.3.2 </w:t>
       </w:r>
@@ -8567,7 +9707,6 @@
           <w:szCs w:val="16"/>
           <w14:ligatures w14:val="none"/>
         </w:rPr>
-        <w:lastRenderedPageBreak/>
         <w:t>    """Deduplicate rows by a specified key index.</w:t>
       </w:r>
     </w:p>
@@ -8709,6 +9848,7 @@
           <w:szCs w:val="16"/>
           <w14:ligatures w14:val="none"/>
         </w:rPr>
+        <w:lastRenderedPageBreak/>
         <w:t>    strips the key wrapper to return the original tuple structure.</w:t>
       </w:r>
     </w:p>
@@ -9579,7 +10719,7 @@
       <w:pPr>
         <w:pStyle w:val="Heading3"/>
       </w:pPr>
-      <w:bookmarkStart w:id="10" w:name="_Toc227907262"/>
+      <w:bookmarkStart w:id="10" w:name="_Toc227913247"/>
       <w:r>
         <w:t xml:space="preserve">2.3.3 </w:t>
       </w:r>
@@ -10521,7 +11661,6 @@
           <w:szCs w:val="16"/>
           <w14:ligatures w14:val="none"/>
         </w:rPr>
-        <w:lastRenderedPageBreak/>
         <w:t>        ),</w:t>
       </w:r>
     </w:p>
@@ -11729,7 +12868,7 @@
       <w:pPr>
         <w:pStyle w:val="Heading3"/>
       </w:pPr>
-      <w:bookmarkStart w:id="11" w:name="_Toc227907263"/>
+      <w:bookmarkStart w:id="11" w:name="_Toc227913248"/>
       <w:r>
         <w:t xml:space="preserve">2.3.4 </w:t>
       </w:r>
@@ -12295,7 +13434,6 @@
           <w:szCs w:val="16"/>
           <w14:ligatures w14:val="none"/>
         </w:rPr>
-        <w:lastRenderedPageBreak/>
         <w:t>    """</w:t>
       </w:r>
     </w:p>
@@ -12543,6 +13681,7 @@
           <w:szCs w:val="16"/>
           <w14:ligatures w14:val="none"/>
         </w:rPr>
+        <w:lastRenderedPageBreak/>
         <w:t xml:space="preserve">return </w:t>
       </w:r>
       <w:proofErr w:type="spellStart"/>
@@ -12839,7 +13978,7 @@
           <w:numId w:val="15"/>
         </w:numPr>
       </w:pPr>
-      <w:bookmarkStart w:id="12" w:name="_Toc227907264"/>
+      <w:bookmarkStart w:id="12" w:name="_Toc227913249"/>
       <w:r>
         <w:t>Other Design Considerations</w:t>
       </w:r>
@@ -13005,7 +14144,7 @@
           <w:numId w:val="23"/>
         </w:numPr>
       </w:pPr>
-      <w:bookmarkStart w:id="13" w:name="_Toc227907265"/>
+      <w:bookmarkStart w:id="13" w:name="_Toc227913250"/>
       <w:r>
         <w:t xml:space="preserve">PROPOSED </w:t>
       </w:r>
@@ -13021,7 +14160,7 @@
       <w:r>
         <w:t xml:space="preserve"> </w:t>
       </w:r>
-      <w:bookmarkStart w:id="14" w:name="_Toc227907266"/>
+      <w:bookmarkStart w:id="14" w:name="_Toc227913251"/>
       <w:r>
         <w:t xml:space="preserve">3.1 Local </w:t>
       </w:r>
@@ -13526,7 +14665,6 @@
               <w:rPr>
                 <w:rFonts w:ascii="Times New Roman" w:hAnsi="Times New Roman" w:cs="Times New Roman"/>
               </w:rPr>
-              <w:lastRenderedPageBreak/>
               <w:t>Data size is not huge</w:t>
             </w:r>
           </w:p>
@@ -13556,7 +14694,6 @@
               <w:rPr>
                 <w:rFonts w:ascii="Times New Roman" w:hAnsi="Times New Roman" w:cs="Times New Roman"/>
               </w:rPr>
-              <w:lastRenderedPageBreak/>
               <w:t>spark.driver</w:t>
             </w:r>
             <w:proofErr w:type="gramEnd"/>
@@ -13612,6 +14749,7 @@
               <w:rPr>
                 <w:rFonts w:ascii="Times New Roman" w:hAnsi="Times New Roman" w:cs="Times New Roman"/>
               </w:rPr>
+              <w:lastRenderedPageBreak/>
               <w:t>Pipeline is mostly map/reduce with small metadata in memory (example, broadcast for lookup)</w:t>
             </w:r>
           </w:p>
@@ -13656,7 +14794,7 @@
       <w:pPr>
         <w:pStyle w:val="Heading2"/>
       </w:pPr>
-      <w:bookmarkStart w:id="15" w:name="_Toc227907267"/>
+      <w:bookmarkStart w:id="15" w:name="_Toc227913252"/>
       <w:r>
         <w:t xml:space="preserve">3.2 </w:t>
       </w:r>
@@ -14404,7 +15542,6 @@
               <w:rPr>
                 <w:rFonts w:ascii="Times New Roman" w:hAnsi="Times New Roman" w:cs="Times New Roman"/>
               </w:rPr>
-              <w:lastRenderedPageBreak/>
               <w:t xml:space="preserve">Executor memory is typically 2x (common rule of thumb) </w:t>
             </w:r>
             <w:r>
@@ -14429,6 +15566,7 @@
               <w:rPr>
                 <w:rFonts w:ascii="Times New Roman" w:hAnsi="Times New Roman" w:cs="Times New Roman"/>
               </w:rPr>
+              <w:lastRenderedPageBreak/>
               <w:t xml:space="preserve">4g executor memory can easily accommodate </w:t>
             </w:r>
             <w:proofErr w:type="spellStart"/>
@@ -14801,7 +15939,7 @@
           <w:numId w:val="23"/>
         </w:numPr>
       </w:pPr>
-      <w:bookmarkStart w:id="16" w:name="_Toc227907268"/>
+      <w:bookmarkStart w:id="16" w:name="_Toc227913253"/>
       <w:r>
         <w:t>Production Cluster (Yarn/Kubernetes, larger dataset)</w:t>
       </w:r>
@@ -15287,7 +16425,6 @@
                 <w:b/>
                 <w:bCs/>
               </w:rPr>
-              <w:lastRenderedPageBreak/>
               <w:t>Configuration</w:t>
             </w:r>
           </w:p>
@@ -15425,6 +16562,7 @@
               <w:rPr>
                 <w:rFonts w:ascii="Times New Roman" w:hAnsi="Times New Roman" w:cs="Times New Roman"/>
               </w:rPr>
+              <w:lastRenderedPageBreak/>
               <w:t>spark.sql.shuffle</w:t>
             </w:r>
             <w:proofErr w:type="gramEnd"/>
@@ -16305,7 +17443,7 @@
           <w:numId w:val="23"/>
         </w:numPr>
       </w:pPr>
-      <w:bookmarkStart w:id="17" w:name="_Toc227907269"/>
+      <w:bookmarkStart w:id="17" w:name="_Toc227913254"/>
       <w:r>
         <w:lastRenderedPageBreak/>
         <w:t>Configuration Tuning</w:t>
@@ -17541,6 +18679,155 @@
     </w:lvl>
   </w:abstractNum>
   <w:abstractNum w:abstractNumId="10" w15:restartNumberingAfterBreak="0">
+    <w:nsid w:val="2C4C2E1C"/>
+    <w:multiLevelType w:val="multilevel"/>
+    <w:tmpl w:val="3028BEBA"/>
+    <w:lvl w:ilvl="0">
+      <w:start w:val="1"/>
+      <w:numFmt w:val="bullet"/>
+      <w:lvlText w:val=""/>
+      <w:lvlJc w:val="left"/>
+      <w:pPr>
+        <w:tabs>
+          <w:tab w:val="num" w:pos="360"/>
+        </w:tabs>
+        <w:ind w:left="360" w:hanging="360"/>
+      </w:pPr>
+      <w:rPr>
+        <w:rFonts w:ascii="Symbol" w:hAnsi="Symbol" w:hint="default"/>
+        <w:sz w:val="20"/>
+      </w:rPr>
+    </w:lvl>
+    <w:lvl w:ilvl="1" w:tentative="1">
+      <w:start w:val="1"/>
+      <w:numFmt w:val="bullet"/>
+      <w:lvlText w:val="o"/>
+      <w:lvlJc w:val="left"/>
+      <w:pPr>
+        <w:tabs>
+          <w:tab w:val="num" w:pos="1080"/>
+        </w:tabs>
+        <w:ind w:left="1080" w:hanging="360"/>
+      </w:pPr>
+      <w:rPr>
+        <w:rFonts w:ascii="Courier New" w:hAnsi="Courier New" w:hint="default"/>
+        <w:sz w:val="20"/>
+      </w:rPr>
+    </w:lvl>
+    <w:lvl w:ilvl="2" w:tentative="1">
+      <w:start w:val="1"/>
+      <w:numFmt w:val="bullet"/>
+      <w:lvlText w:val=""/>
+      <w:lvlJc w:val="left"/>
+      <w:pPr>
+        <w:tabs>
+          <w:tab w:val="num" w:pos="1800"/>
+        </w:tabs>
+        <w:ind w:left="1800" w:hanging="360"/>
+      </w:pPr>
+      <w:rPr>
+        <w:rFonts w:ascii="Wingdings" w:hAnsi="Wingdings" w:hint="default"/>
+        <w:sz w:val="20"/>
+      </w:rPr>
+    </w:lvl>
+    <w:lvl w:ilvl="3" w:tentative="1">
+      <w:start w:val="1"/>
+      <w:numFmt w:val="bullet"/>
+      <w:lvlText w:val=""/>
+      <w:lvlJc w:val="left"/>
+      <w:pPr>
+        <w:tabs>
+          <w:tab w:val="num" w:pos="2520"/>
+        </w:tabs>
+        <w:ind w:left="2520" w:hanging="360"/>
+      </w:pPr>
+      <w:rPr>
+        <w:rFonts w:ascii="Wingdings" w:hAnsi="Wingdings" w:hint="default"/>
+        <w:sz w:val="20"/>
+      </w:rPr>
+    </w:lvl>
+    <w:lvl w:ilvl="4" w:tentative="1">
+      <w:start w:val="1"/>
+      <w:numFmt w:val="bullet"/>
+      <w:lvlText w:val=""/>
+      <w:lvlJc w:val="left"/>
+      <w:pPr>
+        <w:tabs>
+          <w:tab w:val="num" w:pos="3240"/>
+        </w:tabs>
+        <w:ind w:left="3240" w:hanging="360"/>
+      </w:pPr>
+      <w:rPr>
+        <w:rFonts w:ascii="Wingdings" w:hAnsi="Wingdings" w:hint="default"/>
+        <w:sz w:val="20"/>
+      </w:rPr>
+    </w:lvl>
+    <w:lvl w:ilvl="5" w:tentative="1">
+      <w:start w:val="1"/>
+      <w:numFmt w:val="bullet"/>
+      <w:lvlText w:val=""/>
+      <w:lvlJc w:val="left"/>
+      <w:pPr>
+        <w:tabs>
+          <w:tab w:val="num" w:pos="3960"/>
+        </w:tabs>
+        <w:ind w:left="3960" w:hanging="360"/>
+      </w:pPr>
+      <w:rPr>
+        <w:rFonts w:ascii="Wingdings" w:hAnsi="Wingdings" w:hint="default"/>
+        <w:sz w:val="20"/>
+      </w:rPr>
+    </w:lvl>
+    <w:lvl w:ilvl="6" w:tentative="1">
+      <w:start w:val="1"/>
+      <w:numFmt w:val="bullet"/>
+      <w:lvlText w:val=""/>
+      <w:lvlJc w:val="left"/>
+      <w:pPr>
+        <w:tabs>
+          <w:tab w:val="num" w:pos="4680"/>
+        </w:tabs>
+        <w:ind w:left="4680" w:hanging="360"/>
+      </w:pPr>
+      <w:rPr>
+        <w:rFonts w:ascii="Wingdings" w:hAnsi="Wingdings" w:hint="default"/>
+        <w:sz w:val="20"/>
+      </w:rPr>
+    </w:lvl>
+    <w:lvl w:ilvl="7" w:tentative="1">
+      <w:start w:val="1"/>
+      <w:numFmt w:val="bullet"/>
+      <w:lvlText w:val=""/>
+      <w:lvlJc w:val="left"/>
+      <w:pPr>
+        <w:tabs>
+          <w:tab w:val="num" w:pos="5400"/>
+        </w:tabs>
+        <w:ind w:left="5400" w:hanging="360"/>
+      </w:pPr>
+      <w:rPr>
+        <w:rFonts w:ascii="Wingdings" w:hAnsi="Wingdings" w:hint="default"/>
+        <w:sz w:val="20"/>
+      </w:rPr>
+    </w:lvl>
+    <w:lvl w:ilvl="8" w:tentative="1">
+      <w:start w:val="1"/>
+      <w:numFmt w:val="bullet"/>
+      <w:lvlText w:val=""/>
+      <w:lvlJc w:val="left"/>
+      <w:pPr>
+        <w:tabs>
+          <w:tab w:val="num" w:pos="6120"/>
+        </w:tabs>
+        <w:ind w:left="6120" w:hanging="360"/>
+      </w:pPr>
+      <w:rPr>
+        <w:rFonts w:ascii="Wingdings" w:hAnsi="Wingdings" w:hint="default"/>
+        <w:sz w:val="20"/>
+      </w:rPr>
+    </w:lvl>
+  </w:abstractNum>
+  <w:abstractNum w:abstractNumId="11" w15:restartNumberingAfterBreak="0">
     <w:nsid w:val="2C78397B"/>
     <w:multiLevelType w:val="hybridMultilevel"/>
     <w:tmpl w:val="E9DA00FA"/>
@@ -17629,7 +18916,7 @@
       </w:pPr>
     </w:lvl>
   </w:abstractNum>
-  <w:abstractNum w:abstractNumId="11" w15:restartNumberingAfterBreak="0">
+  <w:abstractNum w:abstractNumId="12" w15:restartNumberingAfterBreak="0">
     <w:nsid w:val="2CA6190C"/>
     <w:multiLevelType w:val="multilevel"/>
     <w:tmpl w:val="48B6C91E"/>
@@ -17742,7 +19029,7 @@
       </w:rPr>
     </w:lvl>
   </w:abstractNum>
-  <w:abstractNum w:abstractNumId="12" w15:restartNumberingAfterBreak="0">
+  <w:abstractNum w:abstractNumId="13" w15:restartNumberingAfterBreak="0">
     <w:nsid w:val="2D927959"/>
     <w:multiLevelType w:val="multilevel"/>
     <w:tmpl w:val="D2965D30"/>
@@ -17863,7 +19150,7 @@
       </w:rPr>
     </w:lvl>
   </w:abstractNum>
-  <w:abstractNum w:abstractNumId="13" w15:restartNumberingAfterBreak="0">
+  <w:abstractNum w:abstractNumId="14" w15:restartNumberingAfterBreak="0">
     <w:nsid w:val="2DBF45DD"/>
     <w:multiLevelType w:val="hybridMultilevel"/>
     <w:tmpl w:val="C44ADA96"/>
@@ -17976,7 +19263,7 @@
       </w:rPr>
     </w:lvl>
   </w:abstractNum>
-  <w:abstractNum w:abstractNumId="14" w15:restartNumberingAfterBreak="0">
+  <w:abstractNum w:abstractNumId="15" w15:restartNumberingAfterBreak="0">
     <w:nsid w:val="3CDB5E4E"/>
     <w:multiLevelType w:val="hybridMultilevel"/>
     <w:tmpl w:val="C1C8B8C0"/>
@@ -18089,7 +19376,7 @@
       </w:rPr>
     </w:lvl>
   </w:abstractNum>
-  <w:abstractNum w:abstractNumId="15" w15:restartNumberingAfterBreak="0">
+  <w:abstractNum w:abstractNumId="16" w15:restartNumberingAfterBreak="0">
     <w:nsid w:val="43E85F37"/>
     <w:multiLevelType w:val="hybridMultilevel"/>
     <w:tmpl w:val="A420DEBE"/>
@@ -18178,7 +19465,7 @@
       </w:pPr>
     </w:lvl>
   </w:abstractNum>
-  <w:abstractNum w:abstractNumId="16" w15:restartNumberingAfterBreak="0">
+  <w:abstractNum w:abstractNumId="17" w15:restartNumberingAfterBreak="0">
     <w:nsid w:val="54AC2084"/>
     <w:multiLevelType w:val="multilevel"/>
     <w:tmpl w:val="2474EF56"/>
@@ -18291,7 +19578,7 @@
       </w:rPr>
     </w:lvl>
   </w:abstractNum>
-  <w:abstractNum w:abstractNumId="17" w15:restartNumberingAfterBreak="0">
+  <w:abstractNum w:abstractNumId="18" w15:restartNumberingAfterBreak="0">
     <w:nsid w:val="5A02406E"/>
     <w:multiLevelType w:val="multilevel"/>
     <w:tmpl w:val="E17E2028"/>
@@ -18404,7 +19691,7 @@
       </w:rPr>
     </w:lvl>
   </w:abstractNum>
-  <w:abstractNum w:abstractNumId="18" w15:restartNumberingAfterBreak="0">
+  <w:abstractNum w:abstractNumId="19" w15:restartNumberingAfterBreak="0">
     <w:nsid w:val="61636A50"/>
     <w:multiLevelType w:val="multilevel"/>
     <w:tmpl w:val="782A8284"/>
@@ -18535,7 +19822,7 @@
       </w:rPr>
     </w:lvl>
   </w:abstractNum>
-  <w:abstractNum w:abstractNumId="19" w15:restartNumberingAfterBreak="0">
+  <w:abstractNum w:abstractNumId="20" w15:restartNumberingAfterBreak="0">
     <w:nsid w:val="63AC7B59"/>
     <w:multiLevelType w:val="hybridMultilevel"/>
     <w:tmpl w:val="4178F36E"/>
@@ -18648,7 +19935,7 @@
       </w:rPr>
     </w:lvl>
   </w:abstractNum>
-  <w:abstractNum w:abstractNumId="20" w15:restartNumberingAfterBreak="0">
+  <w:abstractNum w:abstractNumId="21" w15:restartNumberingAfterBreak="0">
     <w:nsid w:val="68846581"/>
     <w:multiLevelType w:val="multilevel"/>
     <w:tmpl w:val="0824A4B6"/>
@@ -18769,7 +20056,7 @@
       </w:rPr>
     </w:lvl>
   </w:abstractNum>
-  <w:abstractNum w:abstractNumId="21" w15:restartNumberingAfterBreak="0">
+  <w:abstractNum w:abstractNumId="22" w15:restartNumberingAfterBreak="0">
     <w:nsid w:val="68E973FB"/>
     <w:multiLevelType w:val="multilevel"/>
     <w:tmpl w:val="70B69A84"/>
@@ -18882,7 +20169,7 @@
       </w:rPr>
     </w:lvl>
   </w:abstractNum>
-  <w:abstractNum w:abstractNumId="22" w15:restartNumberingAfterBreak="0">
+  <w:abstractNum w:abstractNumId="23" w15:restartNumberingAfterBreak="0">
     <w:nsid w:val="746F0D3E"/>
     <w:multiLevelType w:val="multilevel"/>
     <w:tmpl w:val="5798BC08"/>
@@ -18995,7 +20282,7 @@
       </w:pPr>
     </w:lvl>
   </w:abstractNum>
-  <w:abstractNum w:abstractNumId="23" w15:restartNumberingAfterBreak="0">
+  <w:abstractNum w:abstractNumId="24" w15:restartNumberingAfterBreak="0">
     <w:nsid w:val="79394F9D"/>
     <w:multiLevelType w:val="multilevel"/>
     <w:tmpl w:val="2572C7D2"/>
@@ -19108,7 +20395,7 @@
       </w:rPr>
     </w:lvl>
   </w:abstractNum>
-  <w:abstractNum w:abstractNumId="24" w15:restartNumberingAfterBreak="0">
+  <w:abstractNum w:abstractNumId="25" w15:restartNumberingAfterBreak="0">
     <w:nsid w:val="7F0E130A"/>
     <w:multiLevelType w:val="multilevel"/>
     <w:tmpl w:val="0824A4B6"/>
@@ -19230,10 +20517,10 @@
     </w:lvl>
   </w:abstractNum>
   <w:num w:numId="1" w16cid:durableId="1042050197">
-    <w:abstractNumId w:val="15"/>
+    <w:abstractNumId w:val="16"/>
   </w:num>
   <w:num w:numId="2" w16cid:durableId="306781178">
-    <w:abstractNumId w:val="24"/>
+    <w:abstractNumId w:val="25"/>
   </w:num>
   <w:num w:numId="3" w16cid:durableId="249430799">
     <w:abstractNumId w:val="5"/>
@@ -19242,13 +20529,13 @@
     <w:abstractNumId w:val="4"/>
   </w:num>
   <w:num w:numId="5" w16cid:durableId="2043019589">
-    <w:abstractNumId w:val="22"/>
+    <w:abstractNumId w:val="23"/>
   </w:num>
   <w:num w:numId="6" w16cid:durableId="311179203">
-    <w:abstractNumId w:val="10"/>
+    <w:abstractNumId w:val="11"/>
   </w:num>
   <w:num w:numId="7" w16cid:durableId="927495917">
-    <w:abstractNumId w:val="14"/>
+    <w:abstractNumId w:val="15"/>
   </w:num>
   <w:num w:numId="8" w16cid:durableId="961502708">
     <w:abstractNumId w:val="9"/>
@@ -19263,46 +20550,49 @@
     <w:abstractNumId w:val="1"/>
   </w:num>
   <w:num w:numId="12" w16cid:durableId="1227111701">
-    <w:abstractNumId w:val="19"/>
+    <w:abstractNumId w:val="20"/>
   </w:num>
   <w:num w:numId="13" w16cid:durableId="1126506911">
-    <w:abstractNumId w:val="20"/>
+    <w:abstractNumId w:val="21"/>
   </w:num>
   <w:num w:numId="14" w16cid:durableId="220215910">
-    <w:abstractNumId w:val="11"/>
+    <w:abstractNumId w:val="12"/>
   </w:num>
   <w:num w:numId="15" w16cid:durableId="239365490">
-    <w:abstractNumId w:val="17"/>
+    <w:abstractNumId w:val="18"/>
   </w:num>
   <w:num w:numId="16" w16cid:durableId="670721075">
-    <w:abstractNumId w:val="23"/>
+    <w:abstractNumId w:val="24"/>
   </w:num>
   <w:num w:numId="17" w16cid:durableId="344477991">
     <w:abstractNumId w:val="3"/>
   </w:num>
   <w:num w:numId="18" w16cid:durableId="62526419">
-    <w:abstractNumId w:val="13"/>
+    <w:abstractNumId w:val="14"/>
   </w:num>
   <w:num w:numId="19" w16cid:durableId="1349941960">
-    <w:abstractNumId w:val="18"/>
+    <w:abstractNumId w:val="19"/>
   </w:num>
   <w:num w:numId="20" w16cid:durableId="1020858559">
     <w:abstractNumId w:val="8"/>
   </w:num>
   <w:num w:numId="21" w16cid:durableId="446973237">
-    <w:abstractNumId w:val="21"/>
+    <w:abstractNumId w:val="22"/>
   </w:num>
   <w:num w:numId="22" w16cid:durableId="655457045">
-    <w:abstractNumId w:val="16"/>
+    <w:abstractNumId w:val="17"/>
   </w:num>
   <w:num w:numId="23" w16cid:durableId="1616710227">
     <w:abstractNumId w:val="7"/>
   </w:num>
   <w:num w:numId="24" w16cid:durableId="265769475">
-    <w:abstractNumId w:val="12"/>
+    <w:abstractNumId w:val="13"/>
   </w:num>
   <w:num w:numId="25" w16cid:durableId="236284351">
     <w:abstractNumId w:val="0"/>
+  </w:num>
+  <w:num w:numId="26" w16cid:durableId="1076320901">
+    <w:abstractNumId w:val="10"/>
   </w:num>
 </w:numbering>
 </file>
@@ -19707,7 +20997,7 @@
   <w:style w:type="paragraph" w:default="1" w:styleId="Normal">
     <w:name w:val="Normal"/>
     <w:qFormat/>
-    <w:rsid w:val="008F5C87"/>
+    <w:rsid w:val="0029268A"/>
   </w:style>
   <w:style w:type="paragraph" w:styleId="Heading1">
     <w:name w:val="heading 1"/>

</xml_diff>

<commit_message>
update the documentation and pdf generation
</commit_message>
<xml_diff>
--- a/docs/1. Code and Configuration.docx
+++ b/docs/1. Code and Configuration.docx
@@ -198,7 +198,7 @@
           <w:r>
             <w:fldChar w:fldCharType="separate"/>
           </w:r>
-          <w:hyperlink w:anchor="_Toc227913237" w:history="1">
+          <w:hyperlink w:anchor="_Toc227916376" w:history="1">
             <w:r>
               <w:rPr>
                 <w:rStyle w:val="Hyperlink"/>
@@ -238,7 +238,7 @@
                 <w:noProof/>
                 <w:webHidden/>
               </w:rPr>
-              <w:instrText xml:space="preserve"> PAGEREF _Toc227913237 \h </w:instrText>
+              <w:instrText xml:space="preserve"> PAGEREF _Toc227916376 \h </w:instrText>
             </w:r>
             <w:r>
               <w:rPr>
@@ -280,7 +280,7 @@
               <w:noProof/>
             </w:rPr>
           </w:pPr>
-          <w:hyperlink w:anchor="_Toc227913238" w:history="1">
+          <w:hyperlink w:anchor="_Toc227916377" w:history="1">
             <w:r>
               <w:rPr>
                 <w:rStyle w:val="Hyperlink"/>
@@ -320,7 +320,7 @@
                 <w:noProof/>
                 <w:webHidden/>
               </w:rPr>
-              <w:instrText xml:space="preserve"> PAGEREF _Toc227913238 \h </w:instrText>
+              <w:instrText xml:space="preserve"> PAGEREF _Toc227916377 \h </w:instrText>
             </w:r>
             <w:r>
               <w:rPr>
@@ -362,7 +362,7 @@
               <w:noProof/>
             </w:rPr>
           </w:pPr>
-          <w:hyperlink w:anchor="_Toc227913239" w:history="1">
+          <w:hyperlink w:anchor="_Toc227916378" w:history="1">
             <w:r>
               <w:rPr>
                 <w:rStyle w:val="Hyperlink"/>
@@ -402,7 +402,7 @@
                 <w:noProof/>
                 <w:webHidden/>
               </w:rPr>
-              <w:instrText xml:space="preserve"> PAGEREF _Toc227913239 \h </w:instrText>
+              <w:instrText xml:space="preserve"> PAGEREF _Toc227916378 \h </w:instrText>
             </w:r>
             <w:r>
               <w:rPr>
@@ -443,7 +443,7 @@
               <w:noProof/>
             </w:rPr>
           </w:pPr>
-          <w:hyperlink w:anchor="_Toc227913240" w:history="1">
+          <w:hyperlink w:anchor="_Toc227916379" w:history="1">
             <w:r>
               <w:rPr>
                 <w:rStyle w:val="Hyperlink"/>
@@ -470,7 +470,7 @@
                 <w:noProof/>
                 <w:webHidden/>
               </w:rPr>
-              <w:instrText xml:space="preserve"> PAGEREF _Toc227913240 \h </w:instrText>
+              <w:instrText xml:space="preserve"> PAGEREF _Toc227916379 \h </w:instrText>
             </w:r>
             <w:r>
               <w:rPr>
@@ -512,7 +512,7 @@
               <w:noProof/>
             </w:rPr>
           </w:pPr>
-          <w:hyperlink w:anchor="_Toc227913241" w:history="1">
+          <w:hyperlink w:anchor="_Toc227916380" w:history="1">
             <w:r>
               <w:rPr>
                 <w:rStyle w:val="Hyperlink"/>
@@ -552,7 +552,7 @@
                 <w:noProof/>
                 <w:webHidden/>
               </w:rPr>
-              <w:instrText xml:space="preserve"> PAGEREF _Toc227913241 \h </w:instrText>
+              <w:instrText xml:space="preserve"> PAGEREF _Toc227916380 \h </w:instrText>
             </w:r>
             <w:r>
               <w:rPr>
@@ -594,7 +594,7 @@
               <w:noProof/>
             </w:rPr>
           </w:pPr>
-          <w:hyperlink w:anchor="_Toc227913242" w:history="1">
+          <w:hyperlink w:anchor="_Toc227916381" w:history="1">
             <w:r>
               <w:rPr>
                 <w:rStyle w:val="Hyperlink"/>
@@ -634,7 +634,7 @@
                 <w:noProof/>
                 <w:webHidden/>
               </w:rPr>
-              <w:instrText xml:space="preserve"> PAGEREF _Toc227913242 \h </w:instrText>
+              <w:instrText xml:space="preserve"> PAGEREF _Toc227916381 \h </w:instrText>
             </w:r>
             <w:r>
               <w:rPr>
@@ -675,7 +675,7 @@
               <w:noProof/>
             </w:rPr>
           </w:pPr>
-          <w:hyperlink w:anchor="_Toc227913243" w:history="1">
+          <w:hyperlink w:anchor="_Toc227916382" w:history="1">
             <w:r>
               <w:rPr>
                 <w:rStyle w:val="Hyperlink"/>
@@ -702,7 +702,7 @@
                 <w:noProof/>
                 <w:webHidden/>
               </w:rPr>
-              <w:instrText xml:space="preserve"> PAGEREF _Toc227913243 \h </w:instrText>
+              <w:instrText xml:space="preserve"> PAGEREF _Toc227916382 \h </w:instrText>
             </w:r>
             <w:r>
               <w:rPr>
@@ -744,7 +744,7 @@
               <w:noProof/>
             </w:rPr>
           </w:pPr>
-          <w:hyperlink w:anchor="_Toc227913244" w:history="1">
+          <w:hyperlink w:anchor="_Toc227916383" w:history="1">
             <w:r>
               <w:rPr>
                 <w:rStyle w:val="Hyperlink"/>
@@ -784,7 +784,7 @@
                 <w:noProof/>
                 <w:webHidden/>
               </w:rPr>
-              <w:instrText xml:space="preserve"> PAGEREF _Toc227913244 \h </w:instrText>
+              <w:instrText xml:space="preserve"> PAGEREF _Toc227916383 \h </w:instrText>
             </w:r>
             <w:r>
               <w:rPr>
@@ -825,7 +825,7 @@
               <w:noProof/>
             </w:rPr>
           </w:pPr>
-          <w:hyperlink w:anchor="_Toc227913245" w:history="1">
+          <w:hyperlink w:anchor="_Toc227916384" w:history="1">
             <w:r>
               <w:rPr>
                 <w:rStyle w:val="Hyperlink"/>
@@ -852,7 +852,7 @@
                 <w:noProof/>
                 <w:webHidden/>
               </w:rPr>
-              <w:instrText xml:space="preserve"> PAGEREF _Toc227913245 \h </w:instrText>
+              <w:instrText xml:space="preserve"> PAGEREF _Toc227916384 \h </w:instrText>
             </w:r>
             <w:r>
               <w:rPr>
@@ -893,7 +893,7 @@
               <w:noProof/>
             </w:rPr>
           </w:pPr>
-          <w:hyperlink w:anchor="_Toc227913246" w:history="1">
+          <w:hyperlink w:anchor="_Toc227916385" w:history="1">
             <w:r>
               <w:rPr>
                 <w:rStyle w:val="Hyperlink"/>
@@ -920,7 +920,7 @@
                 <w:noProof/>
                 <w:webHidden/>
               </w:rPr>
-              <w:instrText xml:space="preserve"> PAGEREF _Toc227913246 \h </w:instrText>
+              <w:instrText xml:space="preserve"> PAGEREF _Toc227916385 \h </w:instrText>
             </w:r>
             <w:r>
               <w:rPr>
@@ -961,7 +961,7 @@
               <w:noProof/>
             </w:rPr>
           </w:pPr>
-          <w:hyperlink w:anchor="_Toc227913247" w:history="1">
+          <w:hyperlink w:anchor="_Toc227916386" w:history="1">
             <w:r>
               <w:rPr>
                 <w:rStyle w:val="Hyperlink"/>
@@ -988,7 +988,7 @@
                 <w:noProof/>
                 <w:webHidden/>
               </w:rPr>
-              <w:instrText xml:space="preserve"> PAGEREF _Toc227913247 \h </w:instrText>
+              <w:instrText xml:space="preserve"> PAGEREF _Toc227916386 \h </w:instrText>
             </w:r>
             <w:r>
               <w:rPr>
@@ -1029,7 +1029,7 @@
               <w:noProof/>
             </w:rPr>
           </w:pPr>
-          <w:hyperlink w:anchor="_Toc227913248" w:history="1">
+          <w:hyperlink w:anchor="_Toc227916387" w:history="1">
             <w:r>
               <w:rPr>
                 <w:rStyle w:val="Hyperlink"/>
@@ -1056,7 +1056,7 @@
                 <w:noProof/>
                 <w:webHidden/>
               </w:rPr>
-              <w:instrText xml:space="preserve"> PAGEREF _Toc227913248 \h </w:instrText>
+              <w:instrText xml:space="preserve"> PAGEREF _Toc227916387 \h </w:instrText>
             </w:r>
             <w:r>
               <w:rPr>
@@ -1098,7 +1098,7 @@
               <w:noProof/>
             </w:rPr>
           </w:pPr>
-          <w:hyperlink w:anchor="_Toc227913249" w:history="1">
+          <w:hyperlink w:anchor="_Toc227916388" w:history="1">
             <w:r>
               <w:rPr>
                 <w:rStyle w:val="Hyperlink"/>
@@ -1138,7 +1138,7 @@
                 <w:noProof/>
                 <w:webHidden/>
               </w:rPr>
-              <w:instrText xml:space="preserve"> PAGEREF _Toc227913249 \h </w:instrText>
+              <w:instrText xml:space="preserve"> PAGEREF _Toc227916388 \h </w:instrText>
             </w:r>
             <w:r>
               <w:rPr>
@@ -1180,7 +1180,7 @@
               <w:noProof/>
             </w:rPr>
           </w:pPr>
-          <w:hyperlink w:anchor="_Toc227913250" w:history="1">
+          <w:hyperlink w:anchor="_Toc227916389" w:history="1">
             <w:r>
               <w:rPr>
                 <w:rStyle w:val="Hyperlink"/>
@@ -1220,7 +1220,7 @@
                 <w:noProof/>
                 <w:webHidden/>
               </w:rPr>
-              <w:instrText xml:space="preserve"> PAGEREF _Toc227913250 \h </w:instrText>
+              <w:instrText xml:space="preserve"> PAGEREF _Toc227916389 \h </w:instrText>
             </w:r>
             <w:r>
               <w:rPr>
@@ -1261,7 +1261,7 @@
               <w:noProof/>
             </w:rPr>
           </w:pPr>
-          <w:hyperlink w:anchor="_Toc227913251" w:history="1">
+          <w:hyperlink w:anchor="_Toc227916390" w:history="1">
             <w:r>
               <w:rPr>
                 <w:rStyle w:val="Hyperlink"/>
@@ -1288,7 +1288,7 @@
                 <w:noProof/>
                 <w:webHidden/>
               </w:rPr>
-              <w:instrText xml:space="preserve"> PAGEREF _Toc227913251 \h </w:instrText>
+              <w:instrText xml:space="preserve"> PAGEREF _Toc227916390 \h </w:instrText>
             </w:r>
             <w:r>
               <w:rPr>
@@ -1329,7 +1329,7 @@
               <w:noProof/>
             </w:rPr>
           </w:pPr>
-          <w:hyperlink w:anchor="_Toc227913252" w:history="1">
+          <w:hyperlink w:anchor="_Toc227916391" w:history="1">
             <w:r>
               <w:rPr>
                 <w:rStyle w:val="Hyperlink"/>
@@ -1356,7 +1356,7 @@
                 <w:noProof/>
                 <w:webHidden/>
               </w:rPr>
-              <w:instrText xml:space="preserve"> PAGEREF _Toc227913252 \h </w:instrText>
+              <w:instrText xml:space="preserve"> PAGEREF _Toc227916391 \h </w:instrText>
             </w:r>
             <w:r>
               <w:rPr>
@@ -1398,7 +1398,7 @@
               <w:noProof/>
             </w:rPr>
           </w:pPr>
-          <w:hyperlink w:anchor="_Toc227913253" w:history="1">
+          <w:hyperlink w:anchor="_Toc227916392" w:history="1">
             <w:r>
               <w:rPr>
                 <w:rStyle w:val="Hyperlink"/>
@@ -1410,7 +1410,7 @@
               <w:rPr>
                 <w:noProof/>
               </w:rPr>
-              <w:tab/>
+              <w:t xml:space="preserve"> </w:t>
             </w:r>
             <w:r>
               <w:rPr>
@@ -1438,7 +1438,7 @@
                 <w:noProof/>
                 <w:webHidden/>
               </w:rPr>
-              <w:instrText xml:space="preserve"> PAGEREF _Toc227913253 \h </w:instrText>
+              <w:instrText xml:space="preserve"> PAGEREF _Toc227916392 \h </w:instrText>
             </w:r>
             <w:r>
               <w:rPr>
@@ -1459,88 +1459,6 @@
                 <w:webHidden/>
               </w:rPr>
               <w:t>14</w:t>
-            </w:r>
-            <w:r>
-              <w:rPr>
-                <w:noProof/>
-                <w:webHidden/>
-              </w:rPr>
-              <w:fldChar w:fldCharType="end"/>
-            </w:r>
-          </w:hyperlink>
-        </w:p>
-        <w:p>
-          <w:pPr>
-            <w:pStyle w:val="TOC2"/>
-            <w:tabs>
-              <w:tab w:val="left" w:pos="960"/>
-              <w:tab w:val="right" w:leader="dot" w:pos="9350"/>
-            </w:tabs>
-            <w:rPr>
-              <w:noProof/>
-            </w:rPr>
-          </w:pPr>
-          <w:hyperlink w:anchor="_Toc227913254" w:history="1">
-            <w:r>
-              <w:rPr>
-                <w:rStyle w:val="Hyperlink"/>
-                <w:noProof/>
-              </w:rPr>
-              <w:t>3.4</w:t>
-            </w:r>
-            <w:r>
-              <w:rPr>
-                <w:noProof/>
-              </w:rPr>
-              <w:tab/>
-            </w:r>
-            <w:r>
-              <w:rPr>
-                <w:rStyle w:val="Hyperlink"/>
-                <w:noProof/>
-              </w:rPr>
-              <w:t>Configuration Tuning</w:t>
-            </w:r>
-            <w:r>
-              <w:rPr>
-                <w:noProof/>
-                <w:webHidden/>
-              </w:rPr>
-              <w:tab/>
-            </w:r>
-            <w:r>
-              <w:rPr>
-                <w:noProof/>
-                <w:webHidden/>
-              </w:rPr>
-              <w:fldChar w:fldCharType="begin"/>
-            </w:r>
-            <w:r>
-              <w:rPr>
-                <w:noProof/>
-                <w:webHidden/>
-              </w:rPr>
-              <w:instrText xml:space="preserve"> PAGEREF _Toc227913254 \h </w:instrText>
-            </w:r>
-            <w:r>
-              <w:rPr>
-                <w:noProof/>
-                <w:webHidden/>
-              </w:rPr>
-            </w:r>
-            <w:r>
-              <w:rPr>
-                <w:noProof/>
-                <w:webHidden/>
-              </w:rPr>
-              <w:fldChar w:fldCharType="separate"/>
-            </w:r>
-            <w:r>
-              <w:rPr>
-                <w:noProof/>
-                <w:webHidden/>
-              </w:rPr>
-              <w:t>16</w:t>
             </w:r>
             <w:r>
               <w:rPr>
@@ -1598,7 +1516,7 @@
           <w:numId w:val="20"/>
         </w:numPr>
       </w:pPr>
-      <w:bookmarkStart w:id="0" w:name="_Toc227913237"/>
+      <w:bookmarkStart w:id="0" w:name="_Toc227916376"/>
       <w:r>
         <w:lastRenderedPageBreak/>
         <w:t>REQUREMENTS</w:t>
@@ -1616,7 +1534,7 @@
           <w:numId w:val="14"/>
         </w:numPr>
       </w:pPr>
-      <w:bookmarkStart w:id="1" w:name="_Toc227913238"/>
+      <w:bookmarkStart w:id="1" w:name="_Toc227916377"/>
       <w:r>
         <w:t>Objectives</w:t>
       </w:r>
@@ -1832,7 +1750,7 @@
           <w:numId w:val="14"/>
         </w:numPr>
       </w:pPr>
-      <w:bookmarkStart w:id="2" w:name="_Toc227913239"/>
+      <w:bookmarkStart w:id="2" w:name="_Toc227916378"/>
       <w:r>
         <w:t>Constraints</w:t>
       </w:r>
@@ -2097,7 +2015,7 @@
       <w:pPr>
         <w:pStyle w:val="Heading1"/>
       </w:pPr>
-      <w:bookmarkStart w:id="3" w:name="_Toc227913240"/>
+      <w:bookmarkStart w:id="3" w:name="_Toc227916379"/>
       <w:r>
         <w:lastRenderedPageBreak/>
         <w:t xml:space="preserve">2. </w:t>
@@ -2115,7 +2033,7 @@
           <w:numId w:val="15"/>
         </w:numPr>
       </w:pPr>
-      <w:bookmarkStart w:id="4" w:name="_Toc227913241"/>
+      <w:bookmarkStart w:id="4" w:name="_Toc227916380"/>
       <w:r>
         <w:t>Project Structure Design</w:t>
       </w:r>
@@ -3896,7 +3814,7 @@
           <w:numId w:val="15"/>
         </w:numPr>
       </w:pPr>
-      <w:bookmarkStart w:id="5" w:name="_Toc227913242"/>
+      <w:bookmarkStart w:id="5" w:name="_Toc227916381"/>
       <w:r>
         <w:t>Data Pipeline Design</w:t>
       </w:r>
@@ -3978,7 +3896,7 @@
       <w:pPr>
         <w:pStyle w:val="Heading3"/>
       </w:pPr>
-      <w:bookmarkStart w:id="6" w:name="_Toc227913243"/>
+      <w:bookmarkStart w:id="6" w:name="_Toc227916382"/>
       <w:r>
         <w:lastRenderedPageBreak/>
         <w:t xml:space="preserve">2.1.1 </w:t>
@@ -5240,11 +5158,11 @@
         <w:jc w:val="both"/>
       </w:pPr>
       <w:r>
-        <w:t>The s</w:t>
+        <w:t xml:space="preserve">The </w:t>
       </w:r>
       <w:proofErr w:type="spellStart"/>
       <w:r>
-        <w:t>alted_aggregation</w:t>
+        <w:t>salted_aggregation</w:t>
       </w:r>
       <w:proofErr w:type="spellEnd"/>
       <w:r>
@@ -5497,23 +5415,7 @@
                 <w:sz w:val="20"/>
                 <w:szCs w:val="20"/>
               </w:rPr>
-              <w:t xml:space="preserve">(0, </w:t>
-            </w:r>
-            <w:proofErr w:type="spellStart"/>
-            <w:r>
-              <w:rPr>
-                <w:sz w:val="20"/>
-                <w:szCs w:val="20"/>
-              </w:rPr>
-              <w:t>num_salts</w:t>
-            </w:r>
-            <w:proofErr w:type="spellEnd"/>
-            <w:r>
-              <w:rPr>
-                <w:sz w:val="20"/>
-                <w:szCs w:val="20"/>
-              </w:rPr>
-              <w:t xml:space="preserve"> - 1),</w:t>
+              <w:t>(0, num_salts - 1),</w:t>
             </w:r>
           </w:p>
           <w:p>
@@ -6108,13 +6010,7 @@
         </w:numPr>
       </w:pPr>
       <w:r>
-        <w:t xml:space="preserve">Operator(add) in phase 1 adds up the count locally on each partition, </w:t>
-      </w:r>
-      <w:r>
-        <w:t>thus reduce network I/O</w:t>
-      </w:r>
-      <w:r>
-        <w:t xml:space="preserve"> before shuffling. The number of rows send are distinct keys * </w:t>
+        <w:t xml:space="preserve">Operator(add) in phase 1 adds up the count locally on each partition, thus reduce network I/O before shuffling. The number of rows send are distinct keys * </w:t>
       </w:r>
       <w:proofErr w:type="spellStart"/>
       <w:r>
@@ -7558,7 +7454,7 @@
           <w:numId w:val="15"/>
         </w:numPr>
       </w:pPr>
-      <w:bookmarkStart w:id="7" w:name="_Toc227913244"/>
+      <w:bookmarkStart w:id="7" w:name="_Toc227916383"/>
       <w:r>
         <w:lastRenderedPageBreak/>
         <w:t xml:space="preserve">Usage of </w:t>
@@ -7572,7 +7468,7 @@
       <w:pPr>
         <w:pStyle w:val="Heading3"/>
       </w:pPr>
-      <w:bookmarkStart w:id="8" w:name="_Toc227913245"/>
+      <w:bookmarkStart w:id="8" w:name="_Toc227916384"/>
       <w:r>
         <w:t xml:space="preserve">2.3.1 </w:t>
       </w:r>
@@ -7677,55 +7573,7 @@
                                 <w:szCs w:val="16"/>
                                 <w14:ligatures w14:val="none"/>
                               </w:rPr>
-                              <w:t xml:space="preserve"># </w:t>
-                            </w:r>
-                            <w:proofErr w:type="gramStart"/>
-                            <w:r>
-                              <w:rPr>
-                                <w:rFonts w:ascii="Consolas" w:eastAsia="Times New Roman" w:hAnsi="Consolas" w:cs="Times New Roman"/>
-                                <w:color w:val="E6EDF3"/>
-                                <w:kern w:val="0"/>
-                                <w:sz w:val="16"/>
-                                <w:szCs w:val="16"/>
-                                <w14:ligatures w14:val="none"/>
-                              </w:rPr>
-                              <w:t>read</w:t>
-                            </w:r>
-                            <w:proofErr w:type="gramEnd"/>
-                            <w:r>
-                              <w:rPr>
-                                <w:rFonts w:ascii="Consolas" w:eastAsia="Times New Roman" w:hAnsi="Consolas" w:cs="Times New Roman"/>
-                                <w:color w:val="E6EDF3"/>
-                                <w:kern w:val="0"/>
-                                <w:sz w:val="16"/>
-                                <w:szCs w:val="16"/>
-                                <w14:ligatures w14:val="none"/>
-                              </w:rPr>
-                              <w:t xml:space="preserve"> the parquet file using </w:t>
-                            </w:r>
-                            <w:proofErr w:type="spellStart"/>
-                            <w:r>
-                              <w:rPr>
-                                <w:rFonts w:ascii="Consolas" w:eastAsia="Times New Roman" w:hAnsi="Consolas" w:cs="Times New Roman"/>
-                                <w:color w:val="E6EDF3"/>
-                                <w:kern w:val="0"/>
-                                <w:sz w:val="16"/>
-                                <w:szCs w:val="16"/>
-                                <w14:ligatures w14:val="none"/>
-                              </w:rPr>
-                              <w:t>rdd</w:t>
-                            </w:r>
-                            <w:proofErr w:type="spellEnd"/>
-                            <w:r>
-                              <w:rPr>
-                                <w:rFonts w:ascii="Consolas" w:eastAsia="Times New Roman" w:hAnsi="Consolas" w:cs="Times New Roman"/>
-                                <w:color w:val="E6EDF3"/>
-                                <w:kern w:val="0"/>
-                                <w:sz w:val="16"/>
-                                <w:szCs w:val="16"/>
-                                <w14:ligatures w14:val="none"/>
-                              </w:rPr>
-                              <w:t xml:space="preserve"> factory     </w:t>
+                              <w:t xml:space="preserve"># read the parquet file using rdd factory     </w:t>
                             </w:r>
                           </w:p>
                           <w:p>
@@ -7741,7 +7589,6 @@
                                 <w14:ligatures w14:val="none"/>
                               </w:rPr>
                             </w:pPr>
-                            <w:proofErr w:type="spellStart"/>
                             <w:r>
                               <w:rPr>
                                 <w:rFonts w:ascii="Consolas" w:eastAsia="Times New Roman" w:hAnsi="Consolas" w:cs="Times New Roman"/>
@@ -7751,19 +7598,7 @@
                                 <w:szCs w:val="16"/>
                                 <w14:ligatures w14:val="none"/>
                               </w:rPr>
-                              <w:t>dataset_a_rdd</w:t>
-                            </w:r>
-                            <w:proofErr w:type="spellEnd"/>
-                            <w:r>
-                              <w:rPr>
-                                <w:rFonts w:ascii="Consolas" w:eastAsia="Times New Roman" w:hAnsi="Consolas" w:cs="Times New Roman"/>
-                                <w:color w:val="E6EDF3"/>
-                                <w:kern w:val="0"/>
-                                <w:sz w:val="16"/>
-                                <w:szCs w:val="16"/>
-                                <w14:ligatures w14:val="none"/>
-                              </w:rPr>
-                              <w:t xml:space="preserve"> </w:t>
+                              <w:t xml:space="preserve">dataset_a_rdd </w:t>
                             </w:r>
                             <w:r>
                               <w:rPr>
@@ -7787,7 +7622,6 @@
                               </w:rPr>
                               <w:t xml:space="preserve"> </w:t>
                             </w:r>
-                            <w:proofErr w:type="spellStart"/>
                             <w:r>
                               <w:rPr>
                                 <w:rFonts w:ascii="Consolas" w:eastAsia="Times New Roman" w:hAnsi="Consolas" w:cs="Times New Roman"/>
@@ -7819,21 +7653,8 @@
                                 <w:szCs w:val="16"/>
                                 <w14:ligatures w14:val="none"/>
                               </w:rPr>
-                              <w:t>read_</w:t>
+                              <w:t>read_rdd</w:t>
                             </w:r>
-                            <w:proofErr w:type="gramStart"/>
-                            <w:r>
-                              <w:rPr>
-                                <w:rFonts w:ascii="Consolas" w:eastAsia="Times New Roman" w:hAnsi="Consolas" w:cs="Times New Roman"/>
-                                <w:color w:val="D2A8FF"/>
-                                <w:kern w:val="0"/>
-                                <w:sz w:val="16"/>
-                                <w:szCs w:val="16"/>
-                                <w14:ligatures w14:val="none"/>
-                              </w:rPr>
-                              <w:t>rdd</w:t>
-                            </w:r>
-                            <w:proofErr w:type="spellEnd"/>
                             <w:r>
                               <w:rPr>
                                 <w:rFonts w:ascii="Consolas" w:eastAsia="Times New Roman" w:hAnsi="Consolas" w:cs="Times New Roman"/>
@@ -7845,7 +7666,6 @@
                               </w:rPr>
                               <w:t>(</w:t>
                             </w:r>
-                            <w:proofErr w:type="gramEnd"/>
                           </w:p>
                           <w:p>
                             <w:pPr>
@@ -7915,8 +7735,6 @@
                               </w:rPr>
                               <w:t xml:space="preserve">, </w:t>
                             </w:r>
-                            <w:proofErr w:type="spellStart"/>
-                            <w:proofErr w:type="gramStart"/>
                             <w:r>
                               <w:rPr>
                                 <w:rFonts w:ascii="Consolas" w:eastAsia="Times New Roman" w:hAnsi="Consolas" w:cs="Times New Roman"/>
@@ -7937,31 +7755,7 @@
                                 <w:szCs w:val="16"/>
                                 <w14:ligatures w14:val="none"/>
                               </w:rPr>
-                              <w:t>.dataset</w:t>
-                            </w:r>
-                            <w:proofErr w:type="gramEnd"/>
-                            <w:r>
-                              <w:rPr>
-                                <w:rFonts w:ascii="Consolas" w:eastAsia="Times New Roman" w:hAnsi="Consolas" w:cs="Times New Roman"/>
-                                <w:color w:val="E6EDF3"/>
-                                <w:kern w:val="0"/>
-                                <w:sz w:val="16"/>
-                                <w:szCs w:val="16"/>
-                                <w14:ligatures w14:val="none"/>
-                              </w:rPr>
-                              <w:t>_a_path</w:t>
-                            </w:r>
-                            <w:proofErr w:type="spellEnd"/>
-                            <w:r>
-                              <w:rPr>
-                                <w:rFonts w:ascii="Consolas" w:eastAsia="Times New Roman" w:hAnsi="Consolas" w:cs="Times New Roman"/>
-                                <w:color w:val="E6EDF3"/>
-                                <w:kern w:val="0"/>
-                                <w:sz w:val="16"/>
-                                <w:szCs w:val="16"/>
-                                <w14:ligatures w14:val="none"/>
-                              </w:rPr>
-                              <w:t>)</w:t>
+                              <w:t>.dataset_a_path)</w:t>
                             </w:r>
                           </w:p>
                           <w:p>
@@ -7991,7 +7785,6 @@
                                 <w14:ligatures w14:val="none"/>
                               </w:rPr>
                             </w:pPr>
-                            <w:proofErr w:type="spellStart"/>
                             <w:r>
                               <w:rPr>
                                 <w:rFonts w:ascii="Consolas" w:eastAsia="Times New Roman" w:hAnsi="Consolas" w:cs="Times New Roman"/>
@@ -8001,33 +7794,8 @@
                                 <w:szCs w:val="16"/>
                                 <w14:ligatures w14:val="none"/>
                               </w:rPr>
-                              <w:t>RDDIOFactory.write_</w:t>
+                              <w:t>RDDIOFactory.write_rdd(</w:t>
                             </w:r>
-                            <w:proofErr w:type="gramStart"/>
-                            <w:r>
-                              <w:rPr>
-                                <w:rFonts w:ascii="Consolas" w:eastAsia="Times New Roman" w:hAnsi="Consolas" w:cs="Times New Roman"/>
-                                <w:color w:val="E6EDF3"/>
-                                <w:kern w:val="0"/>
-                                <w:sz w:val="16"/>
-                                <w:szCs w:val="16"/>
-                                <w14:ligatures w14:val="none"/>
-                              </w:rPr>
-                              <w:t>rdd</w:t>
-                            </w:r>
-                            <w:proofErr w:type="spellEnd"/>
-                            <w:r>
-                              <w:rPr>
-                                <w:rFonts w:ascii="Consolas" w:eastAsia="Times New Roman" w:hAnsi="Consolas" w:cs="Times New Roman"/>
-                                <w:color w:val="E6EDF3"/>
-                                <w:kern w:val="0"/>
-                                <w:sz w:val="16"/>
-                                <w:szCs w:val="16"/>
-                                <w14:ligatures w14:val="none"/>
-                              </w:rPr>
-                              <w:t>(</w:t>
-                            </w:r>
-                            <w:proofErr w:type="gramEnd"/>
                           </w:p>
                           <w:p>
                             <w:pPr>
@@ -8076,31 +7844,7 @@
                                 <w:szCs w:val="16"/>
                                 <w14:ligatures w14:val="none"/>
                               </w:rPr>
-                              <w:t xml:space="preserve">        </w:t>
-                            </w:r>
-                            <w:proofErr w:type="spellStart"/>
-                            <w:r>
-                              <w:rPr>
-                                <w:rFonts w:ascii="Consolas" w:eastAsia="Times New Roman" w:hAnsi="Consolas" w:cs="Times New Roman"/>
-                                <w:color w:val="E6EDF3"/>
-                                <w:kern w:val="0"/>
-                                <w:sz w:val="16"/>
-                                <w:szCs w:val="16"/>
-                                <w14:ligatures w14:val="none"/>
-                              </w:rPr>
-                              <w:t>result_rdd</w:t>
-                            </w:r>
-                            <w:proofErr w:type="spellEnd"/>
-                            <w:r>
-                              <w:rPr>
-                                <w:rFonts w:ascii="Consolas" w:eastAsia="Times New Roman" w:hAnsi="Consolas" w:cs="Times New Roman"/>
-                                <w:color w:val="E6EDF3"/>
-                                <w:kern w:val="0"/>
-                                <w:sz w:val="16"/>
-                                <w:szCs w:val="16"/>
-                                <w14:ligatures w14:val="none"/>
-                              </w:rPr>
-                              <w:t>,</w:t>
+                              <w:t>        result_rdd,</w:t>
                             </w:r>
                           </w:p>
                           <w:p>
@@ -8150,44 +7894,7 @@
                                 <w:szCs w:val="16"/>
                                 <w14:ligatures w14:val="none"/>
                               </w:rPr>
-                              <w:t xml:space="preserve">        </w:t>
-                            </w:r>
-                            <w:proofErr w:type="spellStart"/>
-                            <w:proofErr w:type="gramStart"/>
-                            <w:r>
-                              <w:rPr>
-                                <w:rFonts w:ascii="Consolas" w:eastAsia="Times New Roman" w:hAnsi="Consolas" w:cs="Times New Roman"/>
-                                <w:color w:val="E6EDF3"/>
-                                <w:kern w:val="0"/>
-                                <w:sz w:val="16"/>
-                                <w:szCs w:val="16"/>
-                                <w14:ligatures w14:val="none"/>
-                              </w:rPr>
-                              <w:t>config.output</w:t>
-                            </w:r>
-                            <w:proofErr w:type="gramEnd"/>
-                            <w:r>
-                              <w:rPr>
-                                <w:rFonts w:ascii="Consolas" w:eastAsia="Times New Roman" w:hAnsi="Consolas" w:cs="Times New Roman"/>
-                                <w:color w:val="E6EDF3"/>
-                                <w:kern w:val="0"/>
-                                <w:sz w:val="16"/>
-                                <w:szCs w:val="16"/>
-                                <w14:ligatures w14:val="none"/>
-                              </w:rPr>
-                              <w:t>_path</w:t>
-                            </w:r>
-                            <w:proofErr w:type="spellEnd"/>
-                            <w:r>
-                              <w:rPr>
-                                <w:rFonts w:ascii="Consolas" w:eastAsia="Times New Roman" w:hAnsi="Consolas" w:cs="Times New Roman"/>
-                                <w:color w:val="E6EDF3"/>
-                                <w:kern w:val="0"/>
-                                <w:sz w:val="16"/>
-                                <w:szCs w:val="16"/>
-                                <w14:ligatures w14:val="none"/>
-                              </w:rPr>
-                              <w:t>,</w:t>
+                              <w:t>        config.output_path,</w:t>
                             </w:r>
                           </w:p>
                           <w:p>
@@ -9068,7 +8775,7 @@
       <w:pPr>
         <w:pStyle w:val="Heading3"/>
       </w:pPr>
-      <w:bookmarkStart w:id="9" w:name="_Toc227913246"/>
+      <w:bookmarkStart w:id="9" w:name="_Toc227916385"/>
       <w:r>
         <w:t xml:space="preserve">2.3.2 </w:t>
       </w:r>
@@ -10719,7 +10426,7 @@
       <w:pPr>
         <w:pStyle w:val="Heading3"/>
       </w:pPr>
-      <w:bookmarkStart w:id="10" w:name="_Toc227913247"/>
+      <w:bookmarkStart w:id="10" w:name="_Toc227916386"/>
       <w:r>
         <w:t xml:space="preserve">2.3.3 </w:t>
       </w:r>
@@ -12868,7 +12575,7 @@
       <w:pPr>
         <w:pStyle w:val="Heading3"/>
       </w:pPr>
-      <w:bookmarkStart w:id="11" w:name="_Toc227913248"/>
+      <w:bookmarkStart w:id="11" w:name="_Toc227916387"/>
       <w:r>
         <w:t xml:space="preserve">2.3.4 </w:t>
       </w:r>
@@ -13978,7 +13685,7 @@
           <w:numId w:val="15"/>
         </w:numPr>
       </w:pPr>
-      <w:bookmarkStart w:id="12" w:name="_Toc227913249"/>
+      <w:bookmarkStart w:id="12" w:name="_Toc227916388"/>
       <w:r>
         <w:t>Other Design Considerations</w:t>
       </w:r>
@@ -14144,7 +13851,7 @@
           <w:numId w:val="23"/>
         </w:numPr>
       </w:pPr>
-      <w:bookmarkStart w:id="13" w:name="_Toc227913250"/>
+      <w:bookmarkStart w:id="13" w:name="_Toc227916389"/>
       <w:r>
         <w:t xml:space="preserve">PROPOSED </w:t>
       </w:r>
@@ -14160,7 +13867,7 @@
       <w:r>
         <w:t xml:space="preserve"> </w:t>
       </w:r>
-      <w:bookmarkStart w:id="14" w:name="_Toc227913251"/>
+      <w:bookmarkStart w:id="14" w:name="_Toc227916390"/>
       <w:r>
         <w:t xml:space="preserve">3.1 Local </w:t>
       </w:r>
@@ -14794,7 +14501,7 @@
       <w:pPr>
         <w:pStyle w:val="Heading2"/>
       </w:pPr>
-      <w:bookmarkStart w:id="15" w:name="_Toc227913252"/>
+      <w:bookmarkStart w:id="15" w:name="_Toc227916391"/>
       <w:r>
         <w:t xml:space="preserve">3.2 </w:t>
       </w:r>
@@ -15939,7 +15646,7 @@
           <w:numId w:val="23"/>
         </w:numPr>
       </w:pPr>
-      <w:bookmarkStart w:id="16" w:name="_Toc227913253"/>
+      <w:bookmarkStart w:id="16" w:name="_Toc227916392"/>
       <w:r>
         <w:t>Production Cluster (Yarn/Kubernetes, larger dataset)</w:t>
       </w:r>
@@ -17435,147 +17142,6 @@
       </w:tr>
     </w:tbl>
     <w:p/>
-    <w:p>
-      <w:pPr>
-        <w:pStyle w:val="Heading2"/>
-        <w:numPr>
-          <w:ilvl w:val="1"/>
-          <w:numId w:val="23"/>
-        </w:numPr>
-      </w:pPr>
-      <w:bookmarkStart w:id="17" w:name="_Toc227913254"/>
-      <w:r>
-        <w:lastRenderedPageBreak/>
-        <w:t>Configuration Tuning</w:t>
-      </w:r>
-      <w:bookmarkEnd w:id="17"/>
-    </w:p>
-    <w:p>
-      <w:pPr>
-        <w:pStyle w:val="ListParagraph"/>
-        <w:numPr>
-          <w:ilvl w:val="0"/>
-          <w:numId w:val="25"/>
-        </w:numPr>
-        <w:rPr>
-          <w:rFonts w:ascii="Times New Roman" w:hAnsi="Times New Roman" w:cs="Times New Roman"/>
-        </w:rPr>
-      </w:pPr>
-      <w:r>
-        <w:rPr>
-          <w:rFonts w:ascii="Times New Roman" w:hAnsi="Times New Roman" w:cs="Times New Roman"/>
-        </w:rPr>
-        <w:t xml:space="preserve">If many tasks complete instantly, </w:t>
-      </w:r>
-      <w:r>
-        <w:rPr>
-          <w:rFonts w:ascii="Times New Roman" w:hAnsi="Times New Roman" w:cs="Times New Roman"/>
-        </w:rPr>
-        <w:t>reduce shuffle partitions.</w:t>
-      </w:r>
-    </w:p>
-    <w:p>
-      <w:pPr>
-        <w:pStyle w:val="ListParagraph"/>
-        <w:numPr>
-          <w:ilvl w:val="0"/>
-          <w:numId w:val="25"/>
-        </w:numPr>
-        <w:rPr>
-          <w:rFonts w:ascii="Times New Roman" w:hAnsi="Times New Roman" w:cs="Times New Roman"/>
-        </w:rPr>
-      </w:pPr>
-      <w:r>
-        <w:rPr>
-          <w:rFonts w:ascii="Times New Roman" w:hAnsi="Times New Roman" w:cs="Times New Roman"/>
-        </w:rPr>
-        <w:t>If certain stages or task takes longer time than average or other tasks, inspect the key skew</w:t>
-      </w:r>
-      <w:r>
-        <w:rPr>
-          <w:rFonts w:ascii="Times New Roman" w:hAnsi="Times New Roman" w:cs="Times New Roman"/>
-        </w:rPr>
-        <w:t xml:space="preserve"> by </w:t>
-      </w:r>
-      <w:proofErr w:type="spellStart"/>
-      <w:r>
-        <w:rPr>
-          <w:rFonts w:ascii="Times New Roman" w:hAnsi="Times New Roman" w:cs="Times New Roman"/>
-        </w:rPr>
-        <w:t>geo_oid</w:t>
-      </w:r>
-      <w:proofErr w:type="spellEnd"/>
-      <w:r>
-        <w:rPr>
-          <w:rFonts w:ascii="Times New Roman" w:hAnsi="Times New Roman" w:cs="Times New Roman"/>
-        </w:rPr>
-        <w:t xml:space="preserve"> or </w:t>
-      </w:r>
-      <w:proofErr w:type="spellStart"/>
-      <w:r>
-        <w:rPr>
-          <w:rFonts w:ascii="Times New Roman" w:hAnsi="Times New Roman" w:cs="Times New Roman"/>
-        </w:rPr>
-        <w:t>item_name</w:t>
-      </w:r>
-      <w:proofErr w:type="spellEnd"/>
-      <w:r>
-        <w:rPr>
-          <w:rFonts w:ascii="Times New Roman" w:hAnsi="Times New Roman" w:cs="Times New Roman"/>
-        </w:rPr>
-        <w:t xml:space="preserve">. Consider to use salting to spread the load. </w:t>
-      </w:r>
-    </w:p>
-    <w:p>
-      <w:pPr>
-        <w:pStyle w:val="ListParagraph"/>
-        <w:numPr>
-          <w:ilvl w:val="0"/>
-          <w:numId w:val="25"/>
-        </w:numPr>
-        <w:rPr>
-          <w:rFonts w:ascii="Times New Roman" w:hAnsi="Times New Roman" w:cs="Times New Roman"/>
-        </w:rPr>
-      </w:pPr>
-      <w:r>
-        <w:rPr>
-          <w:rFonts w:ascii="Times New Roman" w:hAnsi="Times New Roman" w:cs="Times New Roman"/>
-        </w:rPr>
-        <w:t xml:space="preserve">If executors encountered Out-of-Memory error at ranking stage, consider increase executor memory or repartition before </w:t>
-      </w:r>
-      <w:proofErr w:type="spellStart"/>
-      <w:r>
-        <w:rPr>
-          <w:rFonts w:ascii="Times New Roman" w:hAnsi="Times New Roman" w:cs="Times New Roman"/>
-        </w:rPr>
-        <w:t>groupByKey</w:t>
-      </w:r>
-      <w:proofErr w:type="spellEnd"/>
-      <w:r>
-        <w:rPr>
-          <w:rFonts w:ascii="Times New Roman" w:hAnsi="Times New Roman" w:cs="Times New Roman"/>
-        </w:rPr>
-        <w:t>.</w:t>
-      </w:r>
-    </w:p>
-    <w:p>
-      <w:pPr>
-        <w:pStyle w:val="ListParagraph"/>
-        <w:numPr>
-          <w:ilvl w:val="0"/>
-          <w:numId w:val="25"/>
-        </w:numPr>
-        <w:rPr>
-          <w:rFonts w:ascii="Times New Roman" w:hAnsi="Times New Roman" w:cs="Times New Roman"/>
-        </w:rPr>
-      </w:pPr>
-      <w:r>
-        <w:rPr>
-          <w:rFonts w:ascii="Times New Roman" w:hAnsi="Times New Roman" w:cs="Times New Roman"/>
-        </w:rPr>
-        <w:t>If broadcast join is becoming slow, check on Dataset B whether is larger than expected. Consider to use standard shuffle join.</w:t>
-      </w:r>
-    </w:p>
     <w:p/>
     <w:p/>
     <w:sectPr>
@@ -21199,6 +20765,7 @@
   <w:style w:type="character" w:default="1" w:styleId="DefaultParagraphFont">
     <w:name w:val="Default Paragraph Font"/>
     <w:uiPriority w:val="1"/>
+    <w:semiHidden/>
     <w:unhideWhenUsed/>
   </w:style>
   <w:style w:type="table" w:default="1" w:styleId="TableNormal">

</xml_diff>